<commit_message>
feat(sds): Zero-Hardcodes audit and universal pipeline sanitization (ADR-076)
</commit_message>
<xml_diff>
--- a/docs/SDS/Karta_Charakterystyki_8034055535448_SDS_ORCHIDEA_E_VANIGLIA (12).docx
+++ b/docs/SDS/Karta_Charakterystyki_8034055535448_SDS_ORCHIDEA_E_VANIGLIA (12).docx
@@ -987,7 +987,7 @@
           <w:sz w:val="20"/>
           <w:szCs w:val="20"/>
         </w:rPr>
-        <w:t xml:space="preserve">Informacje uzupełniające:</w:t>
+        <w:t xml:space="preserve">Informacje uzupełniające o zagrożeniach:</w:t>
       </w:r>
     </w:p>
     <w:p>
@@ -5272,20 +5272,20 @@
           <w:sz w:val="20"/>
           <w:szCs w:val="20"/>
         </w:rPr>
-        <w:t xml:space="preserve">Wobec braku danych doświadczalnych dla samego produktu, zagrożenia dla zdrowia oceniono na podstawie właściwości substancji w nim zawartych, zgodnie z kryteriami określonymi w odpowiednich przepisach dotyczących klasyfikacji.</w:t>
-      </w:r>
-    </w:p>
-    <w:p>
-      <w:pPr>
-        <w:spacing w:after="80"/>
-      </w:pPr>
-      <w:r>
-        <w:rPr>
-          <w:rFonts w:ascii="Arial" w:cs="Arial" w:eastAsia="Arial" w:hAnsi="Arial"/>
-          <w:sz w:val="20"/>
-          <w:szCs w:val="20"/>
-        </w:rPr>
-        <w:t xml:space="preserve">Należy zatem wziąć pod uwagę stężenie poszczególnych niebezpiecznych substancji wskazanych w sekcji 3, aby ocenić skutki toksykologiczne narażenia na produkt.</w:t>
+        <w:t xml:space="preserve">Wobec braku danych doświadczalnych dla samego produktu, zagrożenia dla zdrowia oceniono zgodnie z właściwościami zawartych w nim substancji, przy użyciu kryteriów określonych w odpowiednich przepisach dotyczących klasyfikacji.</w:t>
+      </w:r>
+    </w:p>
+    <w:p>
+      <w:pPr>
+        <w:spacing w:after="80"/>
+      </w:pPr>
+      <w:r>
+        <w:rPr>
+          <w:rFonts w:ascii="Arial" w:cs="Arial" w:eastAsia="Arial" w:hAnsi="Arial"/>
+          <w:sz w:val="20"/>
+          <w:szCs w:val="20"/>
+        </w:rPr>
+        <w:t xml:space="preserve">W związku z tym w celu oceny skutków toksykologicznych narażenia na produkt należy wziąć pod uwagę stężenia poszczególnych substancji niebezpiecznych wskazanych w sekcji 3.</w:t>
       </w:r>
     </w:p>
     <w:p>
@@ -5326,7 +5326,7 @@
           <w:sz w:val="20"/>
           <w:szCs w:val="20"/>
         </w:rPr>
-        <w:t xml:space="preserve">Brak dostępnych informacji.</w:t>
+        <w:t xml:space="preserve">Brak dostępnych danych.</w:t>
       </w:r>
     </w:p>
     <w:p>
@@ -5365,33 +5365,33 @@
           <w:sz w:val="20"/>
           <w:szCs w:val="20"/>
         </w:rPr>
-        <w:t xml:space="preserve">PRACOWNICY: przez drogi oddechowe (inhalacyjnie); kontakt ze skórą.</w:t>
-      </w:r>
-    </w:p>
-    <w:p>
-      <w:pPr>
-        <w:spacing w:after="80"/>
-      </w:pPr>
-      <w:r>
-        <w:rPr>
-          <w:rFonts w:ascii="Arial" w:cs="Arial" w:eastAsia="Arial" w:hAnsi="Arial"/>
-          <w:sz w:val="20"/>
-          <w:szCs w:val="20"/>
-        </w:rPr>
-        <w:t xml:space="preserve">LUDNOŚĆ: spożycie skażonej żywności lub wody; wdychanie powietrza z otoczenia; kontakt ze skórą z produktami zawierającymi substancję.</w:t>
-      </w:r>
-    </w:p>
-    <w:p>
-      <w:pPr>
-        <w:spacing w:after="80"/>
-      </w:pPr>
-      <w:r>
-        <w:rPr>
-          <w:rFonts w:ascii="Arial" w:cs="Arial" w:eastAsia="Arial" w:hAnsi="Arial"/>
-          <w:sz w:val="20"/>
-          <w:szCs w:val="20"/>
-        </w:rPr>
-        <w:t xml:space="preserve">Skutki opóźnione i bezpośrednie oraz skutki przewlekłe spowodowane krótko- i długotrwałym narażeniem:</w:t>
+        <w:t xml:space="preserve">Pracownicy: inhalacyjnie (drogi oddechowe); kontakt ze skórą.</w:t>
+      </w:r>
+    </w:p>
+    <w:p>
+      <w:pPr>
+        <w:spacing w:after="80"/>
+      </w:pPr>
+      <w:r>
+        <w:rPr>
+          <w:rFonts w:ascii="Arial" w:cs="Arial" w:eastAsia="Arial" w:hAnsi="Arial"/>
+          <w:sz w:val="20"/>
+          <w:szCs w:val="20"/>
+        </w:rPr>
+        <w:t xml:space="preserve">Konsumenci/populacja ogólna: spożycie skażonej żywności lub wody; inhalacyjnie (drogi oddechowe) z otaczającego powietrza; kontakt ze skórą poprzez produkty zawierające substancję.</w:t>
+      </w:r>
+    </w:p>
+    <w:p>
+      <w:pPr>
+        <w:spacing w:after="80"/>
+      </w:pPr>
+      <w:r>
+        <w:rPr>
+          <w:rFonts w:ascii="Arial" w:cs="Arial" w:eastAsia="Arial" w:hAnsi="Arial"/>
+          <w:sz w:val="20"/>
+          <w:szCs w:val="20"/>
+        </w:rPr>
+        <w:t xml:space="preserve">Opóźnione, bezpośrednie oraz przewlekłe skutki krótko- i długotrwałego narażenia:</w:t>
       </w:r>
     </w:p>
     <w:p>
@@ -5417,7 +5417,7 @@
           <w:sz w:val="20"/>
           <w:szCs w:val="20"/>
         </w:rPr>
-        <w:t xml:space="preserve">Działanie toksyczne na ośrodkowy i obwodowy układ nerwowy z encefalopatią i zapaleniem wielonerwowym; działa drażniąco na skórę, spojówki, rogówkę i układ oddechowy.</w:t>
+        <w:t xml:space="preserve">Działanie toksyczne na ośrodkowy i obwodowy układ nerwowy z encefalopatią i polineuropatią; działa drażniąco na skórę, spojówki, rogówkę i drogi oddechowe.</w:t>
       </w:r>
     </w:p>
     <w:p>
@@ -5456,7 +5456,7 @@
           <w:sz w:val="20"/>
           <w:szCs w:val="20"/>
         </w:rPr>
-        <w:t xml:space="preserve">Niektóre leki i inne produkty przemysłowe mogą zakłócać metabolizm toluenu.</w:t>
+        <w:t xml:space="preserve">Niektóre leki i inne chemikalia przemysłowe mogą wchodzić w interakcje z metabolizmem toluenu.</w:t>
       </w:r>
     </w:p>
     <w:p>
@@ -5482,267 +5482,410 @@
           <w:sz w:val="20"/>
           <w:szCs w:val="20"/>
         </w:rPr>
-        <w:t xml:space="preserve">ATE (przez drogi oddechowe (inhalacyjnie)) mieszaniny: Nie sklasyfikowano (brak istotnego składnika)</w:t>
-      </w:r>
-    </w:p>
-    <w:p>
-      <w:pPr>
-        <w:spacing w:after="80"/>
-      </w:pPr>
-      <w:r>
-        <w:rPr>
-          <w:rFonts w:ascii="Arial" w:cs="Arial" w:eastAsia="Arial" w:hAnsi="Arial"/>
-          <w:sz w:val="20"/>
-          <w:szCs w:val="20"/>
-        </w:rPr>
-        <w:t xml:space="preserve">ATE (droga pokarmowa (doustnie)) mieszaniny: Nie sklasyfikowano (brak istotnego składnika)</w:t>
-      </w:r>
-    </w:p>
-    <w:p>
-      <w:pPr>
-        <w:spacing w:after="80"/>
-      </w:pPr>
-      <w:r>
-        <w:rPr>
-          <w:rFonts w:ascii="Arial" w:cs="Arial" w:eastAsia="Arial" w:hAnsi="Arial"/>
-          <w:sz w:val="20"/>
-          <w:szCs w:val="20"/>
-        </w:rPr>
-        <w:t xml:space="preserve">ATE (na skórę) mieszaniny: Nie sklasyfikowano (brak istotnego składnika)</w:t>
-      </w:r>
-    </w:p>
-    <w:p>
-      <w:pPr>
-        <w:spacing w:after="80"/>
-      </w:pPr>
-      <w:r>
-        <w:rPr>
-          <w:rFonts w:ascii="Arial" w:cs="Arial" w:eastAsia="Arial" w:hAnsi="Arial"/>
-          <w:sz w:val="20"/>
-          <w:szCs w:val="20"/>
-        </w:rPr>
-        <w:t xml:space="preserve">Etanol:</w:t>
-      </w:r>
-    </w:p>
-    <w:p>
-      <w:pPr>
-        <w:spacing w:after="80"/>
-      </w:pPr>
-      <w:r>
-        <w:rPr>
-          <w:rFonts w:ascii="Arial" w:cs="Arial" w:eastAsia="Arial" w:hAnsi="Arial"/>
-          <w:sz w:val="20"/>
-          <w:szCs w:val="20"/>
-        </w:rPr>
-        <w:t xml:space="preserve">LD50 (droga pokarmowa (doustnie)): &gt; 5000 mg/kg (szczur)</w:t>
-      </w:r>
-    </w:p>
-    <w:p>
-      <w:pPr>
-        <w:spacing w:after="80"/>
-      </w:pPr>
-      <w:r>
-        <w:rPr>
-          <w:rFonts w:ascii="Arial" w:cs="Arial" w:eastAsia="Arial" w:hAnsi="Arial"/>
-          <w:sz w:val="20"/>
-          <w:szCs w:val="20"/>
-        </w:rPr>
-        <w:t xml:space="preserve">LC50 (drogi oddechowe, pary): &gt; 50 mg/l/4h (szczur)</w:t>
-      </w:r>
-    </w:p>
-    <w:p>
-      <w:pPr>
-        <w:spacing w:after="80"/>
-      </w:pPr>
-      <w:r>
-        <w:rPr>
-          <w:rFonts w:ascii="Arial" w:cs="Arial" w:eastAsia="Arial" w:hAnsi="Arial"/>
-          <w:sz w:val="20"/>
-          <w:szCs w:val="20"/>
-        </w:rPr>
-        <w:t xml:space="preserve">Aldehyd anyżowy:</w:t>
-      </w:r>
-    </w:p>
-    <w:p>
-      <w:pPr>
-        <w:spacing w:after="80"/>
-      </w:pPr>
-      <w:r>
-        <w:rPr>
-          <w:rFonts w:ascii="Arial" w:cs="Arial" w:eastAsia="Arial" w:hAnsi="Arial"/>
-          <w:sz w:val="20"/>
-          <w:szCs w:val="20"/>
-        </w:rPr>
-        <w:t xml:space="preserve">LD50 (na skórę): &gt; 5000 mg/kg (królik)</w:t>
-      </w:r>
-    </w:p>
-    <w:p>
-      <w:pPr>
-        <w:spacing w:after="80"/>
-      </w:pPr>
-      <w:r>
-        <w:rPr>
-          <w:rFonts w:ascii="Arial" w:cs="Arial" w:eastAsia="Arial" w:hAnsi="Arial"/>
-          <w:sz w:val="20"/>
-          <w:szCs w:val="20"/>
-        </w:rPr>
-        <w:t xml:space="preserve">LD50 (droga pokarmowa (doustnie)): 3210 mg/kg (szczur)</w:t>
-      </w:r>
-    </w:p>
-    <w:p>
-      <w:pPr>
-        <w:spacing w:after="80"/>
-      </w:pPr>
-      <w:r>
-        <w:rPr>
-          <w:rFonts w:ascii="Arial" w:cs="Arial" w:eastAsia="Arial" w:hAnsi="Arial"/>
-          <w:sz w:val="20"/>
-          <w:szCs w:val="20"/>
-        </w:rPr>
-        <w:t xml:space="preserve">LC50 (przez drogi oddechowe (inhalacyjnie), pary): 0,32 mg/l/7h (szczur)</w:t>
-      </w:r>
-    </w:p>
-    <w:p>
-      <w:pPr>
-        <w:spacing w:after="80"/>
-      </w:pPr>
-      <w:r>
-        <w:rPr>
-          <w:rFonts w:ascii="Arial" w:cs="Arial" w:eastAsia="Arial" w:hAnsi="Arial"/>
-          <w:sz w:val="20"/>
-          <w:szCs w:val="20"/>
-        </w:rPr>
-        <w:t xml:space="preserve">Kumaryna:</w:t>
-      </w:r>
-    </w:p>
-    <w:p>
-      <w:pPr>
-        <w:spacing w:after="80"/>
-      </w:pPr>
-      <w:r>
-        <w:rPr>
-          <w:rFonts w:ascii="Arial" w:cs="Arial" w:eastAsia="Arial" w:hAnsi="Arial"/>
-          <w:sz w:val="20"/>
-          <w:szCs w:val="20"/>
-        </w:rPr>
-        <w:t xml:space="preserve">LD50 (na skórę): 293 mg/kg mc. (szczur)</w:t>
-      </w:r>
-    </w:p>
-    <w:p>
-      <w:pPr>
-        <w:spacing w:after="80"/>
-      </w:pPr>
-      <w:r>
-        <w:rPr>
-          <w:rFonts w:ascii="Arial" w:cs="Arial" w:eastAsia="Arial" w:hAnsi="Arial"/>
-          <w:sz w:val="20"/>
-          <w:szCs w:val="20"/>
-        </w:rPr>
-        <w:t xml:space="preserve">LD50 (droga pokarmowa (doustnie)): 290 mg/kg mc. (szczur)</w:t>
-      </w:r>
-    </w:p>
-    <w:p>
-      <w:pPr>
-        <w:spacing w:after="80"/>
-      </w:pPr>
-      <w:r>
-        <w:rPr>
-          <w:rFonts w:ascii="Arial" w:cs="Arial" w:eastAsia="Arial" w:hAnsi="Arial"/>
-          <w:sz w:val="20"/>
-          <w:szCs w:val="20"/>
-        </w:rPr>
-        <w:t xml:space="preserve">LC50 (przez drogi oddechowe (inhalacyjnie), mgły/pyły): 293 mg/kg (szczur)</w:t>
-      </w:r>
-    </w:p>
-    <w:p>
-      <w:pPr>
-        <w:spacing w:after="80"/>
-      </w:pPr>
-      <w:r>
-        <w:rPr>
-          <w:rFonts w:ascii="Arial" w:cs="Arial" w:eastAsia="Arial" w:hAnsi="Arial"/>
-          <w:sz w:val="20"/>
-          <w:szCs w:val="20"/>
-        </w:rPr>
-        <w:t xml:space="preserve">2,6-di-tert-butylo-4-metylofenol (BHT):</w:t>
-      </w:r>
-    </w:p>
-    <w:p>
-      <w:pPr>
-        <w:spacing w:after="80"/>
-      </w:pPr>
-      <w:r>
-        <w:rPr>
-          <w:rFonts w:ascii="Arial" w:cs="Arial" w:eastAsia="Arial" w:hAnsi="Arial"/>
-          <w:sz w:val="20"/>
-          <w:szCs w:val="20"/>
-        </w:rPr>
-        <w:t xml:space="preserve">LD50 (na skórę): &gt; 2000 mg/kg (szczur)</w:t>
-      </w:r>
-    </w:p>
-    <w:p>
-      <w:pPr>
-        <w:spacing w:after="80"/>
-      </w:pPr>
-      <w:r>
-        <w:rPr>
-          <w:rFonts w:ascii="Arial" w:cs="Arial" w:eastAsia="Arial" w:hAnsi="Arial"/>
-          <w:sz w:val="20"/>
-          <w:szCs w:val="20"/>
-        </w:rPr>
-        <w:t xml:space="preserve">LD50 (droga pokarmowa (doustnie)): 2930 mg/kg (szczur)</w:t>
-      </w:r>
-    </w:p>
-    <w:p>
-      <w:pPr>
-        <w:spacing w:after="80"/>
-      </w:pPr>
-      <w:r>
-        <w:rPr>
-          <w:rFonts w:ascii="Arial" w:cs="Arial" w:eastAsia="Arial" w:hAnsi="Arial"/>
-          <w:sz w:val="20"/>
-          <w:szCs w:val="20"/>
-        </w:rPr>
-        <w:t xml:space="preserve">Toluen:</w:t>
-      </w:r>
-    </w:p>
-    <w:p>
-      <w:pPr>
-        <w:spacing w:after="80"/>
-      </w:pPr>
-      <w:r>
-        <w:rPr>
-          <w:rFonts w:ascii="Arial" w:cs="Arial" w:eastAsia="Arial" w:hAnsi="Arial"/>
-          <w:sz w:val="20"/>
-          <w:szCs w:val="20"/>
-        </w:rPr>
-        <w:t xml:space="preserve">LD50 (na skórę): &gt; 5000 mg/kg mc. (królik)</w:t>
-      </w:r>
-    </w:p>
-    <w:p>
-      <w:pPr>
-        <w:spacing w:after="80"/>
-      </w:pPr>
-      <w:r>
-        <w:rPr>
-          <w:rFonts w:ascii="Arial" w:cs="Arial" w:eastAsia="Arial" w:hAnsi="Arial"/>
-          <w:sz w:val="20"/>
-          <w:szCs w:val="20"/>
-        </w:rPr>
-        <w:t xml:space="preserve">LD50 (droga pokarmowa (doustnie)): &gt; 5000 mg/kg mc. (szczur)</w:t>
-      </w:r>
-    </w:p>
-    <w:p>
-      <w:pPr>
-        <w:spacing w:after="80"/>
-      </w:pPr>
-      <w:r>
-        <w:rPr>
-          <w:rFonts w:ascii="Arial" w:cs="Arial" w:eastAsia="Arial" w:hAnsi="Arial"/>
-          <w:sz w:val="20"/>
-          <w:szCs w:val="20"/>
-        </w:rPr>
-        <w:t xml:space="preserve">LC50 (przez drogi oddechowe (inhalacyjnie), pary): 100 ppm (człowiek)</w:t>
+        <w:t xml:space="preserve">ATE mieszaniny (przez drogi oddechowe / inhalacyjnie): Nie sklasyfikowano (brak istotnych składników toksycznych drogą oddechową).</w:t>
+      </w:r>
+    </w:p>
+    <w:p>
+      <w:pPr>
+        <w:spacing w:after="80"/>
+      </w:pPr>
+      <w:r>
+        <w:rPr>
+          <w:rFonts w:ascii="Arial" w:cs="Arial" w:eastAsia="Arial" w:hAnsi="Arial"/>
+          <w:sz w:val="20"/>
+          <w:szCs w:val="20"/>
+        </w:rPr>
+        <w:t xml:space="preserve">ATE mieszaniny (droga pokarmowa / doustnie): Nie sklasyfikowano (obliczona wartość ATE znacznie przekracza 2000 mg/kg mc.).</w:t>
+      </w:r>
+    </w:p>
+    <w:p>
+      <w:pPr>
+        <w:spacing w:after="80"/>
+      </w:pPr>
+      <w:r>
+        <w:rPr>
+          <w:rFonts w:ascii="Arial" w:cs="Arial" w:eastAsia="Arial" w:hAnsi="Arial"/>
+          <w:sz w:val="20"/>
+          <w:szCs w:val="20"/>
+        </w:rPr>
+        <w:t xml:space="preserve">ATE mieszaniny (na skórę / po naniesieniu na skórę): Nie sklasyfikowano (brak istotnych składników toksycznych przez skórę).</w:t>
+      </w:r>
+    </w:p>
+    <w:p>
+      <w:pPr>
+        <w:spacing w:after="80"/>
+      </w:pPr>
+      <w:r>
+        <w:rPr>
+          <w:rFonts w:ascii="Arial" w:cs="Arial" w:eastAsia="Arial" w:hAnsi="Arial"/>
+          <w:sz w:val="20"/>
+          <w:szCs w:val="20"/>
+        </w:rPr>
+        <w:t xml:space="preserve">Informacje toksykologiczne dotyczące składników:</w:t>
+      </w:r>
+    </w:p>
+    <w:p>
+      <w:pPr>
+        <w:spacing w:after="80"/>
+      </w:pPr>
+      <w:r>
+        <w:rPr>
+          <w:rFonts w:ascii="Arial" w:cs="Arial" w:eastAsia="Arial" w:hAnsi="Arial"/>
+          <w:sz w:val="20"/>
+          <w:szCs w:val="20"/>
+        </w:rPr>
+        <w:t xml:space="preserve">Etanol [CAS: 64-17-5]:</w:t>
+      </w:r>
+    </w:p>
+    <w:p>
+      <w:pPr>
+        <w:spacing w:after="60" w:before="60"/>
+      </w:pPr>
+      <w:r>
+        <w:rPr>
+          <w:rFonts w:ascii="Arial" w:cs="Arial" w:eastAsia="Arial" w:hAnsi="Arial"/>
+          <w:b/>
+          <w:bCs/>
+          <w:sz w:val="20"/>
+          <w:szCs w:val="20"/>
+        </w:rPr>
+        <w:t xml:space="preserve">- LD50 (droga pokarmowa, szczur):</w:t>
+      </w:r>
+      <w:r>
+        <w:rPr>
+          <w:rFonts w:ascii="Arial" w:cs="Arial" w:eastAsia="Arial" w:hAnsi="Arial"/>
+          <w:sz w:val="20"/>
+          <w:szCs w:val="20"/>
+        </w:rPr>
+        <w:t xml:space="preserve"> &gt; 5000 mg/kg mc.</w:t>
+      </w:r>
+    </w:p>
+    <w:p>
+      <w:pPr>
+        <w:spacing w:after="60" w:before="60"/>
+      </w:pPr>
+      <w:r>
+        <w:rPr>
+          <w:rFonts w:ascii="Arial" w:cs="Arial" w:eastAsia="Arial" w:hAnsi="Arial"/>
+          <w:b/>
+          <w:bCs/>
+          <w:sz w:val="20"/>
+          <w:szCs w:val="20"/>
+        </w:rPr>
+        <w:t xml:space="preserve">- LC50 (drogi oddechowe, pary, szczur):</w:t>
+      </w:r>
+      <w:r>
+        <w:rPr>
+          <w:rFonts w:ascii="Arial" w:cs="Arial" w:eastAsia="Arial" w:hAnsi="Arial"/>
+          <w:sz w:val="20"/>
+          <w:szCs w:val="20"/>
+        </w:rPr>
+        <w:t xml:space="preserve"> &gt; 50 mg/l/4h</w:t>
+      </w:r>
+    </w:p>
+    <w:p>
+      <w:pPr>
+        <w:spacing w:after="80"/>
+      </w:pPr>
+      <w:r>
+        <w:rPr>
+          <w:rFonts w:ascii="Arial" w:cs="Arial" w:eastAsia="Arial" w:hAnsi="Arial"/>
+          <w:sz w:val="20"/>
+          <w:szCs w:val="20"/>
+        </w:rPr>
+        <w:t xml:space="preserve">Aldehyd anyżowy [CAS: 123-11-5]:</w:t>
+      </w:r>
+    </w:p>
+    <w:p>
+      <w:pPr>
+        <w:spacing w:after="60" w:before="60"/>
+      </w:pPr>
+      <w:r>
+        <w:rPr>
+          <w:rFonts w:ascii="Arial" w:cs="Arial" w:eastAsia="Arial" w:hAnsi="Arial"/>
+          <w:b/>
+          <w:bCs/>
+          <w:sz w:val="20"/>
+          <w:szCs w:val="20"/>
+        </w:rPr>
+        <w:t xml:space="preserve">- LD50 (na skórę, królik):</w:t>
+      </w:r>
+      <w:r>
+        <w:rPr>
+          <w:rFonts w:ascii="Arial" w:cs="Arial" w:eastAsia="Arial" w:hAnsi="Arial"/>
+          <w:sz w:val="20"/>
+          <w:szCs w:val="20"/>
+        </w:rPr>
+        <w:t xml:space="preserve"> &gt; 5000 mg/kg mc.</w:t>
+      </w:r>
+    </w:p>
+    <w:p>
+      <w:pPr>
+        <w:spacing w:after="60" w:before="60"/>
+      </w:pPr>
+      <w:r>
+        <w:rPr>
+          <w:rFonts w:ascii="Arial" w:cs="Arial" w:eastAsia="Arial" w:hAnsi="Arial"/>
+          <w:b/>
+          <w:bCs/>
+          <w:sz w:val="20"/>
+          <w:szCs w:val="20"/>
+        </w:rPr>
+        <w:t xml:space="preserve">- LD50 (droga pokarmowa, szczur):</w:t>
+      </w:r>
+      <w:r>
+        <w:rPr>
+          <w:rFonts w:ascii="Arial" w:cs="Arial" w:eastAsia="Arial" w:hAnsi="Arial"/>
+          <w:sz w:val="20"/>
+          <w:szCs w:val="20"/>
+        </w:rPr>
+        <w:t xml:space="preserve"> 3210 mg/kg mc.</w:t>
+      </w:r>
+    </w:p>
+    <w:p>
+      <w:pPr>
+        <w:spacing w:after="60" w:before="60"/>
+      </w:pPr>
+      <w:r>
+        <w:rPr>
+          <w:rFonts w:ascii="Arial" w:cs="Arial" w:eastAsia="Arial" w:hAnsi="Arial"/>
+          <w:b/>
+          <w:bCs/>
+          <w:sz w:val="20"/>
+          <w:szCs w:val="20"/>
+        </w:rPr>
+        <w:t xml:space="preserve">- LC50 (drogi oddechowe, pary, szczur):</w:t>
+      </w:r>
+      <w:r>
+        <w:rPr>
+          <w:rFonts w:ascii="Arial" w:cs="Arial" w:eastAsia="Arial" w:hAnsi="Arial"/>
+          <w:sz w:val="20"/>
+          <w:szCs w:val="20"/>
+        </w:rPr>
+        <w:t xml:space="preserve"> 0,32 mg/l/7h</w:t>
+      </w:r>
+    </w:p>
+    <w:p>
+      <w:pPr>
+        <w:spacing w:after="80"/>
+      </w:pPr>
+      <w:r>
+        <w:rPr>
+          <w:rFonts w:ascii="Arial" w:cs="Arial" w:eastAsia="Arial" w:hAnsi="Arial"/>
+          <w:sz w:val="20"/>
+          <w:szCs w:val="20"/>
+        </w:rPr>
+        <w:t xml:space="preserve">Kumaryna [CAS: 91-64-5]:</w:t>
+      </w:r>
+    </w:p>
+    <w:p>
+      <w:pPr>
+        <w:spacing w:after="60" w:before="60"/>
+      </w:pPr>
+      <w:r>
+        <w:rPr>
+          <w:rFonts w:ascii="Arial" w:cs="Arial" w:eastAsia="Arial" w:hAnsi="Arial"/>
+          <w:b/>
+          <w:bCs/>
+          <w:sz w:val="20"/>
+          <w:szCs w:val="20"/>
+        </w:rPr>
+        <w:t xml:space="preserve">- LD50 (na skórę, szczur):</w:t>
+      </w:r>
+      <w:r>
+        <w:rPr>
+          <w:rFonts w:ascii="Arial" w:cs="Arial" w:eastAsia="Arial" w:hAnsi="Arial"/>
+          <w:sz w:val="20"/>
+          <w:szCs w:val="20"/>
+        </w:rPr>
+        <w:t xml:space="preserve"> 293 mg/kg mc.</w:t>
+      </w:r>
+    </w:p>
+    <w:p>
+      <w:pPr>
+        <w:spacing w:after="60" w:before="60"/>
+      </w:pPr>
+      <w:r>
+        <w:rPr>
+          <w:rFonts w:ascii="Arial" w:cs="Arial" w:eastAsia="Arial" w:hAnsi="Arial"/>
+          <w:b/>
+          <w:bCs/>
+          <w:sz w:val="20"/>
+          <w:szCs w:val="20"/>
+        </w:rPr>
+        <w:t xml:space="preserve">- LD50 (droga pokarmowa, szczur):</w:t>
+      </w:r>
+      <w:r>
+        <w:rPr>
+          <w:rFonts w:ascii="Arial" w:cs="Arial" w:eastAsia="Arial" w:hAnsi="Arial"/>
+          <w:sz w:val="20"/>
+          <w:szCs w:val="20"/>
+        </w:rPr>
+        <w:t xml:space="preserve"> 290 mg/kg mc. (ATE oszacowane: 500 mg/kg mc.)</w:t>
+      </w:r>
+    </w:p>
+    <w:p>
+      <w:pPr>
+        <w:spacing w:after="60" w:before="60"/>
+      </w:pPr>
+      <w:r>
+        <w:rPr>
+          <w:rFonts w:ascii="Arial" w:cs="Arial" w:eastAsia="Arial" w:hAnsi="Arial"/>
+          <w:b/>
+          <w:bCs/>
+          <w:sz w:val="20"/>
+          <w:szCs w:val="20"/>
+        </w:rPr>
+        <w:t xml:space="preserve">- LC50 (drogi oddechowe, pyły/mgły, szczur):</w:t>
+      </w:r>
+      <w:r>
+        <w:rPr>
+          <w:rFonts w:ascii="Arial" w:cs="Arial" w:eastAsia="Arial" w:hAnsi="Arial"/>
+          <w:sz w:val="20"/>
+          <w:szCs w:val="20"/>
+        </w:rPr>
+        <w:t xml:space="preserve"> 293 mg/kg</w:t>
+      </w:r>
+    </w:p>
+    <w:p>
+      <w:pPr>
+        <w:spacing w:after="80"/>
+      </w:pPr>
+      <w:r>
+        <w:rPr>
+          <w:rFonts w:ascii="Arial" w:cs="Arial" w:eastAsia="Arial" w:hAnsi="Arial"/>
+          <w:sz w:val="20"/>
+          <w:szCs w:val="20"/>
+        </w:rPr>
+        <w:t xml:space="preserve">2,6-di-tert-butylo-4-metylofenol (BHT) [CAS: 128-37-0]:</w:t>
+      </w:r>
+    </w:p>
+    <w:p>
+      <w:pPr>
+        <w:spacing w:after="60" w:before="60"/>
+      </w:pPr>
+      <w:r>
+        <w:rPr>
+          <w:rFonts w:ascii="Arial" w:cs="Arial" w:eastAsia="Arial" w:hAnsi="Arial"/>
+          <w:b/>
+          <w:bCs/>
+          <w:sz w:val="20"/>
+          <w:szCs w:val="20"/>
+        </w:rPr>
+        <w:t xml:space="preserve">- LD50 (na skórę, szczur):</w:t>
+      </w:r>
+      <w:r>
+        <w:rPr>
+          <w:rFonts w:ascii="Arial" w:cs="Arial" w:eastAsia="Arial" w:hAnsi="Arial"/>
+          <w:sz w:val="20"/>
+          <w:szCs w:val="20"/>
+        </w:rPr>
+        <w:t xml:space="preserve"> &gt; 2000 mg/kg mc.</w:t>
+      </w:r>
+    </w:p>
+    <w:p>
+      <w:pPr>
+        <w:spacing w:after="60" w:before="60"/>
+      </w:pPr>
+      <w:r>
+        <w:rPr>
+          <w:rFonts w:ascii="Arial" w:cs="Arial" w:eastAsia="Arial" w:hAnsi="Arial"/>
+          <w:b/>
+          <w:bCs/>
+          <w:sz w:val="20"/>
+          <w:szCs w:val="20"/>
+        </w:rPr>
+        <w:t xml:space="preserve">- LD50 (droga pokarmowa, szczur):</w:t>
+      </w:r>
+      <w:r>
+        <w:rPr>
+          <w:rFonts w:ascii="Arial" w:cs="Arial" w:eastAsia="Arial" w:hAnsi="Arial"/>
+          <w:sz w:val="20"/>
+          <w:szCs w:val="20"/>
+        </w:rPr>
+        <w:t xml:space="preserve"> 2930 mg/kg mc.</w:t>
+      </w:r>
+    </w:p>
+    <w:p>
+      <w:pPr>
+        <w:spacing w:after="80"/>
+      </w:pPr>
+      <w:r>
+        <w:rPr>
+          <w:rFonts w:ascii="Arial" w:cs="Arial" w:eastAsia="Arial" w:hAnsi="Arial"/>
+          <w:sz w:val="20"/>
+          <w:szCs w:val="20"/>
+        </w:rPr>
+        <w:t xml:space="preserve">Toluen [CAS: 108-88-3]:</w:t>
+      </w:r>
+    </w:p>
+    <w:p>
+      <w:pPr>
+        <w:spacing w:after="60" w:before="60"/>
+      </w:pPr>
+      <w:r>
+        <w:rPr>
+          <w:rFonts w:ascii="Arial" w:cs="Arial" w:eastAsia="Arial" w:hAnsi="Arial"/>
+          <w:b/>
+          <w:bCs/>
+          <w:sz w:val="20"/>
+          <w:szCs w:val="20"/>
+        </w:rPr>
+        <w:t xml:space="preserve">- LD50 (na skórę, królik):</w:t>
+      </w:r>
+      <w:r>
+        <w:rPr>
+          <w:rFonts w:ascii="Arial" w:cs="Arial" w:eastAsia="Arial" w:hAnsi="Arial"/>
+          <w:sz w:val="20"/>
+          <w:szCs w:val="20"/>
+        </w:rPr>
+        <w:t xml:space="preserve"> &gt; 5000 mg/kg mc.</w:t>
+      </w:r>
+    </w:p>
+    <w:p>
+      <w:pPr>
+        <w:spacing w:after="60" w:before="60"/>
+      </w:pPr>
+      <w:r>
+        <w:rPr>
+          <w:rFonts w:ascii="Arial" w:cs="Arial" w:eastAsia="Arial" w:hAnsi="Arial"/>
+          <w:b/>
+          <w:bCs/>
+          <w:sz w:val="20"/>
+          <w:szCs w:val="20"/>
+        </w:rPr>
+        <w:t xml:space="preserve">- LD50 (droga pokarmowa, szczur):</w:t>
+      </w:r>
+      <w:r>
+        <w:rPr>
+          <w:rFonts w:ascii="Arial" w:cs="Arial" w:eastAsia="Arial" w:hAnsi="Arial"/>
+          <w:sz w:val="20"/>
+          <w:szCs w:val="20"/>
+        </w:rPr>
+        <w:t xml:space="preserve"> &gt; 5000 mg/kg mc.</w:t>
+      </w:r>
+    </w:p>
+    <w:p>
+      <w:pPr>
+        <w:spacing w:after="60" w:before="60"/>
+      </w:pPr>
+      <w:r>
+        <w:rPr>
+          <w:rFonts w:ascii="Arial" w:cs="Arial" w:eastAsia="Arial" w:hAnsi="Arial"/>
+          <w:b/>
+          <w:bCs/>
+          <w:sz w:val="20"/>
+          <w:szCs w:val="20"/>
+        </w:rPr>
+        <w:t xml:space="preserve">- LC50 (drogi oddechowe, pary, człowiek):</w:t>
+      </w:r>
+      <w:r>
+        <w:rPr>
+          <w:rFonts w:ascii="Arial" w:cs="Arial" w:eastAsia="Arial" w:hAnsi="Arial"/>
+          <w:sz w:val="20"/>
+          <w:szCs w:val="20"/>
+        </w:rPr>
+        <w:t xml:space="preserve"> 100 ppm</w:t>
       </w:r>
     </w:p>
     <w:p>
@@ -5794,7 +5937,7 @@
           <w:sz w:val="20"/>
           <w:szCs w:val="20"/>
         </w:rPr>
-        <w:t xml:space="preserve">Działa drażniąco na oczy.</w:t>
+        <w:t xml:space="preserve">Działa drażniąco na oczy (produkt zaklasyfikowany do kategorii Eye Irrit. 2, H319 z uwagi na stężenie etanolu ≥ 50%).</w:t>
       </w:r>
     </w:p>
     <w:p>
@@ -5820,20 +5963,7 @@
           <w:sz w:val="20"/>
           <w:szCs w:val="20"/>
         </w:rPr>
-        <w:t xml:space="preserve">Może powodować wystąpienie reakcji alergicznej.</w:t>
-      </w:r>
-    </w:p>
-    <w:p>
-      <w:pPr>
-        <w:spacing w:after="80"/>
-      </w:pPr>
-      <w:r>
-        <w:rPr>
-          <w:rFonts w:ascii="Arial" w:cs="Arial" w:eastAsia="Arial" w:hAnsi="Arial"/>
-          <w:sz w:val="20"/>
-          <w:szCs w:val="20"/>
-        </w:rPr>
-        <w:t xml:space="preserve">Zawiera: kumarynę.</w:t>
+        <w:t xml:space="preserve">Może powodować wystąpienie reakcji alergicznej. Zawiera kumarynę (stężenie kumaryny 0,4–0,45 % nakazuje uzupełniające oznakowanie zwrotem EUH208, nie powodując pełnej klasyfikacji mieszaniny jako Skin Sens. 1).</w:t>
       </w:r>
     </w:p>
     <w:p>
@@ -5898,33 +6028,7 @@
           <w:sz w:val="20"/>
           <w:szCs w:val="20"/>
         </w:rPr>
-        <w:t xml:space="preserve">Toluen:</w:t>
-      </w:r>
-    </w:p>
-    <w:p>
-      <w:pPr>
-        <w:spacing w:after="80"/>
-      </w:pPr>
-      <w:r>
-        <w:rPr>
-          <w:rFonts w:ascii="Arial" w:cs="Arial" w:eastAsia="Arial" w:hAnsi="Arial"/>
-          <w:sz w:val="20"/>
-          <w:szCs w:val="20"/>
-        </w:rPr>
-        <w:t xml:space="preserve">Sklasyfikowany w grupie 3 (nie można zaklasyfikować jako rakotwórczy dla ludzi) przez Międzynarodową Agencję Badań nad Rakiem (IARC) - (IARC, 1999).</w:t>
-      </w:r>
-    </w:p>
-    <w:p>
-      <w:pPr>
-        <w:spacing w:after="80"/>
-      </w:pPr>
-      <w:r>
-        <w:rPr>
-          <w:rFonts w:ascii="Arial" w:cs="Arial" w:eastAsia="Arial" w:hAnsi="Arial"/>
-          <w:sz w:val="20"/>
-          <w:szCs w:val="20"/>
-        </w:rPr>
-        <w:t xml:space="preserve">Amerykańska Agencja Ochrony Środowiska (EPA) twierdzi, że „dane są niewystarczające do oceny potencjału rakotwórczego”.</w:t>
+        <w:t xml:space="preserve">Toluen został zaklasyfikowany przez Międzynarodową Agencję Badań nad Rakiem (IARC) do Grupy 3 (brak możliwości zaklasyfikowania jako rakotwórczy dla ludzi - IARC, 1999). Amerykańska Agencja Ochrony Środowiska (EPA) stwierdza, że dane są niewystarczające do oceny potencjału rakotwórczego.</w:t>
       </w:r>
     </w:p>
     <w:p>
@@ -5950,6 +6054,32 @@
           <w:sz w:val="20"/>
           <w:szCs w:val="20"/>
         </w:rPr>
+        <w:t xml:space="preserve">W oparciu o dostępne dane, kryteria klasyfikacji nie są spełnione (składniki o działaniu reprotoksycznym występują poniżej stężeń nakazujących klasyfikację mieszaniny).</w:t>
+      </w:r>
+    </w:p>
+    <w:p>
+      <w:pPr>
+        <w:spacing w:after="80"/>
+      </w:pPr>
+      <w:r>
+        <w:rPr>
+          <w:rFonts w:ascii="Arial" w:cs="Arial" w:eastAsia="Arial" w:hAnsi="Arial"/>
+          <w:sz w:val="20"/>
+          <w:szCs w:val="20"/>
+        </w:rPr>
+        <w:t xml:space="preserve">Działanie toksyczne na narządy docelowe – narażenie jednorazowe (STOT SE):</w:t>
+      </w:r>
+    </w:p>
+    <w:p>
+      <w:pPr>
+        <w:spacing w:after="80"/>
+      </w:pPr>
+      <w:r>
+        <w:rPr>
+          <w:rFonts w:ascii="Arial" w:cs="Arial" w:eastAsia="Arial" w:hAnsi="Arial"/>
+          <w:sz w:val="20"/>
+          <w:szCs w:val="20"/>
+        </w:rPr>
         <w:t xml:space="preserve">W oparciu o dostępne dane, kryteria klasyfikacji nie są spełnione.</w:t>
       </w:r>
     </w:p>
@@ -5963,7 +6093,7 @@
           <w:sz w:val="20"/>
           <w:szCs w:val="20"/>
         </w:rPr>
-        <w:t xml:space="preserve">Działanie toksyczne na narządy docelowe – narażenie jednorazowe:</w:t>
+        <w:t xml:space="preserve">Działanie toksyczne na narządy docelowe – narażenie powtarzane (STOT RE):</w:t>
       </w:r>
     </w:p>
     <w:p>
@@ -5989,7 +6119,7 @@
           <w:sz w:val="20"/>
           <w:szCs w:val="20"/>
         </w:rPr>
-        <w:t xml:space="preserve">Działanie toksyczne na narządy docelowe – narażenie powtarzane:</w:t>
+        <w:t xml:space="preserve">Zagrożenie spowodowane aspiracją:</w:t>
       </w:r>
     </w:p>
     <w:p>
@@ -6007,32 +6137,6 @@
     </w:p>
     <w:p>
       <w:pPr>
-        <w:spacing w:after="80"/>
-      </w:pPr>
-      <w:r>
-        <w:rPr>
-          <w:rFonts w:ascii="Arial" w:cs="Arial" w:eastAsia="Arial" w:hAnsi="Arial"/>
-          <w:sz w:val="20"/>
-          <w:szCs w:val="20"/>
-        </w:rPr>
-        <w:t xml:space="preserve">Zagrożenie spowodowane aspiracją:</w:t>
-      </w:r>
-    </w:p>
-    <w:p>
-      <w:pPr>
-        <w:spacing w:after="80"/>
-      </w:pPr>
-      <w:r>
-        <w:rPr>
-          <w:rFonts w:ascii="Arial" w:cs="Arial" w:eastAsia="Arial" w:hAnsi="Arial"/>
-          <w:sz w:val="20"/>
-          <w:szCs w:val="20"/>
-        </w:rPr>
-        <w:t xml:space="preserve">W oparciu o dostępne dane, kryteria klasyfikacji nie są spełnione.</w:t>
-      </w:r>
-    </w:p>
-    <w:p>
-      <w:pPr>
         <w:spacing w:after="100" w:before="200"/>
       </w:pPr>
       <w:r>
@@ -6056,7 +6160,20 @@
           <w:sz w:val="20"/>
           <w:szCs w:val="20"/>
         </w:rPr>
-        <w:t xml:space="preserve">W oparciu o dostępne dane, produkt nie zawiera substancji wymienionych w głównych europejskich wykazach potencjalnych lub podejrzewanych substancji zaburzających funkcjonowanie układu hormonalnego o ocenianym wpływie na zdrowie człowieka.</w:t>
+        <w:t xml:space="preserve">Właściwości zaburzające funkcjonowanie układu hormonalnego:</w:t>
+      </w:r>
+    </w:p>
+    <w:p>
+      <w:pPr>
+        <w:spacing w:after="80"/>
+      </w:pPr>
+      <w:r>
+        <w:rPr>
+          <w:rFonts w:ascii="Arial" w:cs="Arial" w:eastAsia="Arial" w:hAnsi="Arial"/>
+          <w:sz w:val="20"/>
+          <w:szCs w:val="20"/>
+        </w:rPr>
+        <w:t xml:space="preserve">Na podstawie dostępnych danych mieszanina nie zawiera substancji wpisanych do unijnych wykazów ustanowionych zgodnie z art. 59 ust. 1 rozporządzenia REACH ani substancji zidentyfikowanych jako zaburzające gospodarkę hormonalną u ludzi w stężeniu ≥ 0,1 % wag.</w:t>
       </w:r>
     </w:p>
     <w:p>
@@ -7561,12 +7678,142 @@
     </w:p>
     <w:p>
       <w:pPr>
-        <w:spacing w:after="100" w:before="60"/>
+        <w:spacing w:after="80"/>
+      </w:pPr>
+      <w:r>
+        <w:rPr>
+          <w:rFonts w:ascii="Arial" w:cs="Arial" w:eastAsia="Arial" w:hAnsi="Arial"/>
+          <w:sz w:val="20"/>
+          <w:szCs w:val="20"/>
+        </w:rPr>
+        <w:t xml:space="preserve">ADR / RID, IMDG, IATA: Klasa 3 (Materiały ciekłe zapalne)</w:t>
+      </w:r>
+    </w:p>
+    <w:p>
+      <w:pPr>
+        <w:spacing w:after="80" w:before="80"/>
+      </w:pPr>
+      <w:r>
+        <w:rPr>
+          <w:rFonts w:ascii="Arial" w:cs="Arial" w:eastAsia="Arial" w:hAnsi="Arial"/>
+          <w:b/>
+          <w:bCs/>
+          <w:sz w:val="20"/>
+          <w:szCs w:val="20"/>
+        </w:rPr>
+        <w:t xml:space="preserve">Nalepka ostrzegawcza:</w:t>
+      </w:r>
+      <w:r>
+        <w:rPr>
+          <w:rFonts w:ascii="Arial" w:cs="Arial" w:eastAsia="Arial" w:hAnsi="Arial"/>
+          <w:sz w:val="20"/>
+          <w:szCs w:val="20"/>
+        </w:rPr>
+        <w:t xml:space="preserve"> Nr 3</w:t>
+      </w:r>
+    </w:p>
+    <w:p>
+      <w:pPr>
+        <w:spacing w:after="100" w:before="200"/>
+      </w:pPr>
+      <w:r>
+        <w:rPr>
+          <w:rFonts w:ascii="Arial" w:cs="Arial" w:eastAsia="Arial" w:hAnsi="Arial"/>
+          <w:b/>
+          <w:bCs/>
+          <w:sz w:val="20"/>
+          <w:szCs w:val="20"/>
+        </w:rPr>
+        <w:t xml:space="preserve">14.4. Grupa pakowania</w:t>
+      </w:r>
+    </w:p>
+    <w:p>
+      <w:pPr>
+        <w:spacing w:after="80"/>
+      </w:pPr>
+      <w:r>
+        <w:rPr>
+          <w:rFonts w:ascii="Arial" w:cs="Arial" w:eastAsia="Arial" w:hAnsi="Arial"/>
+          <w:sz w:val="20"/>
+          <w:szCs w:val="20"/>
+        </w:rPr>
+        <w:t xml:space="preserve">Grupa pakowania ADR / RID, IMDG, IATA:II</w:t>
+      </w:r>
+    </w:p>
+    <w:p>
+      <w:pPr>
+        <w:spacing w:after="100" w:before="200"/>
+      </w:pPr>
+      <w:r>
+        <w:rPr>
+          <w:rFonts w:ascii="Arial" w:cs="Arial" w:eastAsia="Arial" w:hAnsi="Arial"/>
+          <w:b/>
+          <w:bCs/>
+          <w:sz w:val="20"/>
+          <w:szCs w:val="20"/>
+        </w:rPr>
+        <w:t xml:space="preserve">14.5. Zagrożenia dla środowiska</w:t>
+      </w:r>
+    </w:p>
+    <w:p>
+      <w:pPr>
+        <w:spacing w:after="80"/>
+      </w:pPr>
+      <w:r>
+        <w:rPr>
+          <w:rFonts w:ascii="Arial" w:cs="Arial" w:eastAsia="Arial" w:hAnsi="Arial"/>
+          <w:sz w:val="20"/>
+          <w:szCs w:val="20"/>
+        </w:rPr>
+        <w:t xml:space="preserve">Brak (produkt nie jest zaklasyfikowany jako stwarzający zagrożenie dla środowiska w transporcie).</w:t>
+      </w:r>
+    </w:p>
+    <w:p>
+      <w:pPr>
+        <w:spacing w:after="100" w:before="200"/>
+      </w:pPr>
+      <w:r>
+        <w:rPr>
+          <w:rFonts w:ascii="Arial" w:cs="Arial" w:eastAsia="Arial" w:hAnsi="Arial"/>
+          <w:b/>
+          <w:bCs/>
+          <w:sz w:val="20"/>
+          <w:szCs w:val="20"/>
+        </w:rPr>
+        <w:t xml:space="preserve">14.6. Szczególne środki ostrożności dla użytkowników</w:t>
+      </w:r>
+    </w:p>
+    <w:p>
+      <w:pPr>
+        <w:spacing w:after="60" w:before="80"/>
+      </w:pPr>
+      <w:r>
+        <w:rPr>
+          <w:rFonts w:ascii="Arial" w:cs="Arial" w:eastAsia="Arial" w:hAnsi="Arial"/>
+          <w:b/>
+          <w:bCs/>
+          <w:sz w:val="20"/>
+          <w:szCs w:val="20"/>
+        </w:rPr>
+        <w:t xml:space="preserve">Ilości ograniczone (LQ):</w:t>
+      </w:r>
+      <w:r>
+        <w:rPr>
+          <w:rFonts w:ascii="Arial" w:cs="Arial" w:eastAsia="Arial" w:hAnsi="Arial"/>
+          <w:sz w:val="20"/>
+          <w:szCs w:val="20"/>
+        </w:rPr>
+        <w:t xml:space="preserve"> 1 L</w:t>
+      </w:r>
+    </w:p>
+    <w:p>
+      <w:pPr>
+        <w:spacing w:after="80" w:before="40"/>
       </w:pPr>
       <w:r>
         <w:drawing>
           <wp:inline distT="0" distB="0" distL="0" distR="0">
-            <wp:extent cx="714375" cy="714375"/>
+            <wp:extent cx="666750" cy="666750"/>
             <wp:effectExtent t="0" r="0" b="0" l="0"/>
             <wp:docPr id="1" name="" descr="" title=""/>
             <wp:cNvGraphicFramePr>
@@ -7591,181 +7838,6 @@
                   <pic:spPr bwMode="auto">
                     <a:xfrm>
                       <a:off x="0" y="0"/>
-                      <a:ext cx="714375" cy="714375"/>
-                    </a:xfrm>
-                    <a:prstGeom prst="rect">
-                      <a:avLst/>
-                    </a:prstGeom>
-                  </pic:spPr>
-                </pic:pic>
-              </a:graphicData>
-            </a:graphic>
-          </wp:inline>
-        </w:drawing>
-      </w:r>
-    </w:p>
-    <w:p>
-      <w:pPr>
-        <w:spacing w:after="80"/>
-      </w:pPr>
-      <w:r>
-        <w:rPr>
-          <w:rFonts w:ascii="Arial" w:cs="Arial" w:eastAsia="Arial" w:hAnsi="Arial"/>
-          <w:sz w:val="20"/>
-          <w:szCs w:val="20"/>
-        </w:rPr>
-        <w:t xml:space="preserve">ADR / RID, IMDG, IATA: Klasa 3 (Materiały ciekłe zapalne)</w:t>
-      </w:r>
-    </w:p>
-    <w:p>
-      <w:pPr>
-        <w:spacing w:after="80" w:before="80"/>
-      </w:pPr>
-      <w:r>
-        <w:rPr>
-          <w:rFonts w:ascii="Arial" w:cs="Arial" w:eastAsia="Arial" w:hAnsi="Arial"/>
-          <w:b/>
-          <w:bCs/>
-          <w:sz w:val="20"/>
-          <w:szCs w:val="20"/>
-        </w:rPr>
-        <w:t xml:space="preserve">Nalepka ostrzegawcza:</w:t>
-      </w:r>
-      <w:r>
-        <w:rPr>
-          <w:rFonts w:ascii="Arial" w:cs="Arial" w:eastAsia="Arial" w:hAnsi="Arial"/>
-          <w:sz w:val="20"/>
-          <w:szCs w:val="20"/>
-        </w:rPr>
-        <w:t xml:space="preserve"> Nr 3</w:t>
-      </w:r>
-    </w:p>
-    <w:p>
-      <w:pPr>
-        <w:spacing w:after="100" w:before="200"/>
-      </w:pPr>
-      <w:r>
-        <w:rPr>
-          <w:rFonts w:ascii="Arial" w:cs="Arial" w:eastAsia="Arial" w:hAnsi="Arial"/>
-          <w:b/>
-          <w:bCs/>
-          <w:sz w:val="20"/>
-          <w:szCs w:val="20"/>
-        </w:rPr>
-        <w:t xml:space="preserve">14.4. Grupa pakowania</w:t>
-      </w:r>
-    </w:p>
-    <w:p>
-      <w:pPr>
-        <w:spacing w:after="80"/>
-      </w:pPr>
-      <w:r>
-        <w:rPr>
-          <w:rFonts w:ascii="Arial" w:cs="Arial" w:eastAsia="Arial" w:hAnsi="Arial"/>
-          <w:sz w:val="20"/>
-          <w:szCs w:val="20"/>
-        </w:rPr>
-        <w:t xml:space="preserve">Grupa pakowania ADR / RID, IMDG, IATA:II</w:t>
-      </w:r>
-    </w:p>
-    <w:p>
-      <w:pPr>
-        <w:spacing w:after="100" w:before="200"/>
-      </w:pPr>
-      <w:r>
-        <w:rPr>
-          <w:rFonts w:ascii="Arial" w:cs="Arial" w:eastAsia="Arial" w:hAnsi="Arial"/>
-          <w:b/>
-          <w:bCs/>
-          <w:sz w:val="20"/>
-          <w:szCs w:val="20"/>
-        </w:rPr>
-        <w:t xml:space="preserve">14.5. Zagrożenia dla środowiska</w:t>
-      </w:r>
-    </w:p>
-    <w:p>
-      <w:pPr>
-        <w:spacing w:after="80"/>
-      </w:pPr>
-      <w:r>
-        <w:rPr>
-          <w:rFonts w:ascii="Arial" w:cs="Arial" w:eastAsia="Arial" w:hAnsi="Arial"/>
-          <w:sz w:val="20"/>
-          <w:szCs w:val="20"/>
-        </w:rPr>
-        <w:t xml:space="preserve">Brak (produkt nie jest zaklasyfikowany jako stwarzający zagrożenie dla środowiska w transporcie).</w:t>
-      </w:r>
-    </w:p>
-    <w:p>
-      <w:pPr>
-        <w:spacing w:after="100" w:before="200"/>
-      </w:pPr>
-      <w:r>
-        <w:rPr>
-          <w:rFonts w:ascii="Arial" w:cs="Arial" w:eastAsia="Arial" w:hAnsi="Arial"/>
-          <w:b/>
-          <w:bCs/>
-          <w:sz w:val="20"/>
-          <w:szCs w:val="20"/>
-        </w:rPr>
-        <w:t xml:space="preserve">14.6. Szczególne środki ostrożności dla użytkowników</w:t>
-      </w:r>
-    </w:p>
-    <w:p>
-      <w:pPr>
-        <w:spacing w:after="60" w:before="80"/>
-      </w:pPr>
-      <w:r>
-        <w:rPr>
-          <w:rFonts w:ascii="Arial" w:cs="Arial" w:eastAsia="Arial" w:hAnsi="Arial"/>
-          <w:b/>
-          <w:bCs/>
-          <w:sz w:val="20"/>
-          <w:szCs w:val="20"/>
-        </w:rPr>
-        <w:t xml:space="preserve">Ilości ograniczone (LQ):</w:t>
-      </w:r>
-      <w:r>
-        <w:rPr>
-          <w:rFonts w:ascii="Arial" w:cs="Arial" w:eastAsia="Arial" w:hAnsi="Arial"/>
-          <w:sz w:val="20"/>
-          <w:szCs w:val="20"/>
-        </w:rPr>
-        <w:t xml:space="preserve"> 1 L</w:t>
-      </w:r>
-    </w:p>
-    <w:p>
-      <w:pPr>
-        <w:spacing w:after="80" w:before="40"/>
-      </w:pPr>
-      <w:r>
-        <w:drawing>
-          <wp:inline distT="0" distB="0" distL="0" distR="0">
-            <wp:extent cx="666750" cy="666750"/>
-            <wp:effectExtent t="0" r="0" b="0" l="0"/>
-            <wp:docPr id="1" name="" descr="" title=""/>
-            <wp:cNvGraphicFramePr>
-              <a:graphicFrameLocks xmlns:a="http://schemas.openxmlformats.org/drawingml/2006/main" noChangeAspect="1"/>
-            </wp:cNvGraphicFramePr>
-            <a:graphic xmlns:a="http://schemas.openxmlformats.org/drawingml/2006/main">
-              <a:graphicData uri="http://schemas.openxmlformats.org/drawingml/2006/picture">
-                <pic:pic xmlns:pic="http://schemas.openxmlformats.org/drawingml/2006/picture">
-                  <pic:nvPicPr>
-                    <pic:cNvPr id="0" name="" descr=""/>
-                    <pic:cNvPicPr>
-                      <a:picLocks noChangeAspect="1" noChangeArrowheads="1"/>
-                    </pic:cNvPicPr>
-                  </pic:nvPicPr>
-                  <pic:blipFill>
-                    <a:blip r:embed="rId12" cstate="none"/>
-                    <a:srcRect/>
-                    <a:stretch>
-                      <a:fillRect/>
-                    </a:stretch>
-                  </pic:blipFill>
-                  <pic:spPr bwMode="auto">
-                    <a:xfrm>
-                      <a:off x="0" y="0"/>
                       <a:ext cx="666750" cy="666750"/>
                     </a:xfrm>
                     <a:prstGeom prst="rect">
@@ -9780,7 +9852,7 @@
           <w:sz w:val="20"/>
           <w:szCs w:val="20"/>
         </w:rPr>
-        <w:t xml:space="preserve">Niniejsze autorskie opracowanie tłumaczenia, formatowania oraz adaptacji regulacyjnej do prawa polskiego stanowi własność intelektualną firmy ITALLUX Sp. z o.o. Kopiowanie i wykorzystywanie całości lub fragmentów w celach komercyjnych przez podmioty trzecie bez uprzedniej zgody właściciela jest zabronione. Dozwolone jest wykorzystanie dokumentu przez odbiorców w łańcuchu dostaw do celów bezpieczeństwa pracy i ochrony zdrowia.</w:t>
+        <w:t xml:space="preserve">Niniejsze autorskie opracowanie tłumaczenia, formatowania oraz adaptacji regulacyjnej do prawa polskiego stanowi własność intelektualną firmy ITALLUX Sp. z o.o.. Kopiowanie i wykorzystywanie całości lub fragmentów w celach komercyjnych przez podmioty trzecie bez uprzedniej zgody właściciela jest zabronione. Dozwolone jest wykorzystanie dokumentu przez odbiorców w łańcuchu dostaw do celów bezpieczeństwa pracy i ochrony zdrowia.</w:t>
       </w:r>
     </w:p>
     <w:p>

</xml_diff>

<commit_message>
feat(sds): implement SDSSchemaValidator, eliminate LLM drift and enforce pipeline determinism (ADR-077)
- Implemented native zero-dependency SDSSchemaValidator for runtime assertions
- Enforced two-stage quality gates (validateTranslatedSections & validateFinalSds)
- Eliminated dual-truth anti-pattern: section 4 removed from LLM prompt, 100% deterministic
- Added unit and regulatory test suite in tests/sds.schema.validator.test.js (6/6 passed)
- Created ADR-077 and updated .agents/.ai-memory.md
</commit_message>
<xml_diff>
--- a/docs/SDS/Karta_Charakterystyki_8034055535448_SDS_ORCHIDEA_E_VANIGLIA (12).docx
+++ b/docs/SDS/Karta_Charakterystyki_8034055535448_SDS_ORCHIDEA_E_VANIGLIA (12).docx
@@ -823,15 +823,17 @@
     </w:p>
     <w:p>
       <w:pPr>
-        <w:spacing w:after="80"/>
-      </w:pPr>
-      <w:r>
-        <w:rPr>
-          <w:rFonts w:ascii="Arial" w:cs="Arial" w:eastAsia="Arial" w:hAnsi="Arial"/>
-          <w:sz w:val="20"/>
-          <w:szCs w:val="20"/>
-        </w:rPr>
-        <w:t xml:space="preserve">Nazwy niebezpiecznych substancji wymienione na etykiecie:</w:t>
+        <w:spacing w:after="80" w:before="150"/>
+      </w:pPr>
+      <w:r>
+        <w:rPr>
+          <w:rFonts w:ascii="Arial" w:cs="Arial" w:eastAsia="Arial" w:hAnsi="Arial"/>
+          <w:b/>
+          <w:bCs/>
+          <w:sz w:val="20"/>
+          <w:szCs w:val="20"/>
+        </w:rPr>
+        <w:t xml:space="preserve">Nazwy niebezpiecznych substancji wymienione na etykiecie</w:t>
       </w:r>
     </w:p>
     <w:p>
@@ -849,15 +851,17 @@
     </w:p>
     <w:p>
       <w:pPr>
-        <w:spacing w:after="80"/>
-      </w:pPr>
-      <w:r>
-        <w:rPr>
-          <w:rFonts w:ascii="Arial" w:cs="Arial" w:eastAsia="Arial" w:hAnsi="Arial"/>
-          <w:sz w:val="20"/>
-          <w:szCs w:val="20"/>
-        </w:rPr>
-        <w:t xml:space="preserve">Zwroty wskazujące rodzaj zagrożenia:</w:t>
+        <w:spacing w:after="80" w:before="150"/>
+      </w:pPr>
+      <w:r>
+        <w:rPr>
+          <w:rFonts w:ascii="Arial" w:cs="Arial" w:eastAsia="Arial" w:hAnsi="Arial"/>
+          <w:b/>
+          <w:bCs/>
+          <w:sz w:val="20"/>
+          <w:szCs w:val="20"/>
+        </w:rPr>
+        <w:t xml:space="preserve">Zwroty wskazujące rodzaj zagrożenia</w:t>
       </w:r>
     </w:p>
     <w:p>
@@ -888,15 +892,17 @@
     </w:p>
     <w:p>
       <w:pPr>
-        <w:spacing w:after="80"/>
-      </w:pPr>
-      <w:r>
-        <w:rPr>
-          <w:rFonts w:ascii="Arial" w:cs="Arial" w:eastAsia="Arial" w:hAnsi="Arial"/>
-          <w:sz w:val="20"/>
-          <w:szCs w:val="20"/>
-        </w:rPr>
-        <w:t xml:space="preserve">Zwroty wskazujące środki ostrożności:</w:t>
+        <w:spacing w:after="80" w:before="150"/>
+      </w:pPr>
+      <w:r>
+        <w:rPr>
+          <w:rFonts w:ascii="Arial" w:cs="Arial" w:eastAsia="Arial" w:hAnsi="Arial"/>
+          <w:b/>
+          <w:bCs/>
+          <w:sz w:val="20"/>
+          <w:szCs w:val="20"/>
+        </w:rPr>
+        <w:t xml:space="preserve">Zwroty wskazujące środki ostrożności</w:t>
       </w:r>
     </w:p>
     <w:p>
@@ -979,15 +985,17 @@
     </w:p>
     <w:p>
       <w:pPr>
-        <w:spacing w:after="80"/>
-      </w:pPr>
-      <w:r>
-        <w:rPr>
-          <w:rFonts w:ascii="Arial" w:cs="Arial" w:eastAsia="Arial" w:hAnsi="Arial"/>
-          <w:sz w:val="20"/>
-          <w:szCs w:val="20"/>
-        </w:rPr>
-        <w:t xml:space="preserve">Informacje uzupełniające o zagrożeniach:</w:t>
+        <w:spacing w:after="80" w:before="150"/>
+      </w:pPr>
+      <w:r>
+        <w:rPr>
+          <w:rFonts w:ascii="Arial" w:cs="Arial" w:eastAsia="Arial" w:hAnsi="Arial"/>
+          <w:b/>
+          <w:bCs/>
+          <w:sz w:val="20"/>
+          <w:szCs w:val="20"/>
+        </w:rPr>
+        <w:t xml:space="preserve">Informacje uzupełniające</w:t>
       </w:r>
     </w:p>
     <w:p>
@@ -5272,20 +5280,20 @@
           <w:sz w:val="20"/>
           <w:szCs w:val="20"/>
         </w:rPr>
-        <w:t xml:space="preserve">Wobec braku danych doświadczalnych dla samego produktu, zagrożenia dla zdrowia oceniono zgodnie z właściwościami zawartych w nim substancji, przy użyciu kryteriów określonych w odpowiednich przepisach dotyczących klasyfikacji.</w:t>
-      </w:r>
-    </w:p>
-    <w:p>
-      <w:pPr>
-        <w:spacing w:after="80"/>
-      </w:pPr>
-      <w:r>
-        <w:rPr>
-          <w:rFonts w:ascii="Arial" w:cs="Arial" w:eastAsia="Arial" w:hAnsi="Arial"/>
-          <w:sz w:val="20"/>
-          <w:szCs w:val="20"/>
-        </w:rPr>
-        <w:t xml:space="preserve">W związku z tym w celu oceny skutków toksykologicznych narażenia na produkt należy wziąć pod uwagę stężenia poszczególnych substancji niebezpiecznych wskazanych w sekcji 3.</w:t>
+        <w:t xml:space="preserve">W przypadku braku danych doświadczalnych dla samego produktu, zagrożenia dla zdrowia ocenia się zgodnie z właściwościami zawartych w nim substancji, przy użyciu kryteriów określonych w odpowiednich przepisach dotyczących klasyfikacji.</w:t>
+      </w:r>
+    </w:p>
+    <w:p>
+      <w:pPr>
+        <w:spacing w:after="80"/>
+      </w:pPr>
+      <w:r>
+        <w:rPr>
+          <w:rFonts w:ascii="Arial" w:cs="Arial" w:eastAsia="Arial" w:hAnsi="Arial"/>
+          <w:sz w:val="20"/>
+          <w:szCs w:val="20"/>
+        </w:rPr>
+        <w:t xml:space="preserve">Dlatego też należy wziąć pod uwagę stężenia poszczególnych substancji niebezpiecznych wskazanych w sekcji 3, aby ocenić skutki toksykologiczne narażenia na produkt.</w:t>
       </w:r>
     </w:p>
     <w:p>
@@ -5365,33 +5373,33 @@
           <w:sz w:val="20"/>
           <w:szCs w:val="20"/>
         </w:rPr>
-        <w:t xml:space="preserve">Pracownicy: inhalacyjnie (drogi oddechowe); kontakt ze skórą.</w:t>
-      </w:r>
-    </w:p>
-    <w:p>
-      <w:pPr>
-        <w:spacing w:after="80"/>
-      </w:pPr>
-      <w:r>
-        <w:rPr>
-          <w:rFonts w:ascii="Arial" w:cs="Arial" w:eastAsia="Arial" w:hAnsi="Arial"/>
-          <w:sz w:val="20"/>
-          <w:szCs w:val="20"/>
-        </w:rPr>
-        <w:t xml:space="preserve">Konsumenci/populacja ogólna: spożycie skażonej żywności lub wody; inhalacyjnie (drogi oddechowe) z otaczającego powietrza; kontakt ze skórą poprzez produkty zawierające substancję.</w:t>
-      </w:r>
-    </w:p>
-    <w:p>
-      <w:pPr>
-        <w:spacing w:after="80"/>
-      </w:pPr>
-      <w:r>
-        <w:rPr>
-          <w:rFonts w:ascii="Arial" w:cs="Arial" w:eastAsia="Arial" w:hAnsi="Arial"/>
-          <w:sz w:val="20"/>
-          <w:szCs w:val="20"/>
-        </w:rPr>
-        <w:t xml:space="preserve">Opóźnione, bezpośrednie oraz przewlekłe skutki krótko- i długotrwałego narażenia:</w:t>
+        <w:t xml:space="preserve">PRACOWNICY: drogi oddechowe (inhalacyjnie); kontakt ze skórą.</w:t>
+      </w:r>
+    </w:p>
+    <w:p>
+      <w:pPr>
+        <w:spacing w:after="80"/>
+      </w:pPr>
+      <w:r>
+        <w:rPr>
+          <w:rFonts w:ascii="Arial" w:cs="Arial" w:eastAsia="Arial" w:hAnsi="Arial"/>
+          <w:sz w:val="20"/>
+          <w:szCs w:val="20"/>
+        </w:rPr>
+        <w:t xml:space="preserve">LUDNOŚĆ: spożycie skażonej żywności lub wody; drogi oddechowe (inhalacyjnie) z otaczającego powietrza; kontakt ze skórą wyrobów zawierających substancję.</w:t>
+      </w:r>
+    </w:p>
+    <w:p>
+      <w:pPr>
+        <w:spacing w:after="80"/>
+      </w:pPr>
+      <w:r>
+        <w:rPr>
+          <w:rFonts w:ascii="Arial" w:cs="Arial" w:eastAsia="Arial" w:hAnsi="Arial"/>
+          <w:sz w:val="20"/>
+          <w:szCs w:val="20"/>
+        </w:rPr>
+        <w:t xml:space="preserve">Skutki opóźnione i bezpośrednie oraz skutki przewlekłe spowodowane krótkotrwałym i długotrwałym narażeniem:</w:t>
       </w:r>
     </w:p>
     <w:p>
@@ -5456,7 +5464,7 @@
           <w:sz w:val="20"/>
           <w:szCs w:val="20"/>
         </w:rPr>
-        <w:t xml:space="preserve">Niektóre leki i inne chemikalia przemysłowe mogą wchodzić w interakcje z metabolizmem toluenu.</w:t>
+        <w:t xml:space="preserve">Niektóre leki i inne produkty przemysłowe mogą zakłócać metabolizm toluenu.</w:t>
       </w:r>
     </w:p>
     <w:p>
@@ -5482,410 +5490,277 @@
           <w:sz w:val="20"/>
           <w:szCs w:val="20"/>
         </w:rPr>
-        <w:t xml:space="preserve">ATE mieszaniny (przez drogi oddechowe / inhalacyjnie): Nie sklasyfikowano (brak istotnych składników toksycznych drogą oddechową).</w:t>
-      </w:r>
-    </w:p>
-    <w:p>
-      <w:pPr>
-        <w:spacing w:after="80"/>
-      </w:pPr>
-      <w:r>
-        <w:rPr>
-          <w:rFonts w:ascii="Arial" w:cs="Arial" w:eastAsia="Arial" w:hAnsi="Arial"/>
-          <w:sz w:val="20"/>
-          <w:szCs w:val="20"/>
-        </w:rPr>
-        <w:t xml:space="preserve">ATE mieszaniny (droga pokarmowa / doustnie): Nie sklasyfikowano (obliczona wartość ATE znacznie przekracza 2000 mg/kg mc.).</w:t>
-      </w:r>
-    </w:p>
-    <w:p>
-      <w:pPr>
-        <w:spacing w:after="80"/>
-      </w:pPr>
-      <w:r>
-        <w:rPr>
-          <w:rFonts w:ascii="Arial" w:cs="Arial" w:eastAsia="Arial" w:hAnsi="Arial"/>
-          <w:sz w:val="20"/>
-          <w:szCs w:val="20"/>
-        </w:rPr>
-        <w:t xml:space="preserve">ATE mieszaniny (na skórę / po naniesieniu na skórę): Nie sklasyfikowano (brak istotnych składników toksycznych przez skórę).</w:t>
-      </w:r>
-    </w:p>
-    <w:p>
-      <w:pPr>
-        <w:spacing w:after="80"/>
-      </w:pPr>
-      <w:r>
-        <w:rPr>
-          <w:rFonts w:ascii="Arial" w:cs="Arial" w:eastAsia="Arial" w:hAnsi="Arial"/>
-          <w:sz w:val="20"/>
-          <w:szCs w:val="20"/>
-        </w:rPr>
-        <w:t xml:space="preserve">Informacje toksykologiczne dotyczące składników:</w:t>
-      </w:r>
-    </w:p>
-    <w:p>
-      <w:pPr>
-        <w:spacing w:after="80"/>
-      </w:pPr>
-      <w:r>
-        <w:rPr>
-          <w:rFonts w:ascii="Arial" w:cs="Arial" w:eastAsia="Arial" w:hAnsi="Arial"/>
-          <w:sz w:val="20"/>
-          <w:szCs w:val="20"/>
-        </w:rPr>
-        <w:t xml:space="preserve">Etanol [CAS: 64-17-5]:</w:t>
-      </w:r>
-    </w:p>
-    <w:p>
-      <w:pPr>
-        <w:spacing w:after="60" w:before="60"/>
-      </w:pPr>
-      <w:r>
-        <w:rPr>
-          <w:rFonts w:ascii="Arial" w:cs="Arial" w:eastAsia="Arial" w:hAnsi="Arial"/>
-          <w:b/>
-          <w:bCs/>
-          <w:sz w:val="20"/>
-          <w:szCs w:val="20"/>
-        </w:rPr>
-        <w:t xml:space="preserve">- LD50 (droga pokarmowa, szczur):</w:t>
-      </w:r>
-      <w:r>
-        <w:rPr>
-          <w:rFonts w:ascii="Arial" w:cs="Arial" w:eastAsia="Arial" w:hAnsi="Arial"/>
-          <w:sz w:val="20"/>
-          <w:szCs w:val="20"/>
-        </w:rPr>
-        <w:t xml:space="preserve"> &gt; 5000 mg/kg mc.</w:t>
-      </w:r>
-    </w:p>
-    <w:p>
-      <w:pPr>
-        <w:spacing w:after="60" w:before="60"/>
-      </w:pPr>
-      <w:r>
-        <w:rPr>
-          <w:rFonts w:ascii="Arial" w:cs="Arial" w:eastAsia="Arial" w:hAnsi="Arial"/>
-          <w:b/>
-          <w:bCs/>
-          <w:sz w:val="20"/>
-          <w:szCs w:val="20"/>
-        </w:rPr>
-        <w:t xml:space="preserve">- LC50 (drogi oddechowe, pary, szczur):</w:t>
-      </w:r>
-      <w:r>
-        <w:rPr>
-          <w:rFonts w:ascii="Arial" w:cs="Arial" w:eastAsia="Arial" w:hAnsi="Arial"/>
-          <w:sz w:val="20"/>
-          <w:szCs w:val="20"/>
-        </w:rPr>
-        <w:t xml:space="preserve"> &gt; 50 mg/l/4h</w:t>
-      </w:r>
-    </w:p>
-    <w:p>
-      <w:pPr>
-        <w:spacing w:after="80"/>
-      </w:pPr>
-      <w:r>
-        <w:rPr>
-          <w:rFonts w:ascii="Arial" w:cs="Arial" w:eastAsia="Arial" w:hAnsi="Arial"/>
-          <w:sz w:val="20"/>
-          <w:szCs w:val="20"/>
-        </w:rPr>
-        <w:t xml:space="preserve">Aldehyd anyżowy [CAS: 123-11-5]:</w:t>
-      </w:r>
-    </w:p>
-    <w:p>
-      <w:pPr>
-        <w:spacing w:after="60" w:before="60"/>
-      </w:pPr>
-      <w:r>
-        <w:rPr>
-          <w:rFonts w:ascii="Arial" w:cs="Arial" w:eastAsia="Arial" w:hAnsi="Arial"/>
-          <w:b/>
-          <w:bCs/>
-          <w:sz w:val="20"/>
-          <w:szCs w:val="20"/>
-        </w:rPr>
-        <w:t xml:space="preserve">- LD50 (na skórę, królik):</w:t>
-      </w:r>
-      <w:r>
-        <w:rPr>
-          <w:rFonts w:ascii="Arial" w:cs="Arial" w:eastAsia="Arial" w:hAnsi="Arial"/>
-          <w:sz w:val="20"/>
-          <w:szCs w:val="20"/>
-        </w:rPr>
-        <w:t xml:space="preserve"> &gt; 5000 mg/kg mc.</w:t>
-      </w:r>
-    </w:p>
-    <w:p>
-      <w:pPr>
-        <w:spacing w:after="60" w:before="60"/>
-      </w:pPr>
-      <w:r>
-        <w:rPr>
-          <w:rFonts w:ascii="Arial" w:cs="Arial" w:eastAsia="Arial" w:hAnsi="Arial"/>
-          <w:b/>
-          <w:bCs/>
-          <w:sz w:val="20"/>
-          <w:szCs w:val="20"/>
-        </w:rPr>
-        <w:t xml:space="preserve">- LD50 (droga pokarmowa, szczur):</w:t>
-      </w:r>
-      <w:r>
-        <w:rPr>
-          <w:rFonts w:ascii="Arial" w:cs="Arial" w:eastAsia="Arial" w:hAnsi="Arial"/>
-          <w:sz w:val="20"/>
-          <w:szCs w:val="20"/>
-        </w:rPr>
-        <w:t xml:space="preserve"> 3210 mg/kg mc.</w:t>
-      </w:r>
-    </w:p>
-    <w:p>
-      <w:pPr>
-        <w:spacing w:after="60" w:before="60"/>
-      </w:pPr>
-      <w:r>
-        <w:rPr>
-          <w:rFonts w:ascii="Arial" w:cs="Arial" w:eastAsia="Arial" w:hAnsi="Arial"/>
-          <w:b/>
-          <w:bCs/>
-          <w:sz w:val="20"/>
-          <w:szCs w:val="20"/>
-        </w:rPr>
-        <w:t xml:space="preserve">- LC50 (drogi oddechowe, pary, szczur):</w:t>
-      </w:r>
-      <w:r>
-        <w:rPr>
-          <w:rFonts w:ascii="Arial" w:cs="Arial" w:eastAsia="Arial" w:hAnsi="Arial"/>
-          <w:sz w:val="20"/>
-          <w:szCs w:val="20"/>
-        </w:rPr>
-        <w:t xml:space="preserve"> 0,32 mg/l/7h</w:t>
-      </w:r>
-    </w:p>
-    <w:p>
-      <w:pPr>
-        <w:spacing w:after="80"/>
-      </w:pPr>
-      <w:r>
-        <w:rPr>
-          <w:rFonts w:ascii="Arial" w:cs="Arial" w:eastAsia="Arial" w:hAnsi="Arial"/>
-          <w:sz w:val="20"/>
-          <w:szCs w:val="20"/>
-        </w:rPr>
-        <w:t xml:space="preserve">Kumaryna [CAS: 91-64-5]:</w:t>
-      </w:r>
-    </w:p>
-    <w:p>
-      <w:pPr>
-        <w:spacing w:after="60" w:before="60"/>
-      </w:pPr>
-      <w:r>
-        <w:rPr>
-          <w:rFonts w:ascii="Arial" w:cs="Arial" w:eastAsia="Arial" w:hAnsi="Arial"/>
-          <w:b/>
-          <w:bCs/>
-          <w:sz w:val="20"/>
-          <w:szCs w:val="20"/>
-        </w:rPr>
-        <w:t xml:space="preserve">- LD50 (na skórę, szczur):</w:t>
-      </w:r>
-      <w:r>
-        <w:rPr>
-          <w:rFonts w:ascii="Arial" w:cs="Arial" w:eastAsia="Arial" w:hAnsi="Arial"/>
-          <w:sz w:val="20"/>
-          <w:szCs w:val="20"/>
-        </w:rPr>
-        <w:t xml:space="preserve"> 293 mg/kg mc.</w:t>
-      </w:r>
-    </w:p>
-    <w:p>
-      <w:pPr>
-        <w:spacing w:after="60" w:before="60"/>
-      </w:pPr>
-      <w:r>
-        <w:rPr>
-          <w:rFonts w:ascii="Arial" w:cs="Arial" w:eastAsia="Arial" w:hAnsi="Arial"/>
-          <w:b/>
-          <w:bCs/>
-          <w:sz w:val="20"/>
-          <w:szCs w:val="20"/>
-        </w:rPr>
-        <w:t xml:space="preserve">- LD50 (droga pokarmowa, szczur):</w:t>
-      </w:r>
-      <w:r>
-        <w:rPr>
-          <w:rFonts w:ascii="Arial" w:cs="Arial" w:eastAsia="Arial" w:hAnsi="Arial"/>
-          <w:sz w:val="20"/>
-          <w:szCs w:val="20"/>
-        </w:rPr>
-        <w:t xml:space="preserve"> 290 mg/kg mc. (ATE oszacowane: 500 mg/kg mc.)</w:t>
-      </w:r>
-    </w:p>
-    <w:p>
-      <w:pPr>
-        <w:spacing w:after="60" w:before="60"/>
-      </w:pPr>
-      <w:r>
-        <w:rPr>
-          <w:rFonts w:ascii="Arial" w:cs="Arial" w:eastAsia="Arial" w:hAnsi="Arial"/>
-          <w:b/>
-          <w:bCs/>
-          <w:sz w:val="20"/>
-          <w:szCs w:val="20"/>
-        </w:rPr>
-        <w:t xml:space="preserve">- LC50 (drogi oddechowe, pyły/mgły, szczur):</w:t>
-      </w:r>
-      <w:r>
-        <w:rPr>
-          <w:rFonts w:ascii="Arial" w:cs="Arial" w:eastAsia="Arial" w:hAnsi="Arial"/>
-          <w:sz w:val="20"/>
-          <w:szCs w:val="20"/>
-        </w:rPr>
-        <w:t xml:space="preserve"> 293 mg/kg</w:t>
-      </w:r>
-    </w:p>
-    <w:p>
-      <w:pPr>
-        <w:spacing w:after="80"/>
-      </w:pPr>
-      <w:r>
-        <w:rPr>
-          <w:rFonts w:ascii="Arial" w:cs="Arial" w:eastAsia="Arial" w:hAnsi="Arial"/>
-          <w:sz w:val="20"/>
-          <w:szCs w:val="20"/>
-        </w:rPr>
-        <w:t xml:space="preserve">2,6-di-tert-butylo-4-metylofenol (BHT) [CAS: 128-37-0]:</w:t>
-      </w:r>
-    </w:p>
-    <w:p>
-      <w:pPr>
-        <w:spacing w:after="60" w:before="60"/>
-      </w:pPr>
-      <w:r>
-        <w:rPr>
-          <w:rFonts w:ascii="Arial" w:cs="Arial" w:eastAsia="Arial" w:hAnsi="Arial"/>
-          <w:b/>
-          <w:bCs/>
-          <w:sz w:val="20"/>
-          <w:szCs w:val="20"/>
-        </w:rPr>
-        <w:t xml:space="preserve">- LD50 (na skórę, szczur):</w:t>
-      </w:r>
-      <w:r>
-        <w:rPr>
-          <w:rFonts w:ascii="Arial" w:cs="Arial" w:eastAsia="Arial" w:hAnsi="Arial"/>
-          <w:sz w:val="20"/>
-          <w:szCs w:val="20"/>
-        </w:rPr>
-        <w:t xml:space="preserve"> &gt; 2000 mg/kg mc.</w:t>
-      </w:r>
-    </w:p>
-    <w:p>
-      <w:pPr>
-        <w:spacing w:after="60" w:before="60"/>
-      </w:pPr>
-      <w:r>
-        <w:rPr>
-          <w:rFonts w:ascii="Arial" w:cs="Arial" w:eastAsia="Arial" w:hAnsi="Arial"/>
-          <w:b/>
-          <w:bCs/>
-          <w:sz w:val="20"/>
-          <w:szCs w:val="20"/>
-        </w:rPr>
-        <w:t xml:space="preserve">- LD50 (droga pokarmowa, szczur):</w:t>
-      </w:r>
-      <w:r>
-        <w:rPr>
-          <w:rFonts w:ascii="Arial" w:cs="Arial" w:eastAsia="Arial" w:hAnsi="Arial"/>
-          <w:sz w:val="20"/>
-          <w:szCs w:val="20"/>
-        </w:rPr>
-        <w:t xml:space="preserve"> 2930 mg/kg mc.</w:t>
-      </w:r>
-    </w:p>
-    <w:p>
-      <w:pPr>
-        <w:spacing w:after="80"/>
-      </w:pPr>
-      <w:r>
-        <w:rPr>
-          <w:rFonts w:ascii="Arial" w:cs="Arial" w:eastAsia="Arial" w:hAnsi="Arial"/>
-          <w:sz w:val="20"/>
-          <w:szCs w:val="20"/>
-        </w:rPr>
-        <w:t xml:space="preserve">Toluen [CAS: 108-88-3]:</w:t>
-      </w:r>
-    </w:p>
-    <w:p>
-      <w:pPr>
-        <w:spacing w:after="60" w:before="60"/>
-      </w:pPr>
-      <w:r>
-        <w:rPr>
-          <w:rFonts w:ascii="Arial" w:cs="Arial" w:eastAsia="Arial" w:hAnsi="Arial"/>
-          <w:b/>
-          <w:bCs/>
-          <w:sz w:val="20"/>
-          <w:szCs w:val="20"/>
-        </w:rPr>
-        <w:t xml:space="preserve">- LD50 (na skórę, królik):</w:t>
-      </w:r>
-      <w:r>
-        <w:rPr>
-          <w:rFonts w:ascii="Arial" w:cs="Arial" w:eastAsia="Arial" w:hAnsi="Arial"/>
-          <w:sz w:val="20"/>
-          <w:szCs w:val="20"/>
-        </w:rPr>
-        <w:t xml:space="preserve"> &gt; 5000 mg/kg mc.</w:t>
-      </w:r>
-    </w:p>
-    <w:p>
-      <w:pPr>
-        <w:spacing w:after="60" w:before="60"/>
-      </w:pPr>
-      <w:r>
-        <w:rPr>
-          <w:rFonts w:ascii="Arial" w:cs="Arial" w:eastAsia="Arial" w:hAnsi="Arial"/>
-          <w:b/>
-          <w:bCs/>
-          <w:sz w:val="20"/>
-          <w:szCs w:val="20"/>
-        </w:rPr>
-        <w:t xml:space="preserve">- LD50 (droga pokarmowa, szczur):</w:t>
-      </w:r>
-      <w:r>
-        <w:rPr>
-          <w:rFonts w:ascii="Arial" w:cs="Arial" w:eastAsia="Arial" w:hAnsi="Arial"/>
-          <w:sz w:val="20"/>
-          <w:szCs w:val="20"/>
-        </w:rPr>
-        <w:t xml:space="preserve"> &gt; 5000 mg/kg mc.</w:t>
-      </w:r>
-    </w:p>
-    <w:p>
-      <w:pPr>
-        <w:spacing w:after="60" w:before="60"/>
-      </w:pPr>
-      <w:r>
-        <w:rPr>
-          <w:rFonts w:ascii="Arial" w:cs="Arial" w:eastAsia="Arial" w:hAnsi="Arial"/>
-          <w:b/>
-          <w:bCs/>
-          <w:sz w:val="20"/>
-          <w:szCs w:val="20"/>
-        </w:rPr>
-        <w:t xml:space="preserve">- LC50 (drogi oddechowe, pary, człowiek):</w:t>
-      </w:r>
-      <w:r>
-        <w:rPr>
-          <w:rFonts w:ascii="Arial" w:cs="Arial" w:eastAsia="Arial" w:hAnsi="Arial"/>
-          <w:sz w:val="20"/>
-          <w:szCs w:val="20"/>
-        </w:rPr>
-        <w:t xml:space="preserve"> 100 ppm</w:t>
+        <w:t xml:space="preserve">ATE (drogi oddechowe - inhalacyjnie) mieszaniny: Nie sklasyfikowano (brak istotnego składnika)</w:t>
+      </w:r>
+    </w:p>
+    <w:p>
+      <w:pPr>
+        <w:spacing w:after="80"/>
+      </w:pPr>
+      <w:r>
+        <w:rPr>
+          <w:rFonts w:ascii="Arial" w:cs="Arial" w:eastAsia="Arial" w:hAnsi="Arial"/>
+          <w:sz w:val="20"/>
+          <w:szCs w:val="20"/>
+        </w:rPr>
+        <w:t xml:space="preserve">ATE (droga pokarmowa - doustnie) mieszaniny: Nie sklasyfikowano (brak istotnego składnika)</w:t>
+      </w:r>
+    </w:p>
+    <w:p>
+      <w:pPr>
+        <w:spacing w:after="80"/>
+      </w:pPr>
+      <w:r>
+        <w:rPr>
+          <w:rFonts w:ascii="Arial" w:cs="Arial" w:eastAsia="Arial" w:hAnsi="Arial"/>
+          <w:sz w:val="20"/>
+          <w:szCs w:val="20"/>
+        </w:rPr>
+        <w:t xml:space="preserve">ATE (na skórę) mieszaniny: Nie sklasyfikowano (brak istotnego składnika)</w:t>
+      </w:r>
+    </w:p>
+    <w:p>
+      <w:pPr>
+        <w:spacing w:after="80" w:before="150"/>
+      </w:pPr>
+      <w:r>
+        <w:rPr>
+          <w:rFonts w:ascii="Arial" w:cs="Arial" w:eastAsia="Arial" w:hAnsi="Arial"/>
+          <w:b/>
+          <w:bCs/>
+          <w:sz w:val="20"/>
+          <w:szCs w:val="20"/>
+        </w:rPr>
+        <w:t xml:space="preserve">etanol (CAS: 64-17-5):</w:t>
+      </w:r>
+    </w:p>
+    <w:p>
+      <w:pPr>
+        <w:spacing w:after="80"/>
+      </w:pPr>
+      <w:r>
+        <w:rPr>
+          <w:rFonts w:ascii="Arial" w:cs="Arial" w:eastAsia="Arial" w:hAnsi="Arial"/>
+          <w:sz w:val="20"/>
+          <w:szCs w:val="20"/>
+        </w:rPr>
+        <w:t xml:space="preserve">LD50 (droga pokarmowa / doustnie): &gt; 5000 mg/kg (szczur)</w:t>
+      </w:r>
+    </w:p>
+    <w:p>
+      <w:pPr>
+        <w:spacing w:after="80"/>
+      </w:pPr>
+      <w:r>
+        <w:rPr>
+          <w:rFonts w:ascii="Arial" w:cs="Arial" w:eastAsia="Arial" w:hAnsi="Arial"/>
+          <w:sz w:val="20"/>
+          <w:szCs w:val="20"/>
+        </w:rPr>
+        <w:t xml:space="preserve">LC50 (drogi oddechowe, pary): &gt; 50 mg/l/4h (szczur)</w:t>
+      </w:r>
+    </w:p>
+    <w:p>
+      <w:pPr>
+        <w:spacing w:after="80" w:before="150"/>
+      </w:pPr>
+      <w:r>
+        <w:rPr>
+          <w:rFonts w:ascii="Arial" w:cs="Arial" w:eastAsia="Arial" w:hAnsi="Arial"/>
+          <w:b/>
+          <w:bCs/>
+          <w:sz w:val="20"/>
+          <w:szCs w:val="20"/>
+        </w:rPr>
+        <w:t xml:space="preserve">aldehyd anyżowy (4-metoksybenzaldehyd) (CAS: 123-11-5):</w:t>
+      </w:r>
+    </w:p>
+    <w:p>
+      <w:pPr>
+        <w:spacing w:after="80"/>
+      </w:pPr>
+      <w:r>
+        <w:rPr>
+          <w:rFonts w:ascii="Arial" w:cs="Arial" w:eastAsia="Arial" w:hAnsi="Arial"/>
+          <w:sz w:val="20"/>
+          <w:szCs w:val="20"/>
+        </w:rPr>
+        <w:t xml:space="preserve">LD50 (na skórę): &gt; 5000 mg/kg (królik)</w:t>
+      </w:r>
+    </w:p>
+    <w:p>
+      <w:pPr>
+        <w:spacing w:after="80"/>
+      </w:pPr>
+      <w:r>
+        <w:rPr>
+          <w:rFonts w:ascii="Arial" w:cs="Arial" w:eastAsia="Arial" w:hAnsi="Arial"/>
+          <w:sz w:val="20"/>
+          <w:szCs w:val="20"/>
+        </w:rPr>
+        <w:t xml:space="preserve">LD50 (droga pokarmowa / doustnie): 3210 mg/kg (szczur)</w:t>
+      </w:r>
+    </w:p>
+    <w:p>
+      <w:pPr>
+        <w:spacing w:after="80"/>
+      </w:pPr>
+      <w:r>
+        <w:rPr>
+          <w:rFonts w:ascii="Arial" w:cs="Arial" w:eastAsia="Arial" w:hAnsi="Arial"/>
+          <w:sz w:val="20"/>
+          <w:szCs w:val="20"/>
+        </w:rPr>
+        <w:t xml:space="preserve">LC50 (drogi oddechowe, pary): 0,32 mg/l/7h (szczur)</w:t>
+      </w:r>
+    </w:p>
+    <w:p>
+      <w:pPr>
+        <w:spacing w:after="80" w:before="150"/>
+      </w:pPr>
+      <w:r>
+        <w:rPr>
+          <w:rFonts w:ascii="Arial" w:cs="Arial" w:eastAsia="Arial" w:hAnsi="Arial"/>
+          <w:b/>
+          <w:bCs/>
+          <w:sz w:val="20"/>
+          <w:szCs w:val="20"/>
+        </w:rPr>
+        <w:t xml:space="preserve">kumaryna (2H-chromen-2-on) (CAS: 91-64-5):</w:t>
+      </w:r>
+    </w:p>
+    <w:p>
+      <w:pPr>
+        <w:spacing w:after="80"/>
+      </w:pPr>
+      <w:r>
+        <w:rPr>
+          <w:rFonts w:ascii="Arial" w:cs="Arial" w:eastAsia="Arial" w:hAnsi="Arial"/>
+          <w:sz w:val="20"/>
+          <w:szCs w:val="20"/>
+        </w:rPr>
+        <w:t xml:space="preserve">LD50 (na skórę): 293 mg/kg mc. (szczur)</w:t>
+      </w:r>
+    </w:p>
+    <w:p>
+      <w:pPr>
+        <w:spacing w:after="80"/>
+      </w:pPr>
+      <w:r>
+        <w:rPr>
+          <w:rFonts w:ascii="Arial" w:cs="Arial" w:eastAsia="Arial" w:hAnsi="Arial"/>
+          <w:sz w:val="20"/>
+          <w:szCs w:val="20"/>
+        </w:rPr>
+        <w:t xml:space="preserve">LD50 (droga pokarmowa / doustnie): 290 mg/kg mc. (szczur)</w:t>
+      </w:r>
+    </w:p>
+    <w:p>
+      <w:pPr>
+        <w:spacing w:after="80"/>
+      </w:pPr>
+      <w:r>
+        <w:rPr>
+          <w:rFonts w:ascii="Arial" w:cs="Arial" w:eastAsia="Arial" w:hAnsi="Arial"/>
+          <w:sz w:val="20"/>
+          <w:szCs w:val="20"/>
+        </w:rPr>
+        <w:t xml:space="preserve">LC50 (drogi oddechowe, pyły/mgły): 293 mg/kg (szczur)</w:t>
+      </w:r>
+    </w:p>
+    <w:p>
+      <w:pPr>
+        <w:spacing w:after="80" w:before="150"/>
+      </w:pPr>
+      <w:r>
+        <w:rPr>
+          <w:rFonts w:ascii="Arial" w:cs="Arial" w:eastAsia="Arial" w:hAnsi="Arial"/>
+          <w:b/>
+          <w:bCs/>
+          <w:sz w:val="20"/>
+          <w:szCs w:val="20"/>
+        </w:rPr>
+        <w:t xml:space="preserve">2,6-di-tert-butylo-4-metylofenol (BHT) (CAS: 128-37-0):</w:t>
+      </w:r>
+    </w:p>
+    <w:p>
+      <w:pPr>
+        <w:spacing w:after="80"/>
+      </w:pPr>
+      <w:r>
+        <w:rPr>
+          <w:rFonts w:ascii="Arial" w:cs="Arial" w:eastAsia="Arial" w:hAnsi="Arial"/>
+          <w:sz w:val="20"/>
+          <w:szCs w:val="20"/>
+        </w:rPr>
+        <w:t xml:space="preserve">LD50 (na skórę): &gt; 2000 mg/kg (szczur)</w:t>
+      </w:r>
+    </w:p>
+    <w:p>
+      <w:pPr>
+        <w:spacing w:after="80"/>
+      </w:pPr>
+      <w:r>
+        <w:rPr>
+          <w:rFonts w:ascii="Arial" w:cs="Arial" w:eastAsia="Arial" w:hAnsi="Arial"/>
+          <w:sz w:val="20"/>
+          <w:szCs w:val="20"/>
+        </w:rPr>
+        <w:t xml:space="preserve">LD50 (droga pokarmowa / doustnie): 2930 mg/kg (szczur)</w:t>
+      </w:r>
+    </w:p>
+    <w:p>
+      <w:pPr>
+        <w:spacing w:after="80" w:before="150"/>
+      </w:pPr>
+      <w:r>
+        <w:rPr>
+          <w:rFonts w:ascii="Arial" w:cs="Arial" w:eastAsia="Arial" w:hAnsi="Arial"/>
+          <w:b/>
+          <w:bCs/>
+          <w:sz w:val="20"/>
+          <w:szCs w:val="20"/>
+        </w:rPr>
+        <w:t xml:space="preserve">toluen (CAS: 108-88-3):</w:t>
+      </w:r>
+    </w:p>
+    <w:p>
+      <w:pPr>
+        <w:spacing w:after="80"/>
+      </w:pPr>
+      <w:r>
+        <w:rPr>
+          <w:rFonts w:ascii="Arial" w:cs="Arial" w:eastAsia="Arial" w:hAnsi="Arial"/>
+          <w:sz w:val="20"/>
+          <w:szCs w:val="20"/>
+        </w:rPr>
+        <w:t xml:space="preserve">LD50 (na skórę): &gt; 5000 mg/kg mc. (królik)</w:t>
+      </w:r>
+    </w:p>
+    <w:p>
+      <w:pPr>
+        <w:spacing w:after="80"/>
+      </w:pPr>
+      <w:r>
+        <w:rPr>
+          <w:rFonts w:ascii="Arial" w:cs="Arial" w:eastAsia="Arial" w:hAnsi="Arial"/>
+          <w:sz w:val="20"/>
+          <w:szCs w:val="20"/>
+        </w:rPr>
+        <w:t xml:space="preserve">LD50 (droga pokarmowa / doustnie): &gt; 5000 mg/kg mc. (szczur)</w:t>
+      </w:r>
+    </w:p>
+    <w:p>
+      <w:pPr>
+        <w:spacing w:after="80"/>
+      </w:pPr>
+      <w:r>
+        <w:rPr>
+          <w:rFonts w:ascii="Arial" w:cs="Arial" w:eastAsia="Arial" w:hAnsi="Arial"/>
+          <w:sz w:val="20"/>
+          <w:szCs w:val="20"/>
+        </w:rPr>
+        <w:t xml:space="preserve">LC50 (drogi oddechowe, pary): 100 ppm (człowiek)</w:t>
       </w:r>
     </w:p>
     <w:p>
@@ -5911,7 +5786,7 @@
           <w:sz w:val="20"/>
           <w:szCs w:val="20"/>
         </w:rPr>
-        <w:t xml:space="preserve">W oparciu o dostępne dane, kryteria klasyfikacji nie są spełnione.</w:t>
+        <w:t xml:space="preserve">Nie spełnia kryteriów klasyfikacji dla tej klasy zagrożenia.</w:t>
       </w:r>
     </w:p>
     <w:p>
@@ -5937,7 +5812,7 @@
           <w:sz w:val="20"/>
           <w:szCs w:val="20"/>
         </w:rPr>
-        <w:t xml:space="preserve">Działa drażniąco na oczy (produkt zaklasyfikowany do kategorii Eye Irrit. 2, H319 z uwagi na stężenie etanolu ≥ 50%).</w:t>
+        <w:t xml:space="preserve">Działa drażniąco na oczy.</w:t>
       </w:r>
     </w:p>
     <w:p>
@@ -5963,7 +5838,20 @@
           <w:sz w:val="20"/>
           <w:szCs w:val="20"/>
         </w:rPr>
-        <w:t xml:space="preserve">Może powodować wystąpienie reakcji alergicznej. Zawiera kumarynę (stężenie kumaryny 0,4–0,45 % nakazuje uzupełniające oznakowanie zwrotem EUH208, nie powodując pełnej klasyfikacji mieszaniny jako Skin Sens. 1).</w:t>
+        <w:t xml:space="preserve">Może powodować wystąpienie reakcji alergicznej.</w:t>
+      </w:r>
+    </w:p>
+    <w:p>
+      <w:pPr>
+        <w:spacing w:after="80"/>
+      </w:pPr>
+      <w:r>
+        <w:rPr>
+          <w:rFonts w:ascii="Arial" w:cs="Arial" w:eastAsia="Arial" w:hAnsi="Arial"/>
+          <w:sz w:val="20"/>
+          <w:szCs w:val="20"/>
+        </w:rPr>
+        <w:t xml:space="preserve">Zawiera: kumarynę (2H-chromen-2-on).</w:t>
       </w:r>
     </w:p>
     <w:p>
@@ -5989,7 +5877,7 @@
           <w:sz w:val="20"/>
           <w:szCs w:val="20"/>
         </w:rPr>
-        <w:t xml:space="preserve">W oparciu o dostępne dane, kryteria klasyfikacji nie są spełnione.</w:t>
+        <w:t xml:space="preserve">Nie spełnia kryteriów klasyfikacji dla tej klasy zagrożenia.</w:t>
       </w:r>
     </w:p>
     <w:p>
@@ -6015,20 +5903,20 @@
           <w:sz w:val="20"/>
           <w:szCs w:val="20"/>
         </w:rPr>
-        <w:t xml:space="preserve">W oparciu o dostępne dane, kryteria klasyfikacji nie są spełnione.</w:t>
-      </w:r>
-    </w:p>
-    <w:p>
-      <w:pPr>
-        <w:spacing w:after="80"/>
-      </w:pPr>
-      <w:r>
-        <w:rPr>
-          <w:rFonts w:ascii="Arial" w:cs="Arial" w:eastAsia="Arial" w:hAnsi="Arial"/>
-          <w:sz w:val="20"/>
-          <w:szCs w:val="20"/>
-        </w:rPr>
-        <w:t xml:space="preserve">Toluen został zaklasyfikowany przez Międzynarodową Agencję Badań nad Rakiem (IARC) do Grupy 3 (brak możliwości zaklasyfikowania jako rakotwórczy dla ludzi - IARC, 1999). Amerykańska Agencja Ochrony Środowiska (EPA) stwierdza, że dane są niewystarczające do oceny potencjału rakotwórczego.</w:t>
+        <w:t xml:space="preserve">Nie spełnia kryteriów klasyfikacji dla tej klasy zagrożenia.</w:t>
+      </w:r>
+    </w:p>
+    <w:p>
+      <w:pPr>
+        <w:spacing w:after="80"/>
+      </w:pPr>
+      <w:r>
+        <w:rPr>
+          <w:rFonts w:ascii="Arial" w:cs="Arial" w:eastAsia="Arial" w:hAnsi="Arial"/>
+          <w:sz w:val="20"/>
+          <w:szCs w:val="20"/>
+        </w:rPr>
+        <w:t xml:space="preserve">Toluen: Zaklasyfikowany do Grupy 3 (nie może być sklasyfikowany pod względem rakotwórczości dla ludzi) przez Międzynarodową Agencję Badań nad Rakiem (IARC) - (IARC, 1999). Amerykańska Agencja Ochrony Środowiska (EPA) stwierdza, że „dane są niewystarczające do oceny potencjału rakotwórczego”.</w:t>
       </w:r>
     </w:p>
     <w:p>
@@ -6054,59 +5942,59 @@
           <w:sz w:val="20"/>
           <w:szCs w:val="20"/>
         </w:rPr>
-        <w:t xml:space="preserve">W oparciu o dostępne dane, kryteria klasyfikacji nie są spełnione (składniki o działaniu reprotoksycznym występują poniżej stężeń nakazujących klasyfikację mieszaniny).</w:t>
-      </w:r>
-    </w:p>
-    <w:p>
-      <w:pPr>
-        <w:spacing w:after="80"/>
-      </w:pPr>
-      <w:r>
-        <w:rPr>
-          <w:rFonts w:ascii="Arial" w:cs="Arial" w:eastAsia="Arial" w:hAnsi="Arial"/>
-          <w:sz w:val="20"/>
-          <w:szCs w:val="20"/>
-        </w:rPr>
-        <w:t xml:space="preserve">Działanie toksyczne na narządy docelowe – narażenie jednorazowe (STOT SE):</w:t>
-      </w:r>
-    </w:p>
-    <w:p>
-      <w:pPr>
-        <w:spacing w:after="80"/>
-      </w:pPr>
-      <w:r>
-        <w:rPr>
-          <w:rFonts w:ascii="Arial" w:cs="Arial" w:eastAsia="Arial" w:hAnsi="Arial"/>
-          <w:sz w:val="20"/>
-          <w:szCs w:val="20"/>
-        </w:rPr>
-        <w:t xml:space="preserve">W oparciu o dostępne dane, kryteria klasyfikacji nie są spełnione.</w:t>
-      </w:r>
-    </w:p>
-    <w:p>
-      <w:pPr>
-        <w:spacing w:after="80"/>
-      </w:pPr>
-      <w:r>
-        <w:rPr>
-          <w:rFonts w:ascii="Arial" w:cs="Arial" w:eastAsia="Arial" w:hAnsi="Arial"/>
-          <w:sz w:val="20"/>
-          <w:szCs w:val="20"/>
-        </w:rPr>
-        <w:t xml:space="preserve">Działanie toksyczne na narządy docelowe – narażenie powtarzane (STOT RE):</w:t>
-      </w:r>
-    </w:p>
-    <w:p>
-      <w:pPr>
-        <w:spacing w:after="80"/>
-      </w:pPr>
-      <w:r>
-        <w:rPr>
-          <w:rFonts w:ascii="Arial" w:cs="Arial" w:eastAsia="Arial" w:hAnsi="Arial"/>
-          <w:sz w:val="20"/>
-          <w:szCs w:val="20"/>
-        </w:rPr>
-        <w:t xml:space="preserve">W oparciu o dostępne dane, kryteria klasyfikacji nie są spełnione.</w:t>
+        <w:t xml:space="preserve">Nie spełnia kryteriów klasyfikacji dla tej klasy zagrożenia.</w:t>
+      </w:r>
+    </w:p>
+    <w:p>
+      <w:pPr>
+        <w:spacing w:after="80"/>
+      </w:pPr>
+      <w:r>
+        <w:rPr>
+          <w:rFonts w:ascii="Arial" w:cs="Arial" w:eastAsia="Arial" w:hAnsi="Arial"/>
+          <w:sz w:val="20"/>
+          <w:szCs w:val="20"/>
+        </w:rPr>
+        <w:t xml:space="preserve">Działanie toksyczne na narządy docelowe – narażenie jednorazowe:</w:t>
+      </w:r>
+    </w:p>
+    <w:p>
+      <w:pPr>
+        <w:spacing w:after="80"/>
+      </w:pPr>
+      <w:r>
+        <w:rPr>
+          <w:rFonts w:ascii="Arial" w:cs="Arial" w:eastAsia="Arial" w:hAnsi="Arial"/>
+          <w:sz w:val="20"/>
+          <w:szCs w:val="20"/>
+        </w:rPr>
+        <w:t xml:space="preserve">Nie spełnia kryteriów klasyfikacji dla tej klasy zagrożenia.</w:t>
+      </w:r>
+    </w:p>
+    <w:p>
+      <w:pPr>
+        <w:spacing w:after="80"/>
+      </w:pPr>
+      <w:r>
+        <w:rPr>
+          <w:rFonts w:ascii="Arial" w:cs="Arial" w:eastAsia="Arial" w:hAnsi="Arial"/>
+          <w:sz w:val="20"/>
+          <w:szCs w:val="20"/>
+        </w:rPr>
+        <w:t xml:space="preserve">Działanie toksyczne na narządy docelowe – narażenie powtarzane:</w:t>
+      </w:r>
+    </w:p>
+    <w:p>
+      <w:pPr>
+        <w:spacing w:after="80"/>
+      </w:pPr>
+      <w:r>
+        <w:rPr>
+          <w:rFonts w:ascii="Arial" w:cs="Arial" w:eastAsia="Arial" w:hAnsi="Arial"/>
+          <w:sz w:val="20"/>
+          <w:szCs w:val="20"/>
+        </w:rPr>
+        <w:t xml:space="preserve">Nie spełnia kryteriów klasyfikacji dla tej klasy zagrożenia.</w:t>
       </w:r>
     </w:p>
     <w:p>
@@ -6132,7 +6020,7 @@
           <w:sz w:val="20"/>
           <w:szCs w:val="20"/>
         </w:rPr>
-        <w:t xml:space="preserve">W oparciu o dostępne dane, kryteria klasyfikacji nie są spełnione.</w:t>
+        <w:t xml:space="preserve">Nie spełnia kryteriów klasyfikacji dla tej klasy zagrożenia.</w:t>
       </w:r>
     </w:p>
     <w:p>
@@ -6152,28 +6040,58 @@
     </w:p>
     <w:p>
       <w:pPr>
-        <w:spacing w:after="80"/>
-      </w:pPr>
-      <w:r>
-        <w:rPr>
-          <w:rFonts w:ascii="Arial" w:cs="Arial" w:eastAsia="Arial" w:hAnsi="Arial"/>
-          <w:sz w:val="20"/>
-          <w:szCs w:val="20"/>
-        </w:rPr>
-        <w:t xml:space="preserve">Właściwości zaburzające funkcjonowanie układu hormonalnego:</w:t>
-      </w:r>
-    </w:p>
-    <w:p>
-      <w:pPr>
-        <w:spacing w:after="80"/>
-      </w:pPr>
-      <w:r>
-        <w:rPr>
-          <w:rFonts w:ascii="Arial" w:cs="Arial" w:eastAsia="Arial" w:hAnsi="Arial"/>
-          <w:sz w:val="20"/>
-          <w:szCs w:val="20"/>
-        </w:rPr>
-        <w:t xml:space="preserve">Na podstawie dostępnych danych mieszanina nie zawiera substancji wpisanych do unijnych wykazów ustanowionych zgodnie z art. 59 ust. 1 rozporządzenia REACH ani substancji zidentyfikowanych jako zaburzające gospodarkę hormonalną u ludzi w stężeniu ≥ 0,1 % wag.</w:t>
+        <w:spacing w:after="100" w:before="200"/>
+      </w:pPr>
+      <w:r>
+        <w:rPr>
+          <w:rFonts w:ascii="Arial" w:cs="Arial" w:eastAsia="Arial" w:hAnsi="Arial"/>
+          <w:b/>
+          <w:bCs/>
+          <w:sz w:val="20"/>
+          <w:szCs w:val="20"/>
+        </w:rPr>
+        <w:t xml:space="preserve">11.2.1. Właściwości zaburzające funkcjonowanie układu hormonalnego:</w:t>
+      </w:r>
+    </w:p>
+    <w:p>
+      <w:pPr>
+        <w:spacing w:after="80"/>
+      </w:pPr>
+      <w:r>
+        <w:rPr>
+          <w:rFonts w:ascii="Arial" w:cs="Arial" w:eastAsia="Arial" w:hAnsi="Arial"/>
+          <w:sz w:val="20"/>
+          <w:szCs w:val="20"/>
+        </w:rPr>
+        <w:t xml:space="preserve">Na podstawie dostępnych danych produkt nie zawiera substancji wymienionych w głównych europejskich wykazach potencjalnych lub podejrzewanych substancji zaburzających funkcjonowanie układu hormonalnego pod kątem wpływu na zdrowie ludzi w stężeniu ≥ 0,1%.</w:t>
+      </w:r>
+    </w:p>
+    <w:p>
+      <w:pPr>
+        <w:spacing w:after="100" w:before="200"/>
+      </w:pPr>
+      <w:r>
+        <w:rPr>
+          <w:rFonts w:ascii="Arial" w:cs="Arial" w:eastAsia="Arial" w:hAnsi="Arial"/>
+          <w:b/>
+          <w:bCs/>
+          <w:sz w:val="20"/>
+          <w:szCs w:val="20"/>
+        </w:rPr>
+        <w:t xml:space="preserve">11.2.2. Inne informacje:</w:t>
+      </w:r>
+    </w:p>
+    <w:p>
+      <w:pPr>
+        <w:spacing w:after="80"/>
+      </w:pPr>
+      <w:r>
+        <w:rPr>
+          <w:rFonts w:ascii="Arial" w:cs="Arial" w:eastAsia="Arial" w:hAnsi="Arial"/>
+          <w:sz w:val="20"/>
+          <w:szCs w:val="20"/>
+        </w:rPr>
+        <w:t xml:space="preserve">Brak innych znanych zagrożeń.</w:t>
       </w:r>
     </w:p>
     <w:p>

</xml_diff>

<commit_message>
feat(sds): eliminate ADR label regression in 14.3, enforce viscosity units, NDS/DNEL fidelity and tabular uses (ADR-078)
</commit_message>
<xml_diff>
--- a/docs/SDS/Karta_Charakterystyki_8034055535448_SDS_ORCHIDEA_E_VANIGLIA (12).docx
+++ b/docs/SDS/Karta_Charakterystyki_8034055535448_SDS_ORCHIDEA_E_VANIGLIA (12).docx
@@ -83,7 +83,7 @@
                 <w:sz w:val="18"/>
                 <w:szCs w:val="18"/>
               </w:rPr>
-              <w:t xml:space="preserve">15.09.2026</w:t>
+              <w:t xml:space="preserve">16.09.2026</w:t>
             </w:r>
           </w:p>
           <w:p>
@@ -823,17 +823,15 @@
     </w:p>
     <w:p>
       <w:pPr>
-        <w:spacing w:after="80" w:before="150"/>
-      </w:pPr>
-      <w:r>
-        <w:rPr>
-          <w:rFonts w:ascii="Arial" w:cs="Arial" w:eastAsia="Arial" w:hAnsi="Arial"/>
-          <w:b/>
-          <w:bCs/>
-          <w:sz w:val="20"/>
-          <w:szCs w:val="20"/>
-        </w:rPr>
-        <w:t xml:space="preserve">Nazwy niebezpiecznych substancji wymienione na etykiecie</w:t>
+        <w:spacing w:after="80"/>
+      </w:pPr>
+      <w:r>
+        <w:rPr>
+          <w:rFonts w:ascii="Arial" w:cs="Arial" w:eastAsia="Arial" w:hAnsi="Arial"/>
+          <w:sz w:val="20"/>
+          <w:szCs w:val="20"/>
+        </w:rPr>
+        <w:t xml:space="preserve">Nazwy niebezpiecznych substancji wymienione na etykiecie:</w:t>
       </w:r>
     </w:p>
     <w:p>
@@ -851,17 +849,15 @@
     </w:p>
     <w:p>
       <w:pPr>
-        <w:spacing w:after="80" w:before="150"/>
-      </w:pPr>
-      <w:r>
-        <w:rPr>
-          <w:rFonts w:ascii="Arial" w:cs="Arial" w:eastAsia="Arial" w:hAnsi="Arial"/>
-          <w:b/>
-          <w:bCs/>
-          <w:sz w:val="20"/>
-          <w:szCs w:val="20"/>
-        </w:rPr>
-        <w:t xml:space="preserve">Zwroty wskazujące rodzaj zagrożenia</w:t>
+        <w:spacing w:after="80"/>
+      </w:pPr>
+      <w:r>
+        <w:rPr>
+          <w:rFonts w:ascii="Arial" w:cs="Arial" w:eastAsia="Arial" w:hAnsi="Arial"/>
+          <w:sz w:val="20"/>
+          <w:szCs w:val="20"/>
+        </w:rPr>
+        <w:t xml:space="preserve">Zwroty wskazujące rodzaj zagrożenia:</w:t>
       </w:r>
     </w:p>
     <w:p>
@@ -892,17 +888,15 @@
     </w:p>
     <w:p>
       <w:pPr>
-        <w:spacing w:after="80" w:before="150"/>
-      </w:pPr>
-      <w:r>
-        <w:rPr>
-          <w:rFonts w:ascii="Arial" w:cs="Arial" w:eastAsia="Arial" w:hAnsi="Arial"/>
-          <w:b/>
-          <w:bCs/>
-          <w:sz w:val="20"/>
-          <w:szCs w:val="20"/>
-        </w:rPr>
-        <w:t xml:space="preserve">Zwroty wskazujące środki ostrożności</w:t>
+        <w:spacing w:after="80"/>
+      </w:pPr>
+      <w:r>
+        <w:rPr>
+          <w:rFonts w:ascii="Arial" w:cs="Arial" w:eastAsia="Arial" w:hAnsi="Arial"/>
+          <w:sz w:val="20"/>
+          <w:szCs w:val="20"/>
+        </w:rPr>
+        <w:t xml:space="preserve">Zwroty wskazujące środki ostrożności:</w:t>
       </w:r>
     </w:p>
     <w:p>
@@ -985,17 +979,15 @@
     </w:p>
     <w:p>
       <w:pPr>
-        <w:spacing w:after="80" w:before="150"/>
-      </w:pPr>
-      <w:r>
-        <w:rPr>
-          <w:rFonts w:ascii="Arial" w:cs="Arial" w:eastAsia="Arial" w:hAnsi="Arial"/>
-          <w:b/>
-          <w:bCs/>
-          <w:sz w:val="20"/>
-          <w:szCs w:val="20"/>
-        </w:rPr>
-        <w:t xml:space="preserve">Informacje uzupełniające</w:t>
+        <w:spacing w:after="80"/>
+      </w:pPr>
+      <w:r>
+        <w:rPr>
+          <w:rFonts w:ascii="Arial" w:cs="Arial" w:eastAsia="Arial" w:hAnsi="Arial"/>
+          <w:sz w:val="20"/>
+          <w:szCs w:val="20"/>
+        </w:rPr>
+        <w:t xml:space="preserve">Informacje uzupełniające:</w:t>
       </w:r>
     </w:p>
     <w:p>
@@ -2447,7 +2439,7 @@
           <w:sz w:val="20"/>
           <w:szCs w:val="20"/>
         </w:rPr>
-        <w:t xml:space="preserve">2,6-Di-tert-butylo-4-metylofenol [CAS: 128-37-0]:</w:t>
+        <w:t xml:space="preserve">2,6-di-tert-butylo-4-metylofenol (BHT) [CAS: 128-37-0]:</w:t>
       </w:r>
     </w:p>
     <w:p>
@@ -2470,7 +2462,30 @@
           <w:sz w:val="20"/>
           <w:szCs w:val="20"/>
         </w:rPr>
-        <w:t xml:space="preserve"> 10 mg/m³</w:t>
+        <w:t xml:space="preserve"> 10 mg/m³ (frakcja wdychalna)</w:t>
+      </w:r>
+    </w:p>
+    <w:p>
+      <w:pPr>
+        <w:spacing w:after="60" w:before="60"/>
+      </w:pPr>
+      <w:r>
+        <w:rPr>
+          <w:rFonts w:ascii="Arial" w:cs="Arial" w:eastAsia="Arial" w:hAnsi="Arial"/>
+          <w:b/>
+          <w:bCs/>
+          <w:sz w:val="20"/>
+          <w:szCs w:val="20"/>
+        </w:rPr>
+        <w:t xml:space="preserve">- NDSCh:</w:t>
+      </w:r>
+      <w:r>
+        <w:rPr>
+          <w:rFonts w:ascii="Arial" w:cs="Arial" w:eastAsia="Arial" w:hAnsi="Arial"/>
+          <w:sz w:val="20"/>
+          <w:szCs w:val="20"/>
+        </w:rPr>
+        <w:t xml:space="preserve"> nie ustalono</w:t>
       </w:r>
     </w:p>
     <w:p>
@@ -2718,15 +2733,15 @@
           <w:sz w:val="20"/>
           <w:szCs w:val="20"/>
         </w:rPr>
-        <w:t xml:space="preserve">* Pracownicy (skutki przewlekłe układowe):</w:t>
-      </w:r>
-      <w:r>
-        <w:rPr>
-          <w:rFonts w:ascii="Arial" w:cs="Arial" w:eastAsia="Arial" w:hAnsi="Arial"/>
-          <w:sz w:val="20"/>
-          <w:szCs w:val="20"/>
-        </w:rPr>
-        <w:t xml:space="preserve"> 950 mg/m³</w:t>
+        <w:t xml:space="preserve">* Pracownicy:</w:t>
+      </w:r>
+      <w:r>
+        <w:rPr>
+          <w:rFonts w:ascii="Arial" w:cs="Arial" w:eastAsia="Arial" w:hAnsi="Arial"/>
+          <w:sz w:val="20"/>
+          <w:szCs w:val="20"/>
+        </w:rPr>
+        <w:t xml:space="preserve"> skutki przewlekłe układowe: 950 mg/m³; skutki ostre miejscowe: 1900 mg/m³</w:t>
       </w:r>
     </w:p>
     <w:p>
@@ -4989,7 +5004,7 @@
           <w:sz w:val="20"/>
           <w:szCs w:val="20"/>
         </w:rPr>
-        <w:t xml:space="preserve"> 1,5</w:t>
+        <w:t xml:space="preserve"> 1,5 mm²/s</w:t>
       </w:r>
     </w:p>
     <w:p>
@@ -5272,32 +5287,6 @@
     </w:p>
     <w:p>
       <w:pPr>
-        <w:spacing w:after="80"/>
-      </w:pPr>
-      <w:r>
-        <w:rPr>
-          <w:rFonts w:ascii="Arial" w:cs="Arial" w:eastAsia="Arial" w:hAnsi="Arial"/>
-          <w:sz w:val="20"/>
-          <w:szCs w:val="20"/>
-        </w:rPr>
-        <w:t xml:space="preserve">W przypadku braku danych doświadczalnych dla samego produktu, zagrożenia dla zdrowia ocenia się zgodnie z właściwościami zawartych w nim substancji, przy użyciu kryteriów określonych w odpowiednich przepisach dotyczących klasyfikacji.</w:t>
-      </w:r>
-    </w:p>
-    <w:p>
-      <w:pPr>
-        <w:spacing w:after="80"/>
-      </w:pPr>
-      <w:r>
-        <w:rPr>
-          <w:rFonts w:ascii="Arial" w:cs="Arial" w:eastAsia="Arial" w:hAnsi="Arial"/>
-          <w:sz w:val="20"/>
-          <w:szCs w:val="20"/>
-        </w:rPr>
-        <w:t xml:space="preserve">Dlatego też należy wziąć pod uwagę stężenia poszczególnych substancji niebezpiecznych wskazanych w sekcji 3, aby ocenić skutki toksykologiczne narażenia na produkt.</w:t>
-      </w:r>
-    </w:p>
-    <w:p>
-      <w:pPr>
         <w:spacing w:after="100" w:before="200"/>
       </w:pPr>
       <w:r>
@@ -5321,6 +5310,32 @@
           <w:sz w:val="20"/>
           <w:szCs w:val="20"/>
         </w:rPr>
+        <w:t xml:space="preserve">W przypadku braku danych doświadczalnych dla samego produktu, zagrożenia dla zdrowia ocenia się na podstawie właściwości substancji w nim zawartych, stosując kryteria określone w odpowiednich przepisach dotyczących klasyfikacji.</w:t>
+      </w:r>
+    </w:p>
+    <w:p>
+      <w:pPr>
+        <w:spacing w:after="80"/>
+      </w:pPr>
+      <w:r>
+        <w:rPr>
+          <w:rFonts w:ascii="Arial" w:cs="Arial" w:eastAsia="Arial" w:hAnsi="Arial"/>
+          <w:sz w:val="20"/>
+          <w:szCs w:val="20"/>
+        </w:rPr>
+        <w:t xml:space="preserve">W związku z tym, w celu oceny skutków toksykologicznych narażenia na produkt, konieczne jest uwzględnienie stężeń poszczególnych substancji niebezpiecznych wskazanych w sekcji 3.</w:t>
+      </w:r>
+    </w:p>
+    <w:p>
+      <w:pPr>
+        <w:spacing w:after="80"/>
+      </w:pPr>
+      <w:r>
+        <w:rPr>
+          <w:rFonts w:ascii="Arial" w:cs="Arial" w:eastAsia="Arial" w:hAnsi="Arial"/>
+          <w:sz w:val="20"/>
+          <w:szCs w:val="20"/>
+        </w:rPr>
         <w:t xml:space="preserve">Metabolizm, toksykokinetyka, mechanizm działania i inne informacje:</w:t>
       </w:r>
     </w:p>
@@ -5334,7 +5349,7 @@
           <w:sz w:val="20"/>
           <w:szCs w:val="20"/>
         </w:rPr>
-        <w:t xml:space="preserve">Brak dostępnych danych.</w:t>
+        <w:t xml:space="preserve">Brak dostępnych informacji.</w:t>
       </w:r>
     </w:p>
     <w:p>
@@ -5373,33 +5388,33 @@
           <w:sz w:val="20"/>
           <w:szCs w:val="20"/>
         </w:rPr>
-        <w:t xml:space="preserve">PRACOWNICY: drogi oddechowe (inhalacyjnie); kontakt ze skórą.</w:t>
-      </w:r>
-    </w:p>
-    <w:p>
-      <w:pPr>
-        <w:spacing w:after="80"/>
-      </w:pPr>
-      <w:r>
-        <w:rPr>
-          <w:rFonts w:ascii="Arial" w:cs="Arial" w:eastAsia="Arial" w:hAnsi="Arial"/>
-          <w:sz w:val="20"/>
-          <w:szCs w:val="20"/>
-        </w:rPr>
-        <w:t xml:space="preserve">LUDNOŚĆ: spożycie skażonej żywności lub wody; drogi oddechowe (inhalacyjnie) z otaczającego powietrza; kontakt ze skórą wyrobów zawierających substancję.</w:t>
-      </w:r>
-    </w:p>
-    <w:p>
-      <w:pPr>
-        <w:spacing w:after="80"/>
-      </w:pPr>
-      <w:r>
-        <w:rPr>
-          <w:rFonts w:ascii="Arial" w:cs="Arial" w:eastAsia="Arial" w:hAnsi="Arial"/>
-          <w:sz w:val="20"/>
-          <w:szCs w:val="20"/>
-        </w:rPr>
-        <w:t xml:space="preserve">Skutki opóźnione i bezpośrednie oraz skutki przewlekłe spowodowane krótkotrwałym i długotrwałym narażeniem:</w:t>
+        <w:t xml:space="preserve">PRACOWNICY: inhalacyjnie (drogi oddechowe); kontakt ze skórą.</w:t>
+      </w:r>
+    </w:p>
+    <w:p>
+      <w:pPr>
+        <w:spacing w:after="80"/>
+      </w:pPr>
+      <w:r>
+        <w:rPr>
+          <w:rFonts w:ascii="Arial" w:cs="Arial" w:eastAsia="Arial" w:hAnsi="Arial"/>
+          <w:sz w:val="20"/>
+          <w:szCs w:val="20"/>
+        </w:rPr>
+        <w:t xml:space="preserve">KONSUMENCI: spożycie skażonej żywności lub wody; inhalacyjnie (wdychanie powietrza otoczenia); kontakt ze skórą z produktami zawierającymi substancję.</w:t>
+      </w:r>
+    </w:p>
+    <w:p>
+      <w:pPr>
+        <w:spacing w:after="80"/>
+      </w:pPr>
+      <w:r>
+        <w:rPr>
+          <w:rFonts w:ascii="Arial" w:cs="Arial" w:eastAsia="Arial" w:hAnsi="Arial"/>
+          <w:sz w:val="20"/>
+          <w:szCs w:val="20"/>
+        </w:rPr>
+        <w:t xml:space="preserve">Opóźnione, bezpośrednie oraz przewlekłe skutki krótko- i długotrwałego narażenia:</w:t>
       </w:r>
     </w:p>
     <w:p>
@@ -5425,7 +5440,7 @@
           <w:sz w:val="20"/>
           <w:szCs w:val="20"/>
         </w:rPr>
-        <w:t xml:space="preserve">Działanie toksyczne na ośrodkowy i obwodowy układ nerwowy z encefalopatią i polineuropatią; działa drażniąco na skórę, spojówki, rogówkę i drogi oddechowe.</w:t>
+        <w:t xml:space="preserve">Działanie toksyczne na ośrodkowy i obwodowy układ nerwowy z encefalopatią i polineuropatią; działa drażniąco na skórę, spojówki, rogówkę i układ oddechowy.</w:t>
       </w:r>
     </w:p>
     <w:p>
@@ -5464,7 +5479,7 @@
           <w:sz w:val="20"/>
           <w:szCs w:val="20"/>
         </w:rPr>
-        <w:t xml:space="preserve">Niektóre leki i inne produkty przemysłowe mogą zakłócać metabolizm toluenu.</w:t>
+        <w:t xml:space="preserve">Niektóre leki i inne substancje przemysłowe mogą zakłócać metabolizm toluenu.</w:t>
       </w:r>
     </w:p>
     <w:p>
@@ -5490,277 +5505,410 @@
           <w:sz w:val="20"/>
           <w:szCs w:val="20"/>
         </w:rPr>
-        <w:t xml:space="preserve">ATE (drogi oddechowe - inhalacyjnie) mieszaniny: Nie sklasyfikowano (brak istotnego składnika)</w:t>
-      </w:r>
-    </w:p>
-    <w:p>
-      <w:pPr>
-        <w:spacing w:after="80"/>
-      </w:pPr>
-      <w:r>
-        <w:rPr>
-          <w:rFonts w:ascii="Arial" w:cs="Arial" w:eastAsia="Arial" w:hAnsi="Arial"/>
-          <w:sz w:val="20"/>
-          <w:szCs w:val="20"/>
-        </w:rPr>
-        <w:t xml:space="preserve">ATE (droga pokarmowa - doustnie) mieszaniny: Nie sklasyfikowano (brak istotnego składnika)</w:t>
-      </w:r>
-    </w:p>
-    <w:p>
-      <w:pPr>
-        <w:spacing w:after="80"/>
-      </w:pPr>
-      <w:r>
-        <w:rPr>
-          <w:rFonts w:ascii="Arial" w:cs="Arial" w:eastAsia="Arial" w:hAnsi="Arial"/>
-          <w:sz w:val="20"/>
-          <w:szCs w:val="20"/>
-        </w:rPr>
-        <w:t xml:space="preserve">ATE (na skórę) mieszaniny: Nie sklasyfikowano (brak istotnego składnika)</w:t>
-      </w:r>
-    </w:p>
-    <w:p>
-      <w:pPr>
-        <w:spacing w:after="80" w:before="150"/>
-      </w:pPr>
-      <w:r>
-        <w:rPr>
-          <w:rFonts w:ascii="Arial" w:cs="Arial" w:eastAsia="Arial" w:hAnsi="Arial"/>
-          <w:b/>
-          <w:bCs/>
-          <w:sz w:val="20"/>
-          <w:szCs w:val="20"/>
-        </w:rPr>
-        <w:t xml:space="preserve">etanol (CAS: 64-17-5):</w:t>
-      </w:r>
-    </w:p>
-    <w:p>
-      <w:pPr>
-        <w:spacing w:after="80"/>
-      </w:pPr>
-      <w:r>
-        <w:rPr>
-          <w:rFonts w:ascii="Arial" w:cs="Arial" w:eastAsia="Arial" w:hAnsi="Arial"/>
-          <w:sz w:val="20"/>
-          <w:szCs w:val="20"/>
-        </w:rPr>
-        <w:t xml:space="preserve">LD50 (droga pokarmowa / doustnie): &gt; 5000 mg/kg (szczur)</w:t>
-      </w:r>
-    </w:p>
-    <w:p>
-      <w:pPr>
-        <w:spacing w:after="80"/>
-      </w:pPr>
-      <w:r>
-        <w:rPr>
-          <w:rFonts w:ascii="Arial" w:cs="Arial" w:eastAsia="Arial" w:hAnsi="Arial"/>
-          <w:sz w:val="20"/>
-          <w:szCs w:val="20"/>
-        </w:rPr>
-        <w:t xml:space="preserve">LC50 (drogi oddechowe, pary): &gt; 50 mg/l/4h (szczur)</w:t>
-      </w:r>
-    </w:p>
-    <w:p>
-      <w:pPr>
-        <w:spacing w:after="80" w:before="150"/>
-      </w:pPr>
-      <w:r>
-        <w:rPr>
-          <w:rFonts w:ascii="Arial" w:cs="Arial" w:eastAsia="Arial" w:hAnsi="Arial"/>
-          <w:b/>
-          <w:bCs/>
-          <w:sz w:val="20"/>
-          <w:szCs w:val="20"/>
-        </w:rPr>
-        <w:t xml:space="preserve">aldehyd anyżowy (4-metoksybenzaldehyd) (CAS: 123-11-5):</w:t>
-      </w:r>
-    </w:p>
-    <w:p>
-      <w:pPr>
-        <w:spacing w:after="80"/>
-      </w:pPr>
-      <w:r>
-        <w:rPr>
-          <w:rFonts w:ascii="Arial" w:cs="Arial" w:eastAsia="Arial" w:hAnsi="Arial"/>
-          <w:sz w:val="20"/>
-          <w:szCs w:val="20"/>
-        </w:rPr>
-        <w:t xml:space="preserve">LD50 (na skórę): &gt; 5000 mg/kg (królik)</w:t>
-      </w:r>
-    </w:p>
-    <w:p>
-      <w:pPr>
-        <w:spacing w:after="80"/>
-      </w:pPr>
-      <w:r>
-        <w:rPr>
-          <w:rFonts w:ascii="Arial" w:cs="Arial" w:eastAsia="Arial" w:hAnsi="Arial"/>
-          <w:sz w:val="20"/>
-          <w:szCs w:val="20"/>
-        </w:rPr>
-        <w:t xml:space="preserve">LD50 (droga pokarmowa / doustnie): 3210 mg/kg (szczur)</w:t>
-      </w:r>
-    </w:p>
-    <w:p>
-      <w:pPr>
-        <w:spacing w:after="80"/>
-      </w:pPr>
-      <w:r>
-        <w:rPr>
-          <w:rFonts w:ascii="Arial" w:cs="Arial" w:eastAsia="Arial" w:hAnsi="Arial"/>
-          <w:sz w:val="20"/>
-          <w:szCs w:val="20"/>
-        </w:rPr>
-        <w:t xml:space="preserve">LC50 (drogi oddechowe, pary): 0,32 mg/l/7h (szczur)</w:t>
-      </w:r>
-    </w:p>
-    <w:p>
-      <w:pPr>
-        <w:spacing w:after="80" w:before="150"/>
-      </w:pPr>
-      <w:r>
-        <w:rPr>
-          <w:rFonts w:ascii="Arial" w:cs="Arial" w:eastAsia="Arial" w:hAnsi="Arial"/>
-          <w:b/>
-          <w:bCs/>
-          <w:sz w:val="20"/>
-          <w:szCs w:val="20"/>
-        </w:rPr>
-        <w:t xml:space="preserve">kumaryna (2H-chromen-2-on) (CAS: 91-64-5):</w:t>
-      </w:r>
-    </w:p>
-    <w:p>
-      <w:pPr>
-        <w:spacing w:after="80"/>
-      </w:pPr>
-      <w:r>
-        <w:rPr>
-          <w:rFonts w:ascii="Arial" w:cs="Arial" w:eastAsia="Arial" w:hAnsi="Arial"/>
-          <w:sz w:val="20"/>
-          <w:szCs w:val="20"/>
-        </w:rPr>
-        <w:t xml:space="preserve">LD50 (na skórę): 293 mg/kg mc. (szczur)</w:t>
-      </w:r>
-    </w:p>
-    <w:p>
-      <w:pPr>
-        <w:spacing w:after="80"/>
-      </w:pPr>
-      <w:r>
-        <w:rPr>
-          <w:rFonts w:ascii="Arial" w:cs="Arial" w:eastAsia="Arial" w:hAnsi="Arial"/>
-          <w:sz w:val="20"/>
-          <w:szCs w:val="20"/>
-        </w:rPr>
-        <w:t xml:space="preserve">LD50 (droga pokarmowa / doustnie): 290 mg/kg mc. (szczur)</w:t>
-      </w:r>
-    </w:p>
-    <w:p>
-      <w:pPr>
-        <w:spacing w:after="80"/>
-      </w:pPr>
-      <w:r>
-        <w:rPr>
-          <w:rFonts w:ascii="Arial" w:cs="Arial" w:eastAsia="Arial" w:hAnsi="Arial"/>
-          <w:sz w:val="20"/>
-          <w:szCs w:val="20"/>
-        </w:rPr>
-        <w:t xml:space="preserve">LC50 (drogi oddechowe, pyły/mgły): 293 mg/kg (szczur)</w:t>
-      </w:r>
-    </w:p>
-    <w:p>
-      <w:pPr>
-        <w:spacing w:after="80" w:before="150"/>
-      </w:pPr>
-      <w:r>
-        <w:rPr>
-          <w:rFonts w:ascii="Arial" w:cs="Arial" w:eastAsia="Arial" w:hAnsi="Arial"/>
-          <w:b/>
-          <w:bCs/>
-          <w:sz w:val="20"/>
-          <w:szCs w:val="20"/>
-        </w:rPr>
-        <w:t xml:space="preserve">2,6-di-tert-butylo-4-metylofenol (BHT) (CAS: 128-37-0):</w:t>
-      </w:r>
-    </w:p>
-    <w:p>
-      <w:pPr>
-        <w:spacing w:after="80"/>
-      </w:pPr>
-      <w:r>
-        <w:rPr>
-          <w:rFonts w:ascii="Arial" w:cs="Arial" w:eastAsia="Arial" w:hAnsi="Arial"/>
-          <w:sz w:val="20"/>
-          <w:szCs w:val="20"/>
-        </w:rPr>
-        <w:t xml:space="preserve">LD50 (na skórę): &gt; 2000 mg/kg (szczur)</w:t>
-      </w:r>
-    </w:p>
-    <w:p>
-      <w:pPr>
-        <w:spacing w:after="80"/>
-      </w:pPr>
-      <w:r>
-        <w:rPr>
-          <w:rFonts w:ascii="Arial" w:cs="Arial" w:eastAsia="Arial" w:hAnsi="Arial"/>
-          <w:sz w:val="20"/>
-          <w:szCs w:val="20"/>
-        </w:rPr>
-        <w:t xml:space="preserve">LD50 (droga pokarmowa / doustnie): 2930 mg/kg (szczur)</w:t>
-      </w:r>
-    </w:p>
-    <w:p>
-      <w:pPr>
-        <w:spacing w:after="80" w:before="150"/>
-      </w:pPr>
-      <w:r>
-        <w:rPr>
-          <w:rFonts w:ascii="Arial" w:cs="Arial" w:eastAsia="Arial" w:hAnsi="Arial"/>
-          <w:b/>
-          <w:bCs/>
-          <w:sz w:val="20"/>
-          <w:szCs w:val="20"/>
-        </w:rPr>
-        <w:t xml:space="preserve">toluen (CAS: 108-88-3):</w:t>
-      </w:r>
-    </w:p>
-    <w:p>
-      <w:pPr>
-        <w:spacing w:after="80"/>
-      </w:pPr>
-      <w:r>
-        <w:rPr>
-          <w:rFonts w:ascii="Arial" w:cs="Arial" w:eastAsia="Arial" w:hAnsi="Arial"/>
-          <w:sz w:val="20"/>
-          <w:szCs w:val="20"/>
-        </w:rPr>
-        <w:t xml:space="preserve">LD50 (na skórę): &gt; 5000 mg/kg mc. (królik)</w:t>
-      </w:r>
-    </w:p>
-    <w:p>
-      <w:pPr>
-        <w:spacing w:after="80"/>
-      </w:pPr>
-      <w:r>
-        <w:rPr>
-          <w:rFonts w:ascii="Arial" w:cs="Arial" w:eastAsia="Arial" w:hAnsi="Arial"/>
-          <w:sz w:val="20"/>
-          <w:szCs w:val="20"/>
-        </w:rPr>
-        <w:t xml:space="preserve">LD50 (droga pokarmowa / doustnie): &gt; 5000 mg/kg mc. (szczur)</w:t>
-      </w:r>
-    </w:p>
-    <w:p>
-      <w:pPr>
-        <w:spacing w:after="80"/>
-      </w:pPr>
-      <w:r>
-        <w:rPr>
-          <w:rFonts w:ascii="Arial" w:cs="Arial" w:eastAsia="Arial" w:hAnsi="Arial"/>
-          <w:sz w:val="20"/>
-          <w:szCs w:val="20"/>
-        </w:rPr>
-        <w:t xml:space="preserve">LC50 (drogi oddechowe, pary): 100 ppm (człowiek)</w:t>
+        <w:t xml:space="preserve">ATE mieszaniny (drogi oddechowe / inhalacyjnie): Nie sklasyfikowano (brak istotnych składników)</w:t>
+      </w:r>
+    </w:p>
+    <w:p>
+      <w:pPr>
+        <w:spacing w:after="80"/>
+      </w:pPr>
+      <w:r>
+        <w:rPr>
+          <w:rFonts w:ascii="Arial" w:cs="Arial" w:eastAsia="Arial" w:hAnsi="Arial"/>
+          <w:sz w:val="20"/>
+          <w:szCs w:val="20"/>
+        </w:rPr>
+        <w:t xml:space="preserve">ATE mieszaniny (droga pokarmowa / doustnie): Nie sklasyfikowano (brak istotnych składników)</w:t>
+      </w:r>
+    </w:p>
+    <w:p>
+      <w:pPr>
+        <w:spacing w:after="80"/>
+      </w:pPr>
+      <w:r>
+        <w:rPr>
+          <w:rFonts w:ascii="Arial" w:cs="Arial" w:eastAsia="Arial" w:hAnsi="Arial"/>
+          <w:sz w:val="20"/>
+          <w:szCs w:val="20"/>
+        </w:rPr>
+        <w:t xml:space="preserve">ATE mieszaniny (na skórę): Nie sklasyfikowano (brak istotnych składników)</w:t>
+      </w:r>
+    </w:p>
+    <w:p>
+      <w:pPr>
+        <w:spacing w:after="80"/>
+      </w:pPr>
+      <w:r>
+        <w:rPr>
+          <w:rFonts w:ascii="Arial" w:cs="Arial" w:eastAsia="Arial" w:hAnsi="Arial"/>
+          <w:sz w:val="20"/>
+          <w:szCs w:val="20"/>
+        </w:rPr>
+        <w:t xml:space="preserve">Informacje o składnikach:</w:t>
+      </w:r>
+    </w:p>
+    <w:p>
+      <w:pPr>
+        <w:spacing w:after="80"/>
+      </w:pPr>
+      <w:r>
+        <w:rPr>
+          <w:rFonts w:ascii="Arial" w:cs="Arial" w:eastAsia="Arial" w:hAnsi="Arial"/>
+          <w:sz w:val="20"/>
+          <w:szCs w:val="20"/>
+        </w:rPr>
+        <w:t xml:space="preserve">Etanol [CAS: 64-17-5]:</w:t>
+      </w:r>
+    </w:p>
+    <w:p>
+      <w:pPr>
+        <w:spacing w:after="60" w:before="60"/>
+      </w:pPr>
+      <w:r>
+        <w:rPr>
+          <w:rFonts w:ascii="Arial" w:cs="Arial" w:eastAsia="Arial" w:hAnsi="Arial"/>
+          <w:b/>
+          <w:bCs/>
+          <w:sz w:val="20"/>
+          <w:szCs w:val="20"/>
+        </w:rPr>
+        <w:t xml:space="preserve">- LD50 (doustnie, szczur):</w:t>
+      </w:r>
+      <w:r>
+        <w:rPr>
+          <w:rFonts w:ascii="Arial" w:cs="Arial" w:eastAsia="Arial" w:hAnsi="Arial"/>
+          <w:sz w:val="20"/>
+          <w:szCs w:val="20"/>
+        </w:rPr>
+        <w:t xml:space="preserve"> &gt; 5000 mg/kg</w:t>
+      </w:r>
+    </w:p>
+    <w:p>
+      <w:pPr>
+        <w:spacing w:after="60" w:before="60"/>
+      </w:pPr>
+      <w:r>
+        <w:rPr>
+          <w:rFonts w:ascii="Arial" w:cs="Arial" w:eastAsia="Arial" w:hAnsi="Arial"/>
+          <w:b/>
+          <w:bCs/>
+          <w:sz w:val="20"/>
+          <w:szCs w:val="20"/>
+        </w:rPr>
+        <w:t xml:space="preserve">- LC50 (inhalacyjnie, pary, szczur):</w:t>
+      </w:r>
+      <w:r>
+        <w:rPr>
+          <w:rFonts w:ascii="Arial" w:cs="Arial" w:eastAsia="Arial" w:hAnsi="Arial"/>
+          <w:sz w:val="20"/>
+          <w:szCs w:val="20"/>
+        </w:rPr>
+        <w:t xml:space="preserve"> &gt; 50 mg/l/4h</w:t>
+      </w:r>
+    </w:p>
+    <w:p>
+      <w:pPr>
+        <w:spacing w:after="80"/>
+      </w:pPr>
+      <w:r>
+        <w:rPr>
+          <w:rFonts w:ascii="Arial" w:cs="Arial" w:eastAsia="Arial" w:hAnsi="Arial"/>
+          <w:sz w:val="20"/>
+          <w:szCs w:val="20"/>
+        </w:rPr>
+        <w:t xml:space="preserve">Aldehyd anyżowy [CAS: 123-11-5]:</w:t>
+      </w:r>
+    </w:p>
+    <w:p>
+      <w:pPr>
+        <w:spacing w:after="60" w:before="60"/>
+      </w:pPr>
+      <w:r>
+        <w:rPr>
+          <w:rFonts w:ascii="Arial" w:cs="Arial" w:eastAsia="Arial" w:hAnsi="Arial"/>
+          <w:b/>
+          <w:bCs/>
+          <w:sz w:val="20"/>
+          <w:szCs w:val="20"/>
+        </w:rPr>
+        <w:t xml:space="preserve">- LD50 (skóra, królik):</w:t>
+      </w:r>
+      <w:r>
+        <w:rPr>
+          <w:rFonts w:ascii="Arial" w:cs="Arial" w:eastAsia="Arial" w:hAnsi="Arial"/>
+          <w:sz w:val="20"/>
+          <w:szCs w:val="20"/>
+        </w:rPr>
+        <w:t xml:space="preserve"> &gt; 5000 mg/kg</w:t>
+      </w:r>
+    </w:p>
+    <w:p>
+      <w:pPr>
+        <w:spacing w:after="60" w:before="60"/>
+      </w:pPr>
+      <w:r>
+        <w:rPr>
+          <w:rFonts w:ascii="Arial" w:cs="Arial" w:eastAsia="Arial" w:hAnsi="Arial"/>
+          <w:b/>
+          <w:bCs/>
+          <w:sz w:val="20"/>
+          <w:szCs w:val="20"/>
+        </w:rPr>
+        <w:t xml:space="preserve">- LD50 (doustnie, szczur):</w:t>
+      </w:r>
+      <w:r>
+        <w:rPr>
+          <w:rFonts w:ascii="Arial" w:cs="Arial" w:eastAsia="Arial" w:hAnsi="Arial"/>
+          <w:sz w:val="20"/>
+          <w:szCs w:val="20"/>
+        </w:rPr>
+        <w:t xml:space="preserve"> 3210 mg/kg</w:t>
+      </w:r>
+    </w:p>
+    <w:p>
+      <w:pPr>
+        <w:spacing w:after="60" w:before="60"/>
+      </w:pPr>
+      <w:r>
+        <w:rPr>
+          <w:rFonts w:ascii="Arial" w:cs="Arial" w:eastAsia="Arial" w:hAnsi="Arial"/>
+          <w:b/>
+          <w:bCs/>
+          <w:sz w:val="20"/>
+          <w:szCs w:val="20"/>
+        </w:rPr>
+        <w:t xml:space="preserve">- LC50 (inhalacyjnie, pary, szczur):</w:t>
+      </w:r>
+      <w:r>
+        <w:rPr>
+          <w:rFonts w:ascii="Arial" w:cs="Arial" w:eastAsia="Arial" w:hAnsi="Arial"/>
+          <w:sz w:val="20"/>
+          <w:szCs w:val="20"/>
+        </w:rPr>
+        <w:t xml:space="preserve"> 0,32 mg/l/7h</w:t>
+      </w:r>
+    </w:p>
+    <w:p>
+      <w:pPr>
+        <w:spacing w:after="80"/>
+      </w:pPr>
+      <w:r>
+        <w:rPr>
+          <w:rFonts w:ascii="Arial" w:cs="Arial" w:eastAsia="Arial" w:hAnsi="Arial"/>
+          <w:sz w:val="20"/>
+          <w:szCs w:val="20"/>
+        </w:rPr>
+        <w:t xml:space="preserve">Kumaryna [CAS: 91-64-5]:</w:t>
+      </w:r>
+    </w:p>
+    <w:p>
+      <w:pPr>
+        <w:spacing w:after="60" w:before="60"/>
+      </w:pPr>
+      <w:r>
+        <w:rPr>
+          <w:rFonts w:ascii="Arial" w:cs="Arial" w:eastAsia="Arial" w:hAnsi="Arial"/>
+          <w:b/>
+          <w:bCs/>
+          <w:sz w:val="20"/>
+          <w:szCs w:val="20"/>
+        </w:rPr>
+        <w:t xml:space="preserve">- LD50 (skóra, szczur):</w:t>
+      </w:r>
+      <w:r>
+        <w:rPr>
+          <w:rFonts w:ascii="Arial" w:cs="Arial" w:eastAsia="Arial" w:hAnsi="Arial"/>
+          <w:sz w:val="20"/>
+          <w:szCs w:val="20"/>
+        </w:rPr>
+        <w:t xml:space="preserve"> 293 mg/kg mc.</w:t>
+      </w:r>
+    </w:p>
+    <w:p>
+      <w:pPr>
+        <w:spacing w:after="60" w:before="60"/>
+      </w:pPr>
+      <w:r>
+        <w:rPr>
+          <w:rFonts w:ascii="Arial" w:cs="Arial" w:eastAsia="Arial" w:hAnsi="Arial"/>
+          <w:b/>
+          <w:bCs/>
+          <w:sz w:val="20"/>
+          <w:szCs w:val="20"/>
+        </w:rPr>
+        <w:t xml:space="preserve">- LD50 (doustnie, szczur):</w:t>
+      </w:r>
+      <w:r>
+        <w:rPr>
+          <w:rFonts w:ascii="Arial" w:cs="Arial" w:eastAsia="Arial" w:hAnsi="Arial"/>
+          <w:sz w:val="20"/>
+          <w:szCs w:val="20"/>
+        </w:rPr>
+        <w:t xml:space="preserve"> 290 mg/kg mc.</w:t>
+      </w:r>
+    </w:p>
+    <w:p>
+      <w:pPr>
+        <w:spacing w:after="60" w:before="60"/>
+      </w:pPr>
+      <w:r>
+        <w:rPr>
+          <w:rFonts w:ascii="Arial" w:cs="Arial" w:eastAsia="Arial" w:hAnsi="Arial"/>
+          <w:b/>
+          <w:bCs/>
+          <w:sz w:val="20"/>
+          <w:szCs w:val="20"/>
+        </w:rPr>
+        <w:t xml:space="preserve">- LC50 (inhalacyjnie, aerozole/pyły, szczur):</w:t>
+      </w:r>
+      <w:r>
+        <w:rPr>
+          <w:rFonts w:ascii="Arial" w:cs="Arial" w:eastAsia="Arial" w:hAnsi="Arial"/>
+          <w:sz w:val="20"/>
+          <w:szCs w:val="20"/>
+        </w:rPr>
+        <w:t xml:space="preserve"> 293 mg/kg</w:t>
+      </w:r>
+    </w:p>
+    <w:p>
+      <w:pPr>
+        <w:spacing w:after="80"/>
+      </w:pPr>
+      <w:r>
+        <w:rPr>
+          <w:rFonts w:ascii="Arial" w:cs="Arial" w:eastAsia="Arial" w:hAnsi="Arial"/>
+          <w:sz w:val="20"/>
+          <w:szCs w:val="20"/>
+        </w:rPr>
+        <w:t xml:space="preserve">2,6-di-tert-butylo-4-metylofenol (BHT) [CAS: 128-37-0]:</w:t>
+      </w:r>
+    </w:p>
+    <w:p>
+      <w:pPr>
+        <w:spacing w:after="60" w:before="60"/>
+      </w:pPr>
+      <w:r>
+        <w:rPr>
+          <w:rFonts w:ascii="Arial" w:cs="Arial" w:eastAsia="Arial" w:hAnsi="Arial"/>
+          <w:b/>
+          <w:bCs/>
+          <w:sz w:val="20"/>
+          <w:szCs w:val="20"/>
+        </w:rPr>
+        <w:t xml:space="preserve">- LD50 (skóra, szczur):</w:t>
+      </w:r>
+      <w:r>
+        <w:rPr>
+          <w:rFonts w:ascii="Arial" w:cs="Arial" w:eastAsia="Arial" w:hAnsi="Arial"/>
+          <w:sz w:val="20"/>
+          <w:szCs w:val="20"/>
+        </w:rPr>
+        <w:t xml:space="preserve"> &gt; 2000 mg/kg</w:t>
+      </w:r>
+    </w:p>
+    <w:p>
+      <w:pPr>
+        <w:spacing w:after="60" w:before="60"/>
+      </w:pPr>
+      <w:r>
+        <w:rPr>
+          <w:rFonts w:ascii="Arial" w:cs="Arial" w:eastAsia="Arial" w:hAnsi="Arial"/>
+          <w:b/>
+          <w:bCs/>
+          <w:sz w:val="20"/>
+          <w:szCs w:val="20"/>
+        </w:rPr>
+        <w:t xml:space="preserve">- LD50 (doustnie, szczur):</w:t>
+      </w:r>
+      <w:r>
+        <w:rPr>
+          <w:rFonts w:ascii="Arial" w:cs="Arial" w:eastAsia="Arial" w:hAnsi="Arial"/>
+          <w:sz w:val="20"/>
+          <w:szCs w:val="20"/>
+        </w:rPr>
+        <w:t xml:space="preserve"> 2930 mg/kg</w:t>
+      </w:r>
+    </w:p>
+    <w:p>
+      <w:pPr>
+        <w:spacing w:after="80"/>
+      </w:pPr>
+      <w:r>
+        <w:rPr>
+          <w:rFonts w:ascii="Arial" w:cs="Arial" w:eastAsia="Arial" w:hAnsi="Arial"/>
+          <w:sz w:val="20"/>
+          <w:szCs w:val="20"/>
+        </w:rPr>
+        <w:t xml:space="preserve">Toluen [CAS: 108-88-3]:</w:t>
+      </w:r>
+    </w:p>
+    <w:p>
+      <w:pPr>
+        <w:spacing w:after="60" w:before="60"/>
+      </w:pPr>
+      <w:r>
+        <w:rPr>
+          <w:rFonts w:ascii="Arial" w:cs="Arial" w:eastAsia="Arial" w:hAnsi="Arial"/>
+          <w:b/>
+          <w:bCs/>
+          <w:sz w:val="20"/>
+          <w:szCs w:val="20"/>
+        </w:rPr>
+        <w:t xml:space="preserve">- LD50 (skóra, królik):</w:t>
+      </w:r>
+      <w:r>
+        <w:rPr>
+          <w:rFonts w:ascii="Arial" w:cs="Arial" w:eastAsia="Arial" w:hAnsi="Arial"/>
+          <w:sz w:val="20"/>
+          <w:szCs w:val="20"/>
+        </w:rPr>
+        <w:t xml:space="preserve"> &gt; 5000 mg/kg mc.</w:t>
+      </w:r>
+    </w:p>
+    <w:p>
+      <w:pPr>
+        <w:spacing w:after="60" w:before="60"/>
+      </w:pPr>
+      <w:r>
+        <w:rPr>
+          <w:rFonts w:ascii="Arial" w:cs="Arial" w:eastAsia="Arial" w:hAnsi="Arial"/>
+          <w:b/>
+          <w:bCs/>
+          <w:sz w:val="20"/>
+          <w:szCs w:val="20"/>
+        </w:rPr>
+        <w:t xml:space="preserve">- LD50 (doustnie, szczur):</w:t>
+      </w:r>
+      <w:r>
+        <w:rPr>
+          <w:rFonts w:ascii="Arial" w:cs="Arial" w:eastAsia="Arial" w:hAnsi="Arial"/>
+          <w:sz w:val="20"/>
+          <w:szCs w:val="20"/>
+        </w:rPr>
+        <w:t xml:space="preserve"> &gt; 5000 mg/kg mc.</w:t>
+      </w:r>
+    </w:p>
+    <w:p>
+      <w:pPr>
+        <w:spacing w:after="60" w:before="60"/>
+      </w:pPr>
+      <w:r>
+        <w:rPr>
+          <w:rFonts w:ascii="Arial" w:cs="Arial" w:eastAsia="Arial" w:hAnsi="Arial"/>
+          <w:b/>
+          <w:bCs/>
+          <w:sz w:val="20"/>
+          <w:szCs w:val="20"/>
+        </w:rPr>
+        <w:t xml:space="preserve">- LC50 (inhalacyjnie, pary, człowiek):</w:t>
+      </w:r>
+      <w:r>
+        <w:rPr>
+          <w:rFonts w:ascii="Arial" w:cs="Arial" w:eastAsia="Arial" w:hAnsi="Arial"/>
+          <w:sz w:val="20"/>
+          <w:szCs w:val="20"/>
+        </w:rPr>
+        <w:t xml:space="preserve"> 100 ppm</w:t>
       </w:r>
     </w:p>
     <w:p>
@@ -5786,7 +5934,7 @@
           <w:sz w:val="20"/>
           <w:szCs w:val="20"/>
         </w:rPr>
-        <w:t xml:space="preserve">Nie spełnia kryteriów klasyfikacji dla tej klasy zagrożenia.</w:t>
+        <w:t xml:space="preserve">W oparciu o dostępne dane, kryteria klasyfikacji nie są spełnione.</w:t>
       </w:r>
     </w:p>
     <w:p>
@@ -5812,7 +5960,7 @@
           <w:sz w:val="20"/>
           <w:szCs w:val="20"/>
         </w:rPr>
-        <w:t xml:space="preserve">Działa drażniąco na oczy.</w:t>
+        <w:t xml:space="preserve">Działa drażniąco na oczy (kategoria Eye Irrit. 2 na podstawie zawartości etanolu ≥ 50%).</w:t>
       </w:r>
     </w:p>
     <w:p>
@@ -5838,20 +5986,7 @@
           <w:sz w:val="20"/>
           <w:szCs w:val="20"/>
         </w:rPr>
-        <w:t xml:space="preserve">Może powodować wystąpienie reakcji alergicznej.</w:t>
-      </w:r>
-    </w:p>
-    <w:p>
-      <w:pPr>
-        <w:spacing w:after="80"/>
-      </w:pPr>
-      <w:r>
-        <w:rPr>
-          <w:rFonts w:ascii="Arial" w:cs="Arial" w:eastAsia="Arial" w:hAnsi="Arial"/>
-          <w:sz w:val="20"/>
-          <w:szCs w:val="20"/>
-        </w:rPr>
-        <w:t xml:space="preserve">Zawiera: kumarynę (2H-chromen-2-on).</w:t>
+        <w:t xml:space="preserve">Może powodować wystąpienie reakcji alergicznej. Zawiera kumarynę (2H-chromen-2-on).</w:t>
       </w:r>
     </w:p>
     <w:p>
@@ -5877,7 +6012,7 @@
           <w:sz w:val="20"/>
           <w:szCs w:val="20"/>
         </w:rPr>
-        <w:t xml:space="preserve">Nie spełnia kryteriów klasyfikacji dla tej klasy zagrożenia.</w:t>
+        <w:t xml:space="preserve">W oparciu o dostępne dane, kryteria klasyfikacji nie są spełnione.</w:t>
       </w:r>
     </w:p>
     <w:p>
@@ -5903,20 +6038,20 @@
           <w:sz w:val="20"/>
           <w:szCs w:val="20"/>
         </w:rPr>
-        <w:t xml:space="preserve">Nie spełnia kryteriów klasyfikacji dla tej klasy zagrożenia.</w:t>
-      </w:r>
-    </w:p>
-    <w:p>
-      <w:pPr>
-        <w:spacing w:after="80"/>
-      </w:pPr>
-      <w:r>
-        <w:rPr>
-          <w:rFonts w:ascii="Arial" w:cs="Arial" w:eastAsia="Arial" w:hAnsi="Arial"/>
-          <w:sz w:val="20"/>
-          <w:szCs w:val="20"/>
-        </w:rPr>
-        <w:t xml:space="preserve">Toluen: Zaklasyfikowany do Grupy 3 (nie może być sklasyfikowany pod względem rakotwórczości dla ludzi) przez Międzynarodową Agencję Badań nad Rakiem (IARC) - (IARC, 1999). Amerykańska Agencja Ochrony Środowiska (EPA) stwierdza, że „dane są niewystarczające do oceny potencjału rakotwórczego”.</w:t>
+        <w:t xml:space="preserve">W oparciu o dostępne dane, kryteria klasyfikacji nie są spełnione.</w:t>
+      </w:r>
+    </w:p>
+    <w:p>
+      <w:pPr>
+        <w:spacing w:after="80"/>
+      </w:pPr>
+      <w:r>
+        <w:rPr>
+          <w:rFonts w:ascii="Arial" w:cs="Arial" w:eastAsia="Arial" w:hAnsi="Arial"/>
+          <w:sz w:val="20"/>
+          <w:szCs w:val="20"/>
+        </w:rPr>
+        <w:t xml:space="preserve">Toluen: Zaklasyfikowany do Grupy 3 (nie można zaklasyfikować jako rakotwórczy dla ludzi) przez Międzynarodową Agencję Badań nad Rakiem (IARC) - (IARC, 1999). Agencja Ochrony Środowiska USA (EPA) podaje, że dane są niewystarczające do oceny potencjału rakotwórczego.</w:t>
       </w:r>
     </w:p>
     <w:p>
@@ -5942,7 +6077,7 @@
           <w:sz w:val="20"/>
           <w:szCs w:val="20"/>
         </w:rPr>
-        <w:t xml:space="preserve">Nie spełnia kryteriów klasyfikacji dla tej klasy zagrożenia.</w:t>
+        <w:t xml:space="preserve">W oparciu o dostępne dane, kryteria klasyfikacji nie są spełnione.</w:t>
       </w:r>
     </w:p>
     <w:p>
@@ -5968,7 +6103,7 @@
           <w:sz w:val="20"/>
           <w:szCs w:val="20"/>
         </w:rPr>
-        <w:t xml:space="preserve">Nie spełnia kryteriów klasyfikacji dla tej klasy zagrożenia.</w:t>
+        <w:t xml:space="preserve">W oparciu o dostępne dane, kryteria klasyfikacji nie są spełnione.</w:t>
       </w:r>
     </w:p>
     <w:p>
@@ -5994,7 +6129,7 @@
           <w:sz w:val="20"/>
           <w:szCs w:val="20"/>
         </w:rPr>
-        <w:t xml:space="preserve">Nie spełnia kryteriów klasyfikacji dla tej klasy zagrożenia.</w:t>
+        <w:t xml:space="preserve">W oparciu o dostępne dane, kryteria klasyfikacji nie są spełnione.</w:t>
       </w:r>
     </w:p>
     <w:p>
@@ -6020,7 +6155,7 @@
           <w:sz w:val="20"/>
           <w:szCs w:val="20"/>
         </w:rPr>
-        <w:t xml:space="preserve">Nie spełnia kryteriów klasyfikacji dla tej klasy zagrożenia.</w:t>
+        <w:t xml:space="preserve">W oparciu o dostępne dane, kryteria klasyfikacji nie są spełnione.</w:t>
       </w:r>
     </w:p>
     <w:p>
@@ -6063,7 +6198,7 @@
           <w:sz w:val="20"/>
           <w:szCs w:val="20"/>
         </w:rPr>
-        <w:t xml:space="preserve">Na podstawie dostępnych danych produkt nie zawiera substancji wymienionych w głównych europejskich wykazach potencjalnych lub podejrzewanych substancji zaburzających funkcjonowanie układu hormonalnego pod kątem wpływu na zdrowie ludzi w stężeniu ≥ 0,1%.</w:t>
+        <w:t xml:space="preserve">Na podstawie dostępnych danych produkt nie zawiera substancji wymienionych w głównych europejskich wykazach substancji potencjalnie lub podejrzewanych o zaburzanie funkcjonowania układu hormonalnego pod kątem wpływu na zdrowie ludzi w stężeniu ≥ 0,1% wag.</w:t>
       </w:r>
     </w:p>
     <w:p>
@@ -6091,7 +6226,7 @@
           <w:sz w:val="20"/>
           <w:szCs w:val="20"/>
         </w:rPr>
-        <w:t xml:space="preserve">Brak innych znanych zagrożeń.</w:t>
+        <w:t xml:space="preserve">Brak innych znanych zagrożeń dla zdrowia.</w:t>
       </w:r>
     </w:p>
     <w:p>
@@ -7592,6 +7727,51 @@
           <w:szCs w:val="20"/>
         </w:rPr>
         <w:t xml:space="preserve">14.3. Klasa(-y) zagrożenia w transporcie</w:t>
+      </w:r>
+    </w:p>
+    <w:p>
+      <w:pPr>
+        <w:spacing w:after="100" w:before="60"/>
+      </w:pPr>
+      <w:r>
+        <w:drawing>
+          <wp:inline distT="0" distB="0" distL="0" distR="0">
+            <wp:extent cx="714375" cy="714375"/>
+            <wp:effectExtent t="0" r="0" b="0" l="0"/>
+            <wp:docPr id="1" name="" descr="" title=""/>
+            <wp:cNvGraphicFramePr>
+              <a:graphicFrameLocks xmlns:a="http://schemas.openxmlformats.org/drawingml/2006/main" noChangeAspect="1"/>
+            </wp:cNvGraphicFramePr>
+            <a:graphic xmlns:a="http://schemas.openxmlformats.org/drawingml/2006/main">
+              <a:graphicData uri="http://schemas.openxmlformats.org/drawingml/2006/picture">
+                <pic:pic xmlns:pic="http://schemas.openxmlformats.org/drawingml/2006/picture">
+                  <pic:nvPicPr>
+                    <pic:cNvPr id="0" name="" descr=""/>
+                    <pic:cNvPicPr>
+                      <a:picLocks noChangeAspect="1" noChangeArrowheads="1"/>
+                    </pic:cNvPicPr>
+                  </pic:nvPicPr>
+                  <pic:blipFill>
+                    <a:blip r:embed="rId11" cstate="none"/>
+                    <a:srcRect/>
+                    <a:stretch>
+                      <a:fillRect/>
+                    </a:stretch>
+                  </pic:blipFill>
+                  <pic:spPr bwMode="auto">
+                    <a:xfrm>
+                      <a:off x="0" y="0"/>
+                      <a:ext cx="714375" cy="714375"/>
+                    </a:xfrm>
+                    <a:prstGeom prst="rect">
+                      <a:avLst/>
+                    </a:prstGeom>
+                  </pic:spPr>
+                </pic:pic>
+              </a:graphicData>
+            </a:graphic>
+          </wp:inline>
+        </w:drawing>
       </w:r>
     </w:p>
     <w:p>
@@ -7747,7 +7927,7 @@
                     </pic:cNvPicPr>
                   </pic:nvPicPr>
                   <pic:blipFill>
-                    <a:blip r:embed="rId11" cstate="none"/>
+                    <a:blip r:embed="rId12" cstate="none"/>
                     <a:srcRect/>
                     <a:stretch>
                       <a:fillRect/>

</xml_diff>

<commit_message>
fix(sds): resolve Sanepid/PIP audit non-compliances for methanol, sec 9.1 & LQ formatting (ADR-080)
- Support CLP Annex VI index check character 'X' in INDEX regex (methanol 603-001-00-X)
- Enforce \bATE\b word boundary to prevent false matches on names ending in -ate (benzyl salicylate)
- Isolate page headers and decouple methanol from acetone/ethanol table cells
- Enrich NDS database with Metanol (NDS 100 mg/m3, NDSCh 300 mg/m3, skóra) and ecotox cache with CAS 67-56-1
- Enforce REACH Annex II (EU 2020/878) physical state rules in Section 9.1: 'Brak danych' / 'Nie oznaczono' for liquid viscosity/density instead of 'Nie dotyczy'
- Stitch broken LQ unit paragraphs in Section 14.6 ('1 L') preventing orphan labels beneath the ADR diamond
- Fix typo 'srebreem' -> 'srebrem' in Section 10.3
- Add comprehensive audit test suite in tests/sds.audit_sanepid_fixes.test.js
</commit_message>
<xml_diff>
--- a/docs/SDS/Karta_Charakterystyki_8034055535448_SDS_ORCHIDEA_E_VANIGLIA (12).docx
+++ b/docs/SDS/Karta_Charakterystyki_8034055535448_SDS_ORCHIDEA_E_VANIGLIA (12).docx
@@ -5004,7 +5004,7 @@
           <w:sz w:val="20"/>
           <w:szCs w:val="20"/>
         </w:rPr>
-        <w:t xml:space="preserve"> 1,5 mm²/s</w:t>
+        <w:t xml:space="preserve"> 1,5 mm²/s (w temp. 20 °C)</w:t>
       </w:r>
     </w:p>
     <w:p>
@@ -5310,20 +5310,20 @@
           <w:sz w:val="20"/>
           <w:szCs w:val="20"/>
         </w:rPr>
-        <w:t xml:space="preserve">W przypadku braku danych doświadczalnych dla samego produktu, zagrożenia dla zdrowia ocenia się na podstawie właściwości substancji w nim zawartych, stosując kryteria określone w odpowiednich przepisach dotyczących klasyfikacji.</w:t>
-      </w:r>
-    </w:p>
-    <w:p>
-      <w:pPr>
-        <w:spacing w:after="80"/>
-      </w:pPr>
-      <w:r>
-        <w:rPr>
-          <w:rFonts w:ascii="Arial" w:cs="Arial" w:eastAsia="Arial" w:hAnsi="Arial"/>
-          <w:sz w:val="20"/>
-          <w:szCs w:val="20"/>
-        </w:rPr>
-        <w:t xml:space="preserve">W związku z tym, w celu oceny skutków toksykologicznych narażenia na produkt, konieczne jest uwzględnienie stężeń poszczególnych substancji niebezpiecznych wskazanych w sekcji 3.</w:t>
+        <w:t xml:space="preserve">W przypadku braku danych doświadczalnych dla samego produktu, zagrożenia dla zdrowia ocenia się zgodnie z właściwościami zawartych w nim substancji, stosując kryteria określone w obowiązujących przepisach dotyczących klasyfikacji.</w:t>
+      </w:r>
+    </w:p>
+    <w:p>
+      <w:pPr>
+        <w:spacing w:after="80"/>
+      </w:pPr>
+      <w:r>
+        <w:rPr>
+          <w:rFonts w:ascii="Arial" w:cs="Arial" w:eastAsia="Arial" w:hAnsi="Arial"/>
+          <w:sz w:val="20"/>
+          <w:szCs w:val="20"/>
+        </w:rPr>
+        <w:t xml:space="preserve">W związku z tym należy wziąć pod uwagę stężenia poszczególnych substancji niebezpiecznych wskazanych w sekcji 3 w celu oceny skutków toksykologicznych narażenia na produkt.</w:t>
       </w:r>
     </w:p>
     <w:p>
@@ -5388,20 +5388,20 @@
           <w:sz w:val="20"/>
           <w:szCs w:val="20"/>
         </w:rPr>
-        <w:t xml:space="preserve">PRACOWNICY: inhalacyjnie (drogi oddechowe); kontakt ze skórą.</w:t>
-      </w:r>
-    </w:p>
-    <w:p>
-      <w:pPr>
-        <w:spacing w:after="80"/>
-      </w:pPr>
-      <w:r>
-        <w:rPr>
-          <w:rFonts w:ascii="Arial" w:cs="Arial" w:eastAsia="Arial" w:hAnsi="Arial"/>
-          <w:sz w:val="20"/>
-          <w:szCs w:val="20"/>
-        </w:rPr>
-        <w:t xml:space="preserve">KONSUMENCI: spożycie skażonej żywności lub wody; inhalacyjnie (wdychanie powietrza otoczenia); kontakt ze skórą z produktami zawierającymi substancję.</w:t>
+        <w:t xml:space="preserve">PRACOWNICY: przez drogi oddechowe (inhalacyjnie); kontakt ze skórą.</w:t>
+      </w:r>
+    </w:p>
+    <w:p>
+      <w:pPr>
+        <w:spacing w:after="80"/>
+      </w:pPr>
+      <w:r>
+        <w:rPr>
+          <w:rFonts w:ascii="Arial" w:cs="Arial" w:eastAsia="Arial" w:hAnsi="Arial"/>
+          <w:sz w:val="20"/>
+          <w:szCs w:val="20"/>
+        </w:rPr>
+        <w:t xml:space="preserve">KONSUMENCI: spożycie skażonej żywności lub wody; przez drogi oddechowe (inhalacyjnie) z powietrza otoczenia; kontakt ze skórą w przypadku produktów zawierających substancję.</w:t>
       </w:r>
     </w:p>
     <w:p>
@@ -5479,7 +5479,7 @@
           <w:sz w:val="20"/>
           <w:szCs w:val="20"/>
         </w:rPr>
-        <w:t xml:space="preserve">Niektóre leki i inne substancje przemysłowe mogą zakłócać metabolizm toluenu.</w:t>
+        <w:t xml:space="preserve">Niektóre leki i inne produkty przemysłowe mogą zakłócać metabolizm toluenu.</w:t>
       </w:r>
     </w:p>
     <w:p>
@@ -5505,46 +5505,33 @@
           <w:sz w:val="20"/>
           <w:szCs w:val="20"/>
         </w:rPr>
-        <w:t xml:space="preserve">ATE mieszaniny (drogi oddechowe / inhalacyjnie): Nie sklasyfikowano (brak istotnych składników)</w:t>
-      </w:r>
-    </w:p>
-    <w:p>
-      <w:pPr>
-        <w:spacing w:after="80"/>
-      </w:pPr>
-      <w:r>
-        <w:rPr>
-          <w:rFonts w:ascii="Arial" w:cs="Arial" w:eastAsia="Arial" w:hAnsi="Arial"/>
-          <w:sz w:val="20"/>
-          <w:szCs w:val="20"/>
-        </w:rPr>
-        <w:t xml:space="preserve">ATE mieszaniny (droga pokarmowa / doustnie): Nie sklasyfikowano (brak istotnych składników)</w:t>
-      </w:r>
-    </w:p>
-    <w:p>
-      <w:pPr>
-        <w:spacing w:after="80"/>
-      </w:pPr>
-      <w:r>
-        <w:rPr>
-          <w:rFonts w:ascii="Arial" w:cs="Arial" w:eastAsia="Arial" w:hAnsi="Arial"/>
-          <w:sz w:val="20"/>
-          <w:szCs w:val="20"/>
-        </w:rPr>
-        <w:t xml:space="preserve">ATE mieszaniny (na skórę): Nie sklasyfikowano (brak istotnych składników)</w:t>
-      </w:r>
-    </w:p>
-    <w:p>
-      <w:pPr>
-        <w:spacing w:after="80"/>
-      </w:pPr>
-      <w:r>
-        <w:rPr>
-          <w:rFonts w:ascii="Arial" w:cs="Arial" w:eastAsia="Arial" w:hAnsi="Arial"/>
-          <w:sz w:val="20"/>
-          <w:szCs w:val="20"/>
-        </w:rPr>
-        <w:t xml:space="preserve">Informacje o składnikach:</w:t>
+        <w:t xml:space="preserve">ATE (drogi oddechowe) mieszaniny: Nie sklasyfikowano (brak istotnych składników)</w:t>
+      </w:r>
+    </w:p>
+    <w:p>
+      <w:pPr>
+        <w:spacing w:after="80"/>
+      </w:pPr>
+      <w:r>
+        <w:rPr>
+          <w:rFonts w:ascii="Arial" w:cs="Arial" w:eastAsia="Arial" w:hAnsi="Arial"/>
+          <w:sz w:val="20"/>
+          <w:szCs w:val="20"/>
+        </w:rPr>
+        <w:t xml:space="preserve">ATE (droga pokarmowa) mieszaniny: Nie sklasyfikowano (brak istotnych składników)</w:t>
+      </w:r>
+    </w:p>
+    <w:p>
+      <w:pPr>
+        <w:spacing w:after="80"/>
+      </w:pPr>
+      <w:r>
+        <w:rPr>
+          <w:rFonts w:ascii="Arial" w:cs="Arial" w:eastAsia="Arial" w:hAnsi="Arial"/>
+          <w:sz w:val="20"/>
+          <w:szCs w:val="20"/>
+        </w:rPr>
+        <w:t xml:space="preserve">ATE (skóra) mieszaniny: Nie sklasyfikowano (brak istotnych składników)</w:t>
       </w:r>
     </w:p>
     <w:p>
@@ -5572,7 +5559,7 @@
           <w:sz w:val="20"/>
           <w:szCs w:val="20"/>
         </w:rPr>
-        <w:t xml:space="preserve">- LD50 (doustnie, szczur):</w:t>
+        <w:t xml:space="preserve">- LD50 (droga pokarmowa, szczur):</w:t>
       </w:r>
       <w:r>
         <w:rPr>
@@ -5595,7 +5582,7 @@
           <w:sz w:val="20"/>
           <w:szCs w:val="20"/>
         </w:rPr>
-        <w:t xml:space="preserve">- LC50 (inhalacyjnie, pary, szczur):</w:t>
+        <w:t xml:space="preserve">- LC50 (drogi oddechowe, pary, szczur):</w:t>
       </w:r>
       <w:r>
         <w:rPr>
@@ -5654,7 +5641,7 @@
           <w:sz w:val="20"/>
           <w:szCs w:val="20"/>
         </w:rPr>
-        <w:t xml:space="preserve">- LD50 (doustnie, szczur):</w:t>
+        <w:t xml:space="preserve">- LD50 (droga pokarmowa, szczur):</w:t>
       </w:r>
       <w:r>
         <w:rPr>
@@ -5677,7 +5664,7 @@
           <w:sz w:val="20"/>
           <w:szCs w:val="20"/>
         </w:rPr>
-        <w:t xml:space="preserve">- LC50 (inhalacyjnie, pary, szczur):</w:t>
+        <w:t xml:space="preserve">- LC50 (drogi oddechowe, pary, szczur):</w:t>
       </w:r>
       <w:r>
         <w:rPr>
@@ -5721,45 +5708,45 @@
           <w:sz w:val="20"/>
           <w:szCs w:val="20"/>
         </w:rPr>
-        <w:t xml:space="preserve"> 293 mg/kg mc.</w:t>
-      </w:r>
-    </w:p>
-    <w:p>
-      <w:pPr>
-        <w:spacing w:after="60" w:before="60"/>
-      </w:pPr>
-      <w:r>
-        <w:rPr>
-          <w:rFonts w:ascii="Arial" w:cs="Arial" w:eastAsia="Arial" w:hAnsi="Arial"/>
-          <w:b/>
-          <w:bCs/>
-          <w:sz w:val="20"/>
-          <w:szCs w:val="20"/>
-        </w:rPr>
-        <w:t xml:space="preserve">- LD50 (doustnie, szczur):</w:t>
-      </w:r>
-      <w:r>
-        <w:rPr>
-          <w:rFonts w:ascii="Arial" w:cs="Arial" w:eastAsia="Arial" w:hAnsi="Arial"/>
-          <w:sz w:val="20"/>
-          <w:szCs w:val="20"/>
-        </w:rPr>
-        <w:t xml:space="preserve"> 290 mg/kg mc.</w:t>
-      </w:r>
-    </w:p>
-    <w:p>
-      <w:pPr>
-        <w:spacing w:after="60" w:before="60"/>
-      </w:pPr>
-      <w:r>
-        <w:rPr>
-          <w:rFonts w:ascii="Arial" w:cs="Arial" w:eastAsia="Arial" w:hAnsi="Arial"/>
-          <w:b/>
-          <w:bCs/>
-          <w:sz w:val="20"/>
-          <w:szCs w:val="20"/>
-        </w:rPr>
-        <w:t xml:space="preserve">- LC50 (inhalacyjnie, aerozole/pyły, szczur):</w:t>
+        <w:t xml:space="preserve"> 293 mg/kg mc</w:t>
+      </w:r>
+    </w:p>
+    <w:p>
+      <w:pPr>
+        <w:spacing w:after="60" w:before="60"/>
+      </w:pPr>
+      <w:r>
+        <w:rPr>
+          <w:rFonts w:ascii="Arial" w:cs="Arial" w:eastAsia="Arial" w:hAnsi="Arial"/>
+          <w:b/>
+          <w:bCs/>
+          <w:sz w:val="20"/>
+          <w:szCs w:val="20"/>
+        </w:rPr>
+        <w:t xml:space="preserve">- LD50 (droga pokarmowa, szczur):</w:t>
+      </w:r>
+      <w:r>
+        <w:rPr>
+          <w:rFonts w:ascii="Arial" w:cs="Arial" w:eastAsia="Arial" w:hAnsi="Arial"/>
+          <w:sz w:val="20"/>
+          <w:szCs w:val="20"/>
+        </w:rPr>
+        <w:t xml:space="preserve"> 290 mg/kg mc (ATE = 500 mg/kg mc)</w:t>
+      </w:r>
+    </w:p>
+    <w:p>
+      <w:pPr>
+        <w:spacing w:after="60" w:before="60"/>
+      </w:pPr>
+      <w:r>
+        <w:rPr>
+          <w:rFonts w:ascii="Arial" w:cs="Arial" w:eastAsia="Arial" w:hAnsi="Arial"/>
+          <w:b/>
+          <w:bCs/>
+          <w:sz w:val="20"/>
+          <w:szCs w:val="20"/>
+        </w:rPr>
+        <w:t xml:space="preserve">- LC50 (drogi oddechowe, pyły/mgły, szczur):</w:t>
       </w:r>
       <w:r>
         <w:rPr>
@@ -5818,7 +5805,7 @@
           <w:sz w:val="20"/>
           <w:szCs w:val="20"/>
         </w:rPr>
-        <w:t xml:space="preserve">- LD50 (doustnie, szczur):</w:t>
+        <w:t xml:space="preserve">- LD50 (droga pokarmowa, szczur):</w:t>
       </w:r>
       <w:r>
         <w:rPr>
@@ -5862,45 +5849,45 @@
           <w:sz w:val="20"/>
           <w:szCs w:val="20"/>
         </w:rPr>
-        <w:t xml:space="preserve"> &gt; 5000 mg/kg mc.</w:t>
-      </w:r>
-    </w:p>
-    <w:p>
-      <w:pPr>
-        <w:spacing w:after="60" w:before="60"/>
-      </w:pPr>
-      <w:r>
-        <w:rPr>
-          <w:rFonts w:ascii="Arial" w:cs="Arial" w:eastAsia="Arial" w:hAnsi="Arial"/>
-          <w:b/>
-          <w:bCs/>
-          <w:sz w:val="20"/>
-          <w:szCs w:val="20"/>
-        </w:rPr>
-        <w:t xml:space="preserve">- LD50 (doustnie, szczur):</w:t>
-      </w:r>
-      <w:r>
-        <w:rPr>
-          <w:rFonts w:ascii="Arial" w:cs="Arial" w:eastAsia="Arial" w:hAnsi="Arial"/>
-          <w:sz w:val="20"/>
-          <w:szCs w:val="20"/>
-        </w:rPr>
-        <w:t xml:space="preserve"> &gt; 5000 mg/kg mc.</w:t>
-      </w:r>
-    </w:p>
-    <w:p>
-      <w:pPr>
-        <w:spacing w:after="60" w:before="60"/>
-      </w:pPr>
-      <w:r>
-        <w:rPr>
-          <w:rFonts w:ascii="Arial" w:cs="Arial" w:eastAsia="Arial" w:hAnsi="Arial"/>
-          <w:b/>
-          <w:bCs/>
-          <w:sz w:val="20"/>
-          <w:szCs w:val="20"/>
-        </w:rPr>
-        <w:t xml:space="preserve">- LC50 (inhalacyjnie, pary, człowiek):</w:t>
+        <w:t xml:space="preserve"> &gt; 5000 mg/kg mc</w:t>
+      </w:r>
+    </w:p>
+    <w:p>
+      <w:pPr>
+        <w:spacing w:after="60" w:before="60"/>
+      </w:pPr>
+      <w:r>
+        <w:rPr>
+          <w:rFonts w:ascii="Arial" w:cs="Arial" w:eastAsia="Arial" w:hAnsi="Arial"/>
+          <w:b/>
+          <w:bCs/>
+          <w:sz w:val="20"/>
+          <w:szCs w:val="20"/>
+        </w:rPr>
+        <w:t xml:space="preserve">- LD50 (droga pokarmowa, szczur):</w:t>
+      </w:r>
+      <w:r>
+        <w:rPr>
+          <w:rFonts w:ascii="Arial" w:cs="Arial" w:eastAsia="Arial" w:hAnsi="Arial"/>
+          <w:sz w:val="20"/>
+          <w:szCs w:val="20"/>
+        </w:rPr>
+        <w:t xml:space="preserve"> &gt; 5000 mg/kg mc</w:t>
+      </w:r>
+    </w:p>
+    <w:p>
+      <w:pPr>
+        <w:spacing w:after="60" w:before="60"/>
+      </w:pPr>
+      <w:r>
+        <w:rPr>
+          <w:rFonts w:ascii="Arial" w:cs="Arial" w:eastAsia="Arial" w:hAnsi="Arial"/>
+          <w:b/>
+          <w:bCs/>
+          <w:sz w:val="20"/>
+          <w:szCs w:val="20"/>
+        </w:rPr>
+        <w:t xml:space="preserve">- LC50 (drogi oddechowe, pary, człowiek):</w:t>
       </w:r>
       <w:r>
         <w:rPr>
@@ -5960,7 +5947,7 @@
           <w:sz w:val="20"/>
           <w:szCs w:val="20"/>
         </w:rPr>
-        <w:t xml:space="preserve">Działa drażniąco na oczy (kategoria Eye Irrit. 2 na podstawie zawartości etanolu ≥ 50%).</w:t>
+        <w:t xml:space="preserve">Działa drażniąco na oczy.</w:t>
       </w:r>
     </w:p>
     <w:p>
@@ -5986,7 +5973,7 @@
           <w:sz w:val="20"/>
           <w:szCs w:val="20"/>
         </w:rPr>
-        <w:t xml:space="preserve">Może powodować wystąpienie reakcji alergicznej. Zawiera kumarynę (2H-chromen-2-on).</w:t>
+        <w:t xml:space="preserve">Może powodować wystąpienie reakcji alergicznej skóry. Zawiera kumarynę (2H-chromen-2-on).</w:t>
       </w:r>
     </w:p>
     <w:p>
@@ -6051,7 +6038,7 @@
           <w:sz w:val="20"/>
           <w:szCs w:val="20"/>
         </w:rPr>
-        <w:t xml:space="preserve">Toluen: Zaklasyfikowany do Grupy 3 (nie można zaklasyfikować jako rakotwórczy dla ludzi) przez Międzynarodową Agencję Badań nad Rakiem (IARC) - (IARC, 1999). Agencja Ochrony Środowiska USA (EPA) podaje, że dane są niewystarczające do oceny potencjału rakotwórczego.</w:t>
+        <w:t xml:space="preserve">Toluen został zaklasyfikowany do Grupy 3 (nie można zaklasyfikować jako rakotwórczy dla ludzi) przez Międzynarodową Agencję Badań nad Rakiem (IARC - 1999). Amerykańska Agencja Ochrony Środowiska (EPA) stwierdza, że dane są niewystarczające do oceny potencjału rakotwórczego.</w:t>
       </w:r>
     </w:p>
     <w:p>
@@ -6198,7 +6185,7 @@
           <w:sz w:val="20"/>
           <w:szCs w:val="20"/>
         </w:rPr>
-        <w:t xml:space="preserve">Na podstawie dostępnych danych produkt nie zawiera substancji wymienionych w głównych europejskich wykazach substancji potencjalnie lub podejrzewanych o zaburzanie funkcjonowania układu hormonalnego pod kątem wpływu na zdrowie ludzi w stężeniu ≥ 0,1% wag.</w:t>
+        <w:t xml:space="preserve">W oparciu o dostępne dane produkt nie zawiera substancji wpisanych do głównych europejskich wykazów jako substancje o właściwościach zaburzających funkcjonowanie układu hormonalnego lub podejrzewane o takie właściwości w odniesieniu do zdrowia ludzkiego w stężeniu ≥ 0,1%.</w:t>
       </w:r>
     </w:p>
     <w:p>
@@ -6226,7 +6213,7 @@
           <w:sz w:val="20"/>
           <w:szCs w:val="20"/>
         </w:rPr>
-        <w:t xml:space="preserve">Brak innych znanych zagrożeń dla zdrowia.</w:t>
+        <w:t xml:space="preserve">Brak dalszych danych.</w:t>
       </w:r>
     </w:p>
     <w:p>
@@ -7893,15 +7880,15 @@
           <w:sz w:val="20"/>
           <w:szCs w:val="20"/>
         </w:rPr>
-        <w:t xml:space="preserve">Ilości ograniczone (LQ):</w:t>
-      </w:r>
-      <w:r>
-        <w:rPr>
-          <w:rFonts w:ascii="Arial" w:cs="Arial" w:eastAsia="Arial" w:hAnsi="Arial"/>
-          <w:sz w:val="20"/>
-          <w:szCs w:val="20"/>
-        </w:rPr>
-        <w:t xml:space="preserve"> 1 L</w:t>
+        <w:t xml:space="preserve">Ilości ograniczone (LQ): </w:t>
+      </w:r>
+      <w:r>
+        <w:rPr>
+          <w:rFonts w:ascii="Arial" w:cs="Arial" w:eastAsia="Arial" w:hAnsi="Arial"/>
+          <w:sz w:val="20"/>
+          <w:szCs w:val="20"/>
+        </w:rPr>
+        <w:t xml:space="preserve">1 l</w:t>
       </w:r>
     </w:p>
     <w:p>

</xml_diff>

<commit_message>
feat(sds): introduce deterministic SDS compiler architecture and quality gate linter (ADR-081)
- Introduce Single Source of Truth canonical ECHA/CLP dictionary (sds.canonical.clp.js) covering H/P phrases, CLP classes, test organisms, and Section 9.1 parameters
- Implement strongly typed Intermediate Representation AST (sds.ast.js: SubstanceAST, SDSDocumentAST)
- Add page-break resilient Section 3 table parser (sds.table.parser.js) with PDF header/footer cleaning and Annex VI modulo 11 index support
- Implement automated Sanepid/PIP quality gatekeeper (sds.linter.js) enforcing physical state consistency, NDS coverage, language purity, and biological integrity
- Connect SDSLinter as Step 4c quality gate in sds.agent.js prior to DOCX export
- Add comprehensive compiler engine test suite in tests/sds.compiler_engine.test.js (6/6 PASS)
</commit_message>
<xml_diff>
--- a/docs/SDS/Karta_Charakterystyki_8034055535448_SDS_ORCHIDEA_E_VANIGLIA (12).docx
+++ b/docs/SDS/Karta_Charakterystyki_8034055535448_SDS_ORCHIDEA_E_VANIGLIA (12).docx
@@ -5287,6 +5287,32 @@
     </w:p>
     <w:p>
       <w:pPr>
+        <w:spacing w:after="80"/>
+      </w:pPr>
+      <w:r>
+        <w:rPr>
+          <w:rFonts w:ascii="Arial" w:cs="Arial" w:eastAsia="Arial" w:hAnsi="Arial"/>
+          <w:sz w:val="20"/>
+          <w:szCs w:val="20"/>
+        </w:rPr>
+        <w:t xml:space="preserve">Wobec braku danych doświadczalnych dla samego produktu, zagrożenia dla zdrowia oceniono na podstawie właściwości substancji w nim zawartych, zgodnie z kryteriami określonymi w odpowiednich przepisach dotyczących klasyfikacji.</w:t>
+      </w:r>
+    </w:p>
+    <w:p>
+      <w:pPr>
+        <w:spacing w:after="80"/>
+      </w:pPr>
+      <w:r>
+        <w:rPr>
+          <w:rFonts w:ascii="Arial" w:cs="Arial" w:eastAsia="Arial" w:hAnsi="Arial"/>
+          <w:sz w:val="20"/>
+          <w:szCs w:val="20"/>
+        </w:rPr>
+        <w:t xml:space="preserve">W związku z tym, w celu oceny skutków toksykologicznych narażenia na produkt, konieczne jest uwzględnienie stężenia poszczególnych substancji niebezpiecznych wskazanych w sekcji 3.</w:t>
+      </w:r>
+    </w:p>
+    <w:p>
+      <w:pPr>
         <w:spacing w:after="100" w:before="200"/>
       </w:pPr>
       <w:r>
@@ -5310,32 +5336,6 @@
           <w:sz w:val="20"/>
           <w:szCs w:val="20"/>
         </w:rPr>
-        <w:t xml:space="preserve">W przypadku braku danych doświadczalnych dla samego produktu, zagrożenia dla zdrowia ocenia się zgodnie z właściwościami zawartych w nim substancji, stosując kryteria określone w obowiązujących przepisach dotyczących klasyfikacji.</w:t>
-      </w:r>
-    </w:p>
-    <w:p>
-      <w:pPr>
-        <w:spacing w:after="80"/>
-      </w:pPr>
-      <w:r>
-        <w:rPr>
-          <w:rFonts w:ascii="Arial" w:cs="Arial" w:eastAsia="Arial" w:hAnsi="Arial"/>
-          <w:sz w:val="20"/>
-          <w:szCs w:val="20"/>
-        </w:rPr>
-        <w:t xml:space="preserve">W związku z tym należy wziąć pod uwagę stężenia poszczególnych substancji niebezpiecznych wskazanych w sekcji 3 w celu oceny skutków toksykologicznych narażenia na produkt.</w:t>
-      </w:r>
-    </w:p>
-    <w:p>
-      <w:pPr>
-        <w:spacing w:after="80"/>
-      </w:pPr>
-      <w:r>
-        <w:rPr>
-          <w:rFonts w:ascii="Arial" w:cs="Arial" w:eastAsia="Arial" w:hAnsi="Arial"/>
-          <w:sz w:val="20"/>
-          <w:szCs w:val="20"/>
-        </w:rPr>
         <w:t xml:space="preserve">Metabolizm, toksykokinetyka, mechanizm działania i inne informacje:</w:t>
       </w:r>
     </w:p>
@@ -5388,20 +5388,20 @@
           <w:sz w:val="20"/>
           <w:szCs w:val="20"/>
         </w:rPr>
-        <w:t xml:space="preserve">PRACOWNICY: przez drogi oddechowe (inhalacyjnie); kontakt ze skórą.</w:t>
-      </w:r>
-    </w:p>
-    <w:p>
-      <w:pPr>
-        <w:spacing w:after="80"/>
-      </w:pPr>
-      <w:r>
-        <w:rPr>
-          <w:rFonts w:ascii="Arial" w:cs="Arial" w:eastAsia="Arial" w:hAnsi="Arial"/>
-          <w:sz w:val="20"/>
-          <w:szCs w:val="20"/>
-        </w:rPr>
-        <w:t xml:space="preserve">KONSUMENCI: spożycie skażonej żywności lub wody; przez drogi oddechowe (inhalacyjnie) z powietrza otoczenia; kontakt ze skórą w przypadku produktów zawierających substancję.</w:t>
+        <w:t xml:space="preserve">PRACOWNICY: inhalacyjnie (przez drogi oddechowe); kontakt ze skórą.</w:t>
+      </w:r>
+    </w:p>
+    <w:p>
+      <w:pPr>
+        <w:spacing w:after="80"/>
+      </w:pPr>
+      <w:r>
+        <w:rPr>
+          <w:rFonts w:ascii="Arial" w:cs="Arial" w:eastAsia="Arial" w:hAnsi="Arial"/>
+          <w:sz w:val="20"/>
+          <w:szCs w:val="20"/>
+        </w:rPr>
+        <w:t xml:space="preserve">KONSUMENCI: spożycie zanieczyszczonej żywności lub wody; inhalacyjnie (wdychanie powietrza z otoczenia); kontakt ze skórą z produktami zawierającymi substancję.</w:t>
       </w:r>
     </w:p>
     <w:p>
@@ -5440,7 +5440,7 @@
           <w:sz w:val="20"/>
           <w:szCs w:val="20"/>
         </w:rPr>
-        <w:t xml:space="preserve">Działanie toksyczne na ośrodkowy i obwodowy układ nerwowy z encefalopatią i polineuropatią; działa drażniąco na skórę, spojówki, rogówkę i układ oddechowy.</w:t>
+        <w:t xml:space="preserve">Działanie toksyczne na ośrodkowy i obwodowy układ nerwowy z encefalopatią i zapaleniem wielonerwowym; działa drażniąco na skórę, spojówki, rogówkę i układ oddechowy.</w:t>
       </w:r>
     </w:p>
     <w:p>
@@ -5479,7 +5479,7 @@
           <w:sz w:val="20"/>
           <w:szCs w:val="20"/>
         </w:rPr>
-        <w:t xml:space="preserve">Niektóre leki i inne produkty przemysłowe mogą zakłócać metabolizm toluenu.</w:t>
+        <w:t xml:space="preserve">Niektóre leki oraz inne chemikalia przemysłowe mogą zakłócać metabolizm toluenu.</w:t>
       </w:r>
     </w:p>
     <w:p>
@@ -5505,397 +5505,407 @@
           <w:sz w:val="20"/>
           <w:szCs w:val="20"/>
         </w:rPr>
-        <w:t xml:space="preserve">ATE (drogi oddechowe) mieszaniny: Nie sklasyfikowano (brak istotnych składników)</w:t>
-      </w:r>
-    </w:p>
-    <w:p>
-      <w:pPr>
-        <w:spacing w:after="80"/>
-      </w:pPr>
-      <w:r>
-        <w:rPr>
-          <w:rFonts w:ascii="Arial" w:cs="Arial" w:eastAsia="Arial" w:hAnsi="Arial"/>
-          <w:sz w:val="20"/>
-          <w:szCs w:val="20"/>
-        </w:rPr>
-        <w:t xml:space="preserve">ATE (droga pokarmowa) mieszaniny: Nie sklasyfikowano (brak istotnych składników)</w:t>
-      </w:r>
-    </w:p>
-    <w:p>
-      <w:pPr>
-        <w:spacing w:after="80"/>
-      </w:pPr>
-      <w:r>
-        <w:rPr>
-          <w:rFonts w:ascii="Arial" w:cs="Arial" w:eastAsia="Arial" w:hAnsi="Arial"/>
-          <w:sz w:val="20"/>
-          <w:szCs w:val="20"/>
-        </w:rPr>
-        <w:t xml:space="preserve">ATE (skóra) mieszaniny: Nie sklasyfikowano (brak istotnych składników)</w:t>
-      </w:r>
-    </w:p>
-    <w:p>
-      <w:pPr>
-        <w:spacing w:after="80"/>
-      </w:pPr>
-      <w:r>
-        <w:rPr>
-          <w:rFonts w:ascii="Arial" w:cs="Arial" w:eastAsia="Arial" w:hAnsi="Arial"/>
-          <w:sz w:val="20"/>
-          <w:szCs w:val="20"/>
-        </w:rPr>
-        <w:t xml:space="preserve">Etanol [CAS: 64-17-5]:</w:t>
-      </w:r>
-    </w:p>
-    <w:p>
-      <w:pPr>
-        <w:spacing w:after="60" w:before="60"/>
-      </w:pPr>
-      <w:r>
-        <w:rPr>
-          <w:rFonts w:ascii="Arial" w:cs="Arial" w:eastAsia="Arial" w:hAnsi="Arial"/>
-          <w:b/>
-          <w:bCs/>
-          <w:sz w:val="20"/>
-          <w:szCs w:val="20"/>
-        </w:rPr>
-        <w:t xml:space="preserve">- LD50 (droga pokarmowa, szczur):</w:t>
-      </w:r>
-      <w:r>
-        <w:rPr>
-          <w:rFonts w:ascii="Arial" w:cs="Arial" w:eastAsia="Arial" w:hAnsi="Arial"/>
-          <w:sz w:val="20"/>
-          <w:szCs w:val="20"/>
-        </w:rPr>
-        <w:t xml:space="preserve"> &gt; 5000 mg/kg</w:t>
-      </w:r>
-    </w:p>
-    <w:p>
-      <w:pPr>
-        <w:spacing w:after="60" w:before="60"/>
-      </w:pPr>
-      <w:r>
-        <w:rPr>
-          <w:rFonts w:ascii="Arial" w:cs="Arial" w:eastAsia="Arial" w:hAnsi="Arial"/>
-          <w:b/>
-          <w:bCs/>
-          <w:sz w:val="20"/>
-          <w:szCs w:val="20"/>
-        </w:rPr>
-        <w:t xml:space="preserve">- LC50 (drogi oddechowe, pary, szczur):</w:t>
-      </w:r>
-      <w:r>
-        <w:rPr>
-          <w:rFonts w:ascii="Arial" w:cs="Arial" w:eastAsia="Arial" w:hAnsi="Arial"/>
-          <w:sz w:val="20"/>
-          <w:szCs w:val="20"/>
-        </w:rPr>
-        <w:t xml:space="preserve"> &gt; 50 mg/l/4h</w:t>
-      </w:r>
-    </w:p>
-    <w:p>
-      <w:pPr>
-        <w:spacing w:after="80"/>
-      </w:pPr>
-      <w:r>
-        <w:rPr>
-          <w:rFonts w:ascii="Arial" w:cs="Arial" w:eastAsia="Arial" w:hAnsi="Arial"/>
-          <w:sz w:val="20"/>
-          <w:szCs w:val="20"/>
-        </w:rPr>
-        <w:t xml:space="preserve">Aldehyd anyżowy [CAS: 123-11-5]:</w:t>
-      </w:r>
-    </w:p>
-    <w:p>
-      <w:pPr>
-        <w:spacing w:after="60" w:before="60"/>
-      </w:pPr>
-      <w:r>
-        <w:rPr>
-          <w:rFonts w:ascii="Arial" w:cs="Arial" w:eastAsia="Arial" w:hAnsi="Arial"/>
-          <w:b/>
-          <w:bCs/>
-          <w:sz w:val="20"/>
-          <w:szCs w:val="20"/>
-        </w:rPr>
-        <w:t xml:space="preserve">- LD50 (skóra, królik):</w:t>
-      </w:r>
-      <w:r>
-        <w:rPr>
-          <w:rFonts w:ascii="Arial" w:cs="Arial" w:eastAsia="Arial" w:hAnsi="Arial"/>
-          <w:sz w:val="20"/>
-          <w:szCs w:val="20"/>
-        </w:rPr>
-        <w:t xml:space="preserve"> &gt; 5000 mg/kg</w:t>
-      </w:r>
-    </w:p>
-    <w:p>
-      <w:pPr>
-        <w:spacing w:after="60" w:before="60"/>
-      </w:pPr>
-      <w:r>
-        <w:rPr>
-          <w:rFonts w:ascii="Arial" w:cs="Arial" w:eastAsia="Arial" w:hAnsi="Arial"/>
-          <w:b/>
-          <w:bCs/>
-          <w:sz w:val="20"/>
-          <w:szCs w:val="20"/>
-        </w:rPr>
-        <w:t xml:space="preserve">- LD50 (droga pokarmowa, szczur):</w:t>
-      </w:r>
-      <w:r>
-        <w:rPr>
-          <w:rFonts w:ascii="Arial" w:cs="Arial" w:eastAsia="Arial" w:hAnsi="Arial"/>
-          <w:sz w:val="20"/>
-          <w:szCs w:val="20"/>
-        </w:rPr>
-        <w:t xml:space="preserve"> 3210 mg/kg</w:t>
-      </w:r>
-    </w:p>
-    <w:p>
-      <w:pPr>
-        <w:spacing w:after="60" w:before="60"/>
-      </w:pPr>
-      <w:r>
-        <w:rPr>
-          <w:rFonts w:ascii="Arial" w:cs="Arial" w:eastAsia="Arial" w:hAnsi="Arial"/>
-          <w:b/>
-          <w:bCs/>
-          <w:sz w:val="20"/>
-          <w:szCs w:val="20"/>
-        </w:rPr>
-        <w:t xml:space="preserve">- LC50 (drogi oddechowe, pary, szczur):</w:t>
-      </w:r>
-      <w:r>
-        <w:rPr>
-          <w:rFonts w:ascii="Arial" w:cs="Arial" w:eastAsia="Arial" w:hAnsi="Arial"/>
-          <w:sz w:val="20"/>
-          <w:szCs w:val="20"/>
-        </w:rPr>
-        <w:t xml:space="preserve"> 0,32 mg/l/7h</w:t>
-      </w:r>
-    </w:p>
-    <w:p>
-      <w:pPr>
-        <w:spacing w:after="80"/>
-      </w:pPr>
-      <w:r>
-        <w:rPr>
-          <w:rFonts w:ascii="Arial" w:cs="Arial" w:eastAsia="Arial" w:hAnsi="Arial"/>
-          <w:sz w:val="20"/>
-          <w:szCs w:val="20"/>
-        </w:rPr>
-        <w:t xml:space="preserve">Kumaryna [CAS: 91-64-5]:</w:t>
-      </w:r>
-    </w:p>
-    <w:p>
-      <w:pPr>
-        <w:spacing w:after="60" w:before="60"/>
-      </w:pPr>
-      <w:r>
-        <w:rPr>
-          <w:rFonts w:ascii="Arial" w:cs="Arial" w:eastAsia="Arial" w:hAnsi="Arial"/>
-          <w:b/>
-          <w:bCs/>
-          <w:sz w:val="20"/>
-          <w:szCs w:val="20"/>
-        </w:rPr>
-        <w:t xml:space="preserve">- LD50 (skóra, szczur):</w:t>
-      </w:r>
-      <w:r>
-        <w:rPr>
-          <w:rFonts w:ascii="Arial" w:cs="Arial" w:eastAsia="Arial" w:hAnsi="Arial"/>
-          <w:sz w:val="20"/>
-          <w:szCs w:val="20"/>
-        </w:rPr>
-        <w:t xml:space="preserve"> 293 mg/kg mc</w:t>
-      </w:r>
-    </w:p>
-    <w:p>
-      <w:pPr>
-        <w:spacing w:after="60" w:before="60"/>
-      </w:pPr>
-      <w:r>
-        <w:rPr>
-          <w:rFonts w:ascii="Arial" w:cs="Arial" w:eastAsia="Arial" w:hAnsi="Arial"/>
-          <w:b/>
-          <w:bCs/>
-          <w:sz w:val="20"/>
-          <w:szCs w:val="20"/>
-        </w:rPr>
-        <w:t xml:space="preserve">- LD50 (droga pokarmowa, szczur):</w:t>
-      </w:r>
-      <w:r>
-        <w:rPr>
-          <w:rFonts w:ascii="Arial" w:cs="Arial" w:eastAsia="Arial" w:hAnsi="Arial"/>
-          <w:sz w:val="20"/>
-          <w:szCs w:val="20"/>
-        </w:rPr>
-        <w:t xml:space="preserve"> 290 mg/kg mc (ATE = 500 mg/kg mc)</w:t>
-      </w:r>
-    </w:p>
-    <w:p>
-      <w:pPr>
-        <w:spacing w:after="60" w:before="60"/>
-      </w:pPr>
-      <w:r>
-        <w:rPr>
-          <w:rFonts w:ascii="Arial" w:cs="Arial" w:eastAsia="Arial" w:hAnsi="Arial"/>
-          <w:b/>
-          <w:bCs/>
-          <w:sz w:val="20"/>
-          <w:szCs w:val="20"/>
-        </w:rPr>
-        <w:t xml:space="preserve">- LC50 (drogi oddechowe, pyły/mgły, szczur):</w:t>
-      </w:r>
-      <w:r>
-        <w:rPr>
-          <w:rFonts w:ascii="Arial" w:cs="Arial" w:eastAsia="Arial" w:hAnsi="Arial"/>
-          <w:sz w:val="20"/>
-          <w:szCs w:val="20"/>
-        </w:rPr>
-        <w:t xml:space="preserve"> 293 mg/kg</w:t>
-      </w:r>
-    </w:p>
-    <w:p>
-      <w:pPr>
-        <w:spacing w:after="80"/>
-      </w:pPr>
-      <w:r>
-        <w:rPr>
-          <w:rFonts w:ascii="Arial" w:cs="Arial" w:eastAsia="Arial" w:hAnsi="Arial"/>
-          <w:sz w:val="20"/>
-          <w:szCs w:val="20"/>
-        </w:rPr>
-        <w:t xml:space="preserve">2,6-di-tert-butylo-4-metylofenol (BHT) [CAS: 128-37-0]:</w:t>
-      </w:r>
-    </w:p>
-    <w:p>
-      <w:pPr>
-        <w:spacing w:after="60" w:before="60"/>
-      </w:pPr>
-      <w:r>
-        <w:rPr>
-          <w:rFonts w:ascii="Arial" w:cs="Arial" w:eastAsia="Arial" w:hAnsi="Arial"/>
-          <w:b/>
-          <w:bCs/>
-          <w:sz w:val="20"/>
-          <w:szCs w:val="20"/>
-        </w:rPr>
-        <w:t xml:space="preserve">- LD50 (skóra, szczur):</w:t>
-      </w:r>
-      <w:r>
-        <w:rPr>
-          <w:rFonts w:ascii="Arial" w:cs="Arial" w:eastAsia="Arial" w:hAnsi="Arial"/>
-          <w:sz w:val="20"/>
-          <w:szCs w:val="20"/>
-        </w:rPr>
-        <w:t xml:space="preserve"> &gt; 2000 mg/kg</w:t>
-      </w:r>
-    </w:p>
-    <w:p>
-      <w:pPr>
-        <w:spacing w:after="60" w:before="60"/>
-      </w:pPr>
-      <w:r>
-        <w:rPr>
-          <w:rFonts w:ascii="Arial" w:cs="Arial" w:eastAsia="Arial" w:hAnsi="Arial"/>
-          <w:b/>
-          <w:bCs/>
-          <w:sz w:val="20"/>
-          <w:szCs w:val="20"/>
-        </w:rPr>
-        <w:t xml:space="preserve">- LD50 (droga pokarmowa, szczur):</w:t>
-      </w:r>
-      <w:r>
-        <w:rPr>
-          <w:rFonts w:ascii="Arial" w:cs="Arial" w:eastAsia="Arial" w:hAnsi="Arial"/>
-          <w:sz w:val="20"/>
-          <w:szCs w:val="20"/>
-        </w:rPr>
-        <w:t xml:space="preserve"> 2930 mg/kg</w:t>
-      </w:r>
-    </w:p>
-    <w:p>
-      <w:pPr>
-        <w:spacing w:after="80"/>
-      </w:pPr>
-      <w:r>
-        <w:rPr>
-          <w:rFonts w:ascii="Arial" w:cs="Arial" w:eastAsia="Arial" w:hAnsi="Arial"/>
-          <w:sz w:val="20"/>
-          <w:szCs w:val="20"/>
-        </w:rPr>
-        <w:t xml:space="preserve">Toluen [CAS: 108-88-3]:</w:t>
-      </w:r>
-    </w:p>
-    <w:p>
-      <w:pPr>
-        <w:spacing w:after="60" w:before="60"/>
-      </w:pPr>
-      <w:r>
-        <w:rPr>
-          <w:rFonts w:ascii="Arial" w:cs="Arial" w:eastAsia="Arial" w:hAnsi="Arial"/>
-          <w:b/>
-          <w:bCs/>
-          <w:sz w:val="20"/>
-          <w:szCs w:val="20"/>
-        </w:rPr>
-        <w:t xml:space="preserve">- LD50 (skóra, królik):</w:t>
-      </w:r>
-      <w:r>
-        <w:rPr>
-          <w:rFonts w:ascii="Arial" w:cs="Arial" w:eastAsia="Arial" w:hAnsi="Arial"/>
-          <w:sz w:val="20"/>
-          <w:szCs w:val="20"/>
-        </w:rPr>
-        <w:t xml:space="preserve"> &gt; 5000 mg/kg mc</w:t>
-      </w:r>
-    </w:p>
-    <w:p>
-      <w:pPr>
-        <w:spacing w:after="60" w:before="60"/>
-      </w:pPr>
-      <w:r>
-        <w:rPr>
-          <w:rFonts w:ascii="Arial" w:cs="Arial" w:eastAsia="Arial" w:hAnsi="Arial"/>
-          <w:b/>
-          <w:bCs/>
-          <w:sz w:val="20"/>
-          <w:szCs w:val="20"/>
-        </w:rPr>
-        <w:t xml:space="preserve">- LD50 (droga pokarmowa, szczur):</w:t>
-      </w:r>
-      <w:r>
-        <w:rPr>
-          <w:rFonts w:ascii="Arial" w:cs="Arial" w:eastAsia="Arial" w:hAnsi="Arial"/>
-          <w:sz w:val="20"/>
-          <w:szCs w:val="20"/>
-        </w:rPr>
-        <w:t xml:space="preserve"> &gt; 5000 mg/kg mc</w:t>
-      </w:r>
-    </w:p>
-    <w:p>
-      <w:pPr>
-        <w:spacing w:after="60" w:before="60"/>
-      </w:pPr>
-      <w:r>
-        <w:rPr>
-          <w:rFonts w:ascii="Arial" w:cs="Arial" w:eastAsia="Arial" w:hAnsi="Arial"/>
-          <w:b/>
-          <w:bCs/>
-          <w:sz w:val="20"/>
-          <w:szCs w:val="20"/>
-        </w:rPr>
-        <w:t xml:space="preserve">- LC50 (drogi oddechowe, pary, człowiek):</w:t>
-      </w:r>
-      <w:r>
-        <w:rPr>
-          <w:rFonts w:ascii="Arial" w:cs="Arial" w:eastAsia="Arial" w:hAnsi="Arial"/>
-          <w:sz w:val="20"/>
-          <w:szCs w:val="20"/>
-        </w:rPr>
-        <w:t xml:space="preserve"> 100 ppm</w:t>
+        <w:t xml:space="preserve">ATE (drogi oddechowe / inhalacyjnie) mieszaniny: Nie sklasyfikowano (brak istotnego składnika)</w:t>
+      </w:r>
+    </w:p>
+    <w:p>
+      <w:pPr>
+        <w:spacing w:after="80"/>
+      </w:pPr>
+      <w:r>
+        <w:rPr>
+          <w:rFonts w:ascii="Arial" w:cs="Arial" w:eastAsia="Arial" w:hAnsi="Arial"/>
+          <w:sz w:val="20"/>
+          <w:szCs w:val="20"/>
+        </w:rPr>
+        <w:t xml:space="preserve">ATE (droga pokarmowa / doustnie) mieszaniny: Nie sklasyfikowano (brak istotnego składnika)</w:t>
+      </w:r>
+    </w:p>
+    <w:p>
+      <w:pPr>
+        <w:spacing w:after="80"/>
+      </w:pPr>
+      <w:r>
+        <w:rPr>
+          <w:rFonts w:ascii="Arial" w:cs="Arial" w:eastAsia="Arial" w:hAnsi="Arial"/>
+          <w:sz w:val="20"/>
+          <w:szCs w:val="20"/>
+        </w:rPr>
+        <w:t xml:space="preserve">ATE (na skórę) mieszaniny: Nie sklasyfikowano (brak istotnego składnika)</w:t>
+      </w:r>
+    </w:p>
+    <w:p>
+      <w:pPr>
+        <w:spacing w:after="80" w:before="150"/>
+      </w:pPr>
+      <w:r>
+        <w:rPr>
+          <w:rFonts w:ascii="Arial" w:cs="Arial" w:eastAsia="Arial" w:hAnsi="Arial"/>
+          <w:b/>
+          <w:bCs/>
+          <w:sz w:val="20"/>
+          <w:szCs w:val="20"/>
+        </w:rPr>
+        <w:t xml:space="preserve">etanol (CAS: 64-17-5):</w:t>
+      </w:r>
+    </w:p>
+    <w:p>
+      <w:pPr>
+        <w:spacing w:after="60" w:before="60"/>
+      </w:pPr>
+      <w:r>
+        <w:rPr>
+          <w:rFonts w:ascii="Arial" w:cs="Arial" w:eastAsia="Arial" w:hAnsi="Arial"/>
+          <w:b/>
+          <w:bCs/>
+          <w:sz w:val="20"/>
+          <w:szCs w:val="20"/>
+        </w:rPr>
+        <w:t xml:space="preserve">- LD50 (droga pokarmowa / doustnie):</w:t>
+      </w:r>
+      <w:r>
+        <w:rPr>
+          <w:rFonts w:ascii="Arial" w:cs="Arial" w:eastAsia="Arial" w:hAnsi="Arial"/>
+          <w:sz w:val="20"/>
+          <w:szCs w:val="20"/>
+        </w:rPr>
+        <w:t xml:space="preserve"> &gt; 5000 mg/kg (szczur)</w:t>
+      </w:r>
+    </w:p>
+    <w:p>
+      <w:pPr>
+        <w:spacing w:after="60" w:before="60"/>
+      </w:pPr>
+      <w:r>
+        <w:rPr>
+          <w:rFonts w:ascii="Arial" w:cs="Arial" w:eastAsia="Arial" w:hAnsi="Arial"/>
+          <w:b/>
+          <w:bCs/>
+          <w:sz w:val="20"/>
+          <w:szCs w:val="20"/>
+        </w:rPr>
+        <w:t xml:space="preserve">- LC50 (drogi oddechowe, pary):</w:t>
+      </w:r>
+      <w:r>
+        <w:rPr>
+          <w:rFonts w:ascii="Arial" w:cs="Arial" w:eastAsia="Arial" w:hAnsi="Arial"/>
+          <w:sz w:val="20"/>
+          <w:szCs w:val="20"/>
+        </w:rPr>
+        <w:t xml:space="preserve"> &gt; 50 mg/l/4h (szczur)</w:t>
+      </w:r>
+    </w:p>
+    <w:p>
+      <w:pPr>
+        <w:spacing w:after="80" w:before="150"/>
+      </w:pPr>
+      <w:r>
+        <w:rPr>
+          <w:rFonts w:ascii="Arial" w:cs="Arial" w:eastAsia="Arial" w:hAnsi="Arial"/>
+          <w:b/>
+          <w:bCs/>
+          <w:sz w:val="20"/>
+          <w:szCs w:val="20"/>
+        </w:rPr>
+        <w:t xml:space="preserve">aldehyd anyżowy (4-metoksybenzaldehyd) (CAS: 123-11-5):</w:t>
+      </w:r>
+    </w:p>
+    <w:p>
+      <w:pPr>
+        <w:spacing w:after="60" w:before="60"/>
+      </w:pPr>
+      <w:r>
+        <w:rPr>
+          <w:rFonts w:ascii="Arial" w:cs="Arial" w:eastAsia="Arial" w:hAnsi="Arial"/>
+          <w:b/>
+          <w:bCs/>
+          <w:sz w:val="20"/>
+          <w:szCs w:val="20"/>
+        </w:rPr>
+        <w:t xml:space="preserve">- LD50 (na skórę):</w:t>
+      </w:r>
+      <w:r>
+        <w:rPr>
+          <w:rFonts w:ascii="Arial" w:cs="Arial" w:eastAsia="Arial" w:hAnsi="Arial"/>
+          <w:sz w:val="20"/>
+          <w:szCs w:val="20"/>
+        </w:rPr>
+        <w:t xml:space="preserve"> &gt; 5000 mg/kg (królik)</w:t>
+      </w:r>
+    </w:p>
+    <w:p>
+      <w:pPr>
+        <w:spacing w:after="60" w:before="60"/>
+      </w:pPr>
+      <w:r>
+        <w:rPr>
+          <w:rFonts w:ascii="Arial" w:cs="Arial" w:eastAsia="Arial" w:hAnsi="Arial"/>
+          <w:b/>
+          <w:bCs/>
+          <w:sz w:val="20"/>
+          <w:szCs w:val="20"/>
+        </w:rPr>
+        <w:t xml:space="preserve">- LD50 (droga pokarmowa / doustnie):</w:t>
+      </w:r>
+      <w:r>
+        <w:rPr>
+          <w:rFonts w:ascii="Arial" w:cs="Arial" w:eastAsia="Arial" w:hAnsi="Arial"/>
+          <w:sz w:val="20"/>
+          <w:szCs w:val="20"/>
+        </w:rPr>
+        <w:t xml:space="preserve"> 3210 mg/kg (szczur)</w:t>
+      </w:r>
+    </w:p>
+    <w:p>
+      <w:pPr>
+        <w:spacing w:after="60" w:before="60"/>
+      </w:pPr>
+      <w:r>
+        <w:rPr>
+          <w:rFonts w:ascii="Arial" w:cs="Arial" w:eastAsia="Arial" w:hAnsi="Arial"/>
+          <w:b/>
+          <w:bCs/>
+          <w:sz w:val="20"/>
+          <w:szCs w:val="20"/>
+        </w:rPr>
+        <w:t xml:space="preserve">- LC50 (drogi oddechowe, pary):</w:t>
+      </w:r>
+      <w:r>
+        <w:rPr>
+          <w:rFonts w:ascii="Arial" w:cs="Arial" w:eastAsia="Arial" w:hAnsi="Arial"/>
+          <w:sz w:val="20"/>
+          <w:szCs w:val="20"/>
+        </w:rPr>
+        <w:t xml:space="preserve"> 0,32 mg/l/7h (szczur)</w:t>
+      </w:r>
+    </w:p>
+    <w:p>
+      <w:pPr>
+        <w:spacing w:after="80" w:before="150"/>
+      </w:pPr>
+      <w:r>
+        <w:rPr>
+          <w:rFonts w:ascii="Arial" w:cs="Arial" w:eastAsia="Arial" w:hAnsi="Arial"/>
+          <w:b/>
+          <w:bCs/>
+          <w:sz w:val="20"/>
+          <w:szCs w:val="20"/>
+        </w:rPr>
+        <w:t xml:space="preserve">kumaryna (2H-chromen-2-on) (CAS: 91-64-5):</w:t>
+      </w:r>
+    </w:p>
+    <w:p>
+      <w:pPr>
+        <w:spacing w:after="60" w:before="60"/>
+      </w:pPr>
+      <w:r>
+        <w:rPr>
+          <w:rFonts w:ascii="Arial" w:cs="Arial" w:eastAsia="Arial" w:hAnsi="Arial"/>
+          <w:b/>
+          <w:bCs/>
+          <w:sz w:val="20"/>
+          <w:szCs w:val="20"/>
+        </w:rPr>
+        <w:t xml:space="preserve">- LD50 (na skórę):</w:t>
+      </w:r>
+      <w:r>
+        <w:rPr>
+          <w:rFonts w:ascii="Arial" w:cs="Arial" w:eastAsia="Arial" w:hAnsi="Arial"/>
+          <w:sz w:val="20"/>
+          <w:szCs w:val="20"/>
+        </w:rPr>
+        <w:t xml:space="preserve"> 293 mg/kg mc (szczur)</w:t>
+      </w:r>
+    </w:p>
+    <w:p>
+      <w:pPr>
+        <w:spacing w:after="60" w:before="60"/>
+      </w:pPr>
+      <w:r>
+        <w:rPr>
+          <w:rFonts w:ascii="Arial" w:cs="Arial" w:eastAsia="Arial" w:hAnsi="Arial"/>
+          <w:b/>
+          <w:bCs/>
+          <w:sz w:val="20"/>
+          <w:szCs w:val="20"/>
+        </w:rPr>
+        <w:t xml:space="preserve">- LD50 (droga pokarmowa / doustnie):</w:t>
+      </w:r>
+      <w:r>
+        <w:rPr>
+          <w:rFonts w:ascii="Arial" w:cs="Arial" w:eastAsia="Arial" w:hAnsi="Arial"/>
+          <w:sz w:val="20"/>
+          <w:szCs w:val="20"/>
+        </w:rPr>
+        <w:t xml:space="preserve"> 290 mg/kg mc (szczur)</w:t>
+      </w:r>
+    </w:p>
+    <w:p>
+      <w:pPr>
+        <w:spacing w:after="60" w:before="60"/>
+      </w:pPr>
+      <w:r>
+        <w:rPr>
+          <w:rFonts w:ascii="Arial" w:cs="Arial" w:eastAsia="Arial" w:hAnsi="Arial"/>
+          <w:b/>
+          <w:bCs/>
+          <w:sz w:val="20"/>
+          <w:szCs w:val="20"/>
+        </w:rPr>
+        <w:t xml:space="preserve">- LC50 (drogi oddechowe, pyły/mgły):</w:t>
+      </w:r>
+      <w:r>
+        <w:rPr>
+          <w:rFonts w:ascii="Arial" w:cs="Arial" w:eastAsia="Arial" w:hAnsi="Arial"/>
+          <w:sz w:val="20"/>
+          <w:szCs w:val="20"/>
+        </w:rPr>
+        <w:t xml:space="preserve"> 293 mg/kg (szczur)</w:t>
+      </w:r>
+    </w:p>
+    <w:p>
+      <w:pPr>
+        <w:spacing w:after="80" w:before="150"/>
+      </w:pPr>
+      <w:r>
+        <w:rPr>
+          <w:rFonts w:ascii="Arial" w:cs="Arial" w:eastAsia="Arial" w:hAnsi="Arial"/>
+          <w:b/>
+          <w:bCs/>
+          <w:sz w:val="20"/>
+          <w:szCs w:val="20"/>
+        </w:rPr>
+        <w:t xml:space="preserve">2,6-di-tert-butylo-4-metylofenol (BHT) (CAS: 128-37-0):</w:t>
+      </w:r>
+    </w:p>
+    <w:p>
+      <w:pPr>
+        <w:spacing w:after="60" w:before="60"/>
+      </w:pPr>
+      <w:r>
+        <w:rPr>
+          <w:rFonts w:ascii="Arial" w:cs="Arial" w:eastAsia="Arial" w:hAnsi="Arial"/>
+          <w:b/>
+          <w:bCs/>
+          <w:sz w:val="20"/>
+          <w:szCs w:val="20"/>
+        </w:rPr>
+        <w:t xml:space="preserve">- LD50 (na skórę):</w:t>
+      </w:r>
+      <w:r>
+        <w:rPr>
+          <w:rFonts w:ascii="Arial" w:cs="Arial" w:eastAsia="Arial" w:hAnsi="Arial"/>
+          <w:sz w:val="20"/>
+          <w:szCs w:val="20"/>
+        </w:rPr>
+        <w:t xml:space="preserve"> &gt; 2000 mg/kg (szczur)</w:t>
+      </w:r>
+    </w:p>
+    <w:p>
+      <w:pPr>
+        <w:spacing w:after="60" w:before="60"/>
+      </w:pPr>
+      <w:r>
+        <w:rPr>
+          <w:rFonts w:ascii="Arial" w:cs="Arial" w:eastAsia="Arial" w:hAnsi="Arial"/>
+          <w:b/>
+          <w:bCs/>
+          <w:sz w:val="20"/>
+          <w:szCs w:val="20"/>
+        </w:rPr>
+        <w:t xml:space="preserve">- LD50 (droga pokarmowa / doustnie):</w:t>
+      </w:r>
+      <w:r>
+        <w:rPr>
+          <w:rFonts w:ascii="Arial" w:cs="Arial" w:eastAsia="Arial" w:hAnsi="Arial"/>
+          <w:sz w:val="20"/>
+          <w:szCs w:val="20"/>
+        </w:rPr>
+        <w:t xml:space="preserve"> 2930 mg/kg (szczur)</w:t>
+      </w:r>
+    </w:p>
+    <w:p>
+      <w:pPr>
+        <w:spacing w:after="80" w:before="150"/>
+      </w:pPr>
+      <w:r>
+        <w:rPr>
+          <w:rFonts w:ascii="Arial" w:cs="Arial" w:eastAsia="Arial" w:hAnsi="Arial"/>
+          <w:b/>
+          <w:bCs/>
+          <w:sz w:val="20"/>
+          <w:szCs w:val="20"/>
+        </w:rPr>
+        <w:t xml:space="preserve">toluen (CAS: 108-88-3):</w:t>
+      </w:r>
+    </w:p>
+    <w:p>
+      <w:pPr>
+        <w:spacing w:after="60" w:before="60"/>
+      </w:pPr>
+      <w:r>
+        <w:rPr>
+          <w:rFonts w:ascii="Arial" w:cs="Arial" w:eastAsia="Arial" w:hAnsi="Arial"/>
+          <w:b/>
+          <w:bCs/>
+          <w:sz w:val="20"/>
+          <w:szCs w:val="20"/>
+        </w:rPr>
+        <w:t xml:space="preserve">- LD50 (na skórę):</w:t>
+      </w:r>
+      <w:r>
+        <w:rPr>
+          <w:rFonts w:ascii="Arial" w:cs="Arial" w:eastAsia="Arial" w:hAnsi="Arial"/>
+          <w:sz w:val="20"/>
+          <w:szCs w:val="20"/>
+        </w:rPr>
+        <w:t xml:space="preserve"> &gt; 5000 mg/kg mc (królik)</w:t>
+      </w:r>
+    </w:p>
+    <w:p>
+      <w:pPr>
+        <w:spacing w:after="60" w:before="60"/>
+      </w:pPr>
+      <w:r>
+        <w:rPr>
+          <w:rFonts w:ascii="Arial" w:cs="Arial" w:eastAsia="Arial" w:hAnsi="Arial"/>
+          <w:b/>
+          <w:bCs/>
+          <w:sz w:val="20"/>
+          <w:szCs w:val="20"/>
+        </w:rPr>
+        <w:t xml:space="preserve">- LD50 (droga pokarmowa / doustnie):</w:t>
+      </w:r>
+      <w:r>
+        <w:rPr>
+          <w:rFonts w:ascii="Arial" w:cs="Arial" w:eastAsia="Arial" w:hAnsi="Arial"/>
+          <w:sz w:val="20"/>
+          <w:szCs w:val="20"/>
+        </w:rPr>
+        <w:t xml:space="preserve"> &gt; 5000 mg/kg mc (szczur)</w:t>
+      </w:r>
+    </w:p>
+    <w:p>
+      <w:pPr>
+        <w:spacing w:after="60" w:before="60"/>
+      </w:pPr>
+      <w:r>
+        <w:rPr>
+          <w:rFonts w:ascii="Arial" w:cs="Arial" w:eastAsia="Arial" w:hAnsi="Arial"/>
+          <w:b/>
+          <w:bCs/>
+          <w:sz w:val="20"/>
+          <w:szCs w:val="20"/>
+        </w:rPr>
+        <w:t xml:space="preserve">- LC50 (drogi oddechowe, pary):</w:t>
+      </w:r>
+      <w:r>
+        <w:rPr>
+          <w:rFonts w:ascii="Arial" w:cs="Arial" w:eastAsia="Arial" w:hAnsi="Arial"/>
+          <w:sz w:val="20"/>
+          <w:szCs w:val="20"/>
+        </w:rPr>
+        <w:t xml:space="preserve"> 100 ppm (człowiek)</w:t>
       </w:r>
     </w:p>
     <w:p>
@@ -5973,7 +5983,20 @@
           <w:sz w:val="20"/>
           <w:szCs w:val="20"/>
         </w:rPr>
-        <w:t xml:space="preserve">Może powodować wystąpienie reakcji alergicznej skóry. Zawiera kumarynę (2H-chromen-2-on).</w:t>
+        <w:t xml:space="preserve">Może powodować wystąpienie reakcji alergicznej skóry.</w:t>
+      </w:r>
+    </w:p>
+    <w:p>
+      <w:pPr>
+        <w:spacing w:after="80"/>
+      </w:pPr>
+      <w:r>
+        <w:rPr>
+          <w:rFonts w:ascii="Arial" w:cs="Arial" w:eastAsia="Arial" w:hAnsi="Arial"/>
+          <w:sz w:val="20"/>
+          <w:szCs w:val="20"/>
+        </w:rPr>
+        <w:t xml:space="preserve">Zawiera: kumarynę (2H-chromen-2-on).</w:t>
       </w:r>
     </w:p>
     <w:p>
@@ -6038,7 +6061,7 @@
           <w:sz w:val="20"/>
           <w:szCs w:val="20"/>
         </w:rPr>
-        <w:t xml:space="preserve">Toluen został zaklasyfikowany do Grupy 3 (nie można zaklasyfikować jako rakotwórczy dla ludzi) przez Międzynarodową Agencję Badań nad Rakiem (IARC - 1999). Amerykańska Agencja Ochrony Środowiska (EPA) stwierdza, że dane są niewystarczające do oceny potencjału rakotwórczego.</w:t>
+        <w:t xml:space="preserve">Toluen: Zaklasyfikowany do Grupy 3 (nie można zaklasyfikować jako rakotwórczy dla ludzi) przez Międzynarodową Agencję Badań nad Rakiem (IARC) - (IARC, 1999). Agencja Ochrony Środowiska USA (EPA) stwierdza, że „dane są niewystarczające do oceny potencjału rakotwórczego”.</w:t>
       </w:r>
     </w:p>
     <w:p>
@@ -6162,58 +6185,41 @@
     </w:p>
     <w:p>
       <w:pPr>
-        <w:spacing w:after="100" w:before="200"/>
-      </w:pPr>
-      <w:r>
-        <w:rPr>
-          <w:rFonts w:ascii="Arial" w:cs="Arial" w:eastAsia="Arial" w:hAnsi="Arial"/>
-          <w:b/>
-          <w:bCs/>
-          <w:sz w:val="20"/>
-          <w:szCs w:val="20"/>
-        </w:rPr>
-        <w:t xml:space="preserve">11.2.1. Właściwości zaburzające funkcjonowanie układu hormonalnego:</w:t>
-      </w:r>
-    </w:p>
-    <w:p>
-      <w:pPr>
-        <w:spacing w:after="80"/>
-      </w:pPr>
-      <w:r>
-        <w:rPr>
-          <w:rFonts w:ascii="Arial" w:cs="Arial" w:eastAsia="Arial" w:hAnsi="Arial"/>
-          <w:sz w:val="20"/>
-          <w:szCs w:val="20"/>
-        </w:rPr>
-        <w:t xml:space="preserve">W oparciu o dostępne dane produkt nie zawiera substancji wpisanych do głównych europejskich wykazów jako substancje o właściwościach zaburzających funkcjonowanie układu hormonalnego lub podejrzewane o takie właściwości w odniesieniu do zdrowia ludzkiego w stężeniu ≥ 0,1%.</w:t>
-      </w:r>
-    </w:p>
-    <w:p>
-      <w:pPr>
-        <w:spacing w:after="100" w:before="200"/>
-      </w:pPr>
-      <w:r>
-        <w:rPr>
-          <w:rFonts w:ascii="Arial" w:cs="Arial" w:eastAsia="Arial" w:hAnsi="Arial"/>
-          <w:b/>
-          <w:bCs/>
-          <w:sz w:val="20"/>
-          <w:szCs w:val="20"/>
-        </w:rPr>
-        <w:t xml:space="preserve">11.2.2. Inne informacje:</w:t>
-      </w:r>
-    </w:p>
-    <w:p>
-      <w:pPr>
-        <w:spacing w:after="80"/>
-      </w:pPr>
-      <w:r>
-        <w:rPr>
-          <w:rFonts w:ascii="Arial" w:cs="Arial" w:eastAsia="Arial" w:hAnsi="Arial"/>
-          <w:sz w:val="20"/>
-          <w:szCs w:val="20"/>
-        </w:rPr>
-        <w:t xml:space="preserve">Brak dalszych danych.</w:t>
+        <w:spacing w:after="80"/>
+      </w:pPr>
+      <w:r>
+        <w:rPr>
+          <w:rFonts w:ascii="Arial" w:cs="Arial" w:eastAsia="Arial" w:hAnsi="Arial"/>
+          <w:sz w:val="20"/>
+          <w:szCs w:val="20"/>
+        </w:rPr>
+        <w:t xml:space="preserve">Właściwości zaburzające funkcjonowanie układu hormonalnego:</w:t>
+      </w:r>
+    </w:p>
+    <w:p>
+      <w:pPr>
+        <w:spacing w:after="80"/>
+      </w:pPr>
+      <w:r>
+        <w:rPr>
+          <w:rFonts w:ascii="Arial" w:cs="Arial" w:eastAsia="Arial" w:hAnsi="Arial"/>
+          <w:sz w:val="20"/>
+          <w:szCs w:val="20"/>
+        </w:rPr>
+        <w:t xml:space="preserve">W oparciu o dostępne dane produkt nie zawiera substancji wymienionych w głównych europejskich wykazach potencjalnych lub podejrzewanych substancji zaburzających funkcjonowanie układu hormonalnego mających wpływ na zdrowie człowieka podlegających ocenie.</w:t>
+      </w:r>
+    </w:p>
+    <w:p>
+      <w:pPr>
+        <w:spacing w:after="80"/>
+      </w:pPr>
+      <w:r>
+        <w:rPr>
+          <w:rFonts w:ascii="Arial" w:cs="Arial" w:eastAsia="Arial" w:hAnsi="Arial"/>
+          <w:sz w:val="20"/>
+          <w:szCs w:val="20"/>
+        </w:rPr>
+        <w:t xml:space="preserve">Inne informacje: Brak.</w:t>
       </w:r>
     </w:p>
     <w:p>

</xml_diff>